<commit_message>
feat: Enhance document generation and preview functionality
- Updated templates for cover, letterhead, and proposal documents.
- Added a script to update the property table in the proposal template.
- Expanded the AccountDetail component to include additional land area fields and features.
- Introduced DocumentPreviewModal for displaying document previews before generation.
- Integrated preview functionality into GenerateDocModal, allowing users to preview documents.
- Enhanced HomePage to display monthly account creation statistics with a new chart.
- Updated accountApi service to include endpoints for document preview and monthly statistics.
- Improved styling for DocumentPreviewModal and GenerateDocModal for better user experience.
</commit_message>
<xml_diff>
--- a/backend/templates/cover_template.docx
+++ b/backend/templates/cover_template.docx
@@ -2,417 +2,3440 @@
 <file path=word/document.xml><?xml version="1.0" encoding="utf-8"?>
 <w:document xmlns:wpc="http://schemas.microsoft.com/office/word/2010/wordprocessingCanvas" xmlns:mo="http://schemas.microsoft.com/office/mac/office/2008/main" xmlns:mc="http://schemas.openxmlformats.org/markup-compatibility/2006" xmlns:mv="urn:schemas-microsoft-com:mac:vml" xmlns:o="urn:schemas-microsoft-com:office:office" xmlns:r="http://schemas.openxmlformats.org/officeDocument/2006/relationships" xmlns:m="http://schemas.openxmlformats.org/officeDocument/2006/math" xmlns:v="urn:schemas-microsoft-com:vml" xmlns:wp14="http://schemas.microsoft.com/office/word/2010/wordprocessingDrawing" xmlns:wp="http://schemas.openxmlformats.org/drawingml/2006/wordprocessingDrawing" xmlns:w10="urn:schemas-microsoft-com:office:word" xmlns:w="http://schemas.openxmlformats.org/wordprocessingml/2006/main" xmlns:w14="http://schemas.microsoft.com/office/word/2010/wordml" xmlns:wpg="http://schemas.microsoft.com/office/word/2010/wordprocessingGroup" xmlns:wpi="http://schemas.microsoft.com/office/word/2010/wordprocessingInk" xmlns:wne="http://schemas.microsoft.com/office/word/2006/wordml" xmlns:wps="http://schemas.microsoft.com/office/word/2010/wordprocessingShape" mc:Ignorable="w14 wp14">
   <w:body>
-    <w:p>
-      <w:pPr>
-        <w:jc w:val="center"/>
-      </w:pPr>
-      <w:r>
-        <w:rPr>
-          <w:b/>
-          <w:sz w:val="28"/>
-        </w:rPr>
-        <w:t>{{ firm_name }}</w:t>
-      </w:r>
-    </w:p>
-    <w:p>
-      <w:pPr>
-        <w:jc w:val="center"/>
-      </w:pPr>
-      <w:r>
-        <w:rPr>
-          <w:color w:val="505050"/>
-          <w:sz w:val="18"/>
-        </w:rPr>
-        <w:t>{{ firm_address }}</w:t>
-      </w:r>
-    </w:p>
-    <w:p>
-      <w:pPr>
-        <w:jc w:val="center"/>
-      </w:pPr>
-      <w:r>
-        <w:rPr>
-          <w:color w:val="505050"/>
-          <w:sz w:val="18"/>
-        </w:rPr>
-        <w:t>Tel: {{ firm_phone }}   |   Email: {{ firm_email }}</w:t>
-      </w:r>
-    </w:p>
-    <w:p>
-      <w:pPr>
-        <w:pBdr>
-          <w:bottom w:val="single" w:sz="6" w:color="1F3A2E"/>
-        </w:pBdr>
-        <w:spacing w:after="80"/>
-      </w:pPr>
-    </w:p>
-    <w:p>
-      <w:pPr>
-        <w:spacing w:before="400" w:after="0"/>
-      </w:pPr>
-    </w:p>
-    <w:p>
-      <w:pPr>
-        <w:spacing w:before="200" w:after="0"/>
-        <w:jc w:val="center"/>
-      </w:pPr>
-      <w:r>
-        <w:rPr>
-          <w:b/>
-          <w:i w:val="0"/>
-          <w:sz w:val="36"/>
-        </w:rPr>
-        <w:t>Property Valuation Report</w:t>
-      </w:r>
-    </w:p>
-    <w:p>
-      <w:pPr>
-        <w:spacing w:before="0" w:after="280"/>
-        <w:jc w:val="center"/>
-      </w:pPr>
-      <w:r>
-        <w:rPr>
-          <w:b w:val="0"/>
-          <w:i w:val="0"/>
-          <w:sz w:val="24"/>
-        </w:rPr>
-        <w:t>({{ property_mortgaged }})</w:t>
-      </w:r>
-    </w:p>
-    <w:p>
-      <w:pPr>
-        <w:pBdr>
-          <w:bottom w:val="single" w:sz="6" w:color="1F3A2E"/>
-        </w:pBdr>
-        <w:spacing w:after="80"/>
-      </w:pPr>
-    </w:p>
-    <w:p>
-      <w:pPr>
-        <w:spacing w:before="160" w:after="0"/>
-      </w:pPr>
-      <w:r>
-        <w:rPr>
-          <w:b/>
-          <w:i w:val="0"/>
-          <w:sz w:val="22"/>
-        </w:rPr>
-        <w:t>Client</w:t>
-      </w:r>
-    </w:p>
-    <w:p>
-      <w:pPr>
-        <w:spacing w:before="0" w:after="20"/>
-      </w:pPr>
-      <w:r>
-        <w:rPr>
-          <w:b w:val="0"/>
-          <w:i w:val="0"/>
-          <w:sz w:val="20"/>
-        </w:rPr>
-        <w:t>{{ client_full_name }}</w:t>
-      </w:r>
-    </w:p>
-    <w:p>
-      <w:pPr>
-        <w:spacing w:before="0" w:after="20"/>
-      </w:pPr>
-      <w:r>
-        <w:rPr>
-          <w:b w:val="0"/>
-          <w:i w:val="0"/>
-          <w:sz w:val="20"/>
-        </w:rPr>
-        <w:t>{{ client_address_line }}</w:t>
-      </w:r>
-    </w:p>
-    <w:p>
-      <w:pPr>
-        <w:spacing w:before="0" w:after="20"/>
-      </w:pPr>
-      <w:r>
-        <w:rPr>
-          <w:b w:val="0"/>
-          <w:i w:val="0"/>
-          <w:sz w:val="20"/>
-        </w:rPr>
-        <w:t>{{ client_district_country }}</w:t>
-      </w:r>
-    </w:p>
-    <w:p>
-      <w:pPr>
-        <w:spacing w:before="0" w:after="20"/>
-      </w:pPr>
-      <w:r>
-        <w:rPr>
-          <w:b w:val="0"/>
-          <w:i w:val="0"/>
-          <w:sz w:val="20"/>
-        </w:rPr>
-        <w:t>Contact No: {{ client_phone }}</w:t>
-      </w:r>
-    </w:p>
-    <w:p>
-      <w:pPr>
-        <w:spacing w:before="200" w:after="0"/>
-      </w:pPr>
-    </w:p>
-    <w:p>
-      <w:pPr>
-        <w:spacing w:before="0" w:after="0"/>
-      </w:pPr>
-      <w:r>
-        <w:rPr>
-          <w:b/>
-          <w:i w:val="0"/>
-          <w:sz w:val="22"/>
-        </w:rPr>
-        <w:t>Properties to be Valued</w:t>
-      </w:r>
-    </w:p>
-    <w:p>
-      <w:pPr>
-        <w:spacing w:before="0" w:after="40"/>
-      </w:pPr>
-      <w:r>
-        <w:rPr>
-          <w:b/>
-          <w:i w:val="0"/>
-          <w:sz w:val="20"/>
-        </w:rPr>
-        <w:t xml:space="preserve">Plot No.: </w:t>
-      </w:r>
-      <w:r>
-        <w:rPr>
-          <w:b w:val="0"/>
-          <w:i w:val="0"/>
-          <w:sz w:val="20"/>
-        </w:rPr>
-        <w:t>{{ plot_no }}</w:t>
-      </w:r>
-    </w:p>
-    <w:p>
-      <w:pPr>
-        <w:spacing w:before="0" w:after="20"/>
-      </w:pPr>
-      <w:r>
-        <w:rPr>
-          <w:b w:val="0"/>
-          <w:i w:val="0"/>
-          <w:sz w:val="20"/>
-        </w:rPr>
-        <w:t>{{ property_location_full }}</w:t>
-      </w:r>
-    </w:p>
-    <w:p>
-      <w:pPr>
-        <w:spacing w:before="0" w:after="0"/>
-      </w:pPr>
-      <w:r>
-        <w:rPr>
-          <w:b w:val="0"/>
-          <w:i/>
-          <w:sz w:val="20"/>
-        </w:rPr>
-        <w:t>{{ sabik }}</w:t>
-      </w:r>
-    </w:p>
-    <w:p>
-      <w:pPr>
-        <w:spacing w:before="160" w:after="0"/>
-      </w:pPr>
-    </w:p>
-    <w:p>
-      <w:pPr>
-        <w:spacing w:before="0" w:after="0"/>
-      </w:pPr>
-      <w:r>
-        <w:rPr>
-          <w:b w:val="0"/>
-          <w:i w:val="0"/>
-          <w:sz w:val="20"/>
-        </w:rPr>
-        <w:t>{{ owners_block }}</w:t>
-      </w:r>
-    </w:p>
-    <w:p>
-      <w:pPr>
-        <w:spacing w:before="200" w:after="0"/>
-      </w:pPr>
-    </w:p>
-    <w:p>
-      <w:pPr>
-        <w:pBdr>
-          <w:bottom w:val="single" w:sz="6" w:color="1F3A2E"/>
-        </w:pBdr>
-        <w:spacing w:after="80"/>
-      </w:pPr>
-    </w:p>
-    <w:p>
-      <w:pPr>
-        <w:spacing w:before="160" w:after="0"/>
-      </w:pPr>
-      <w:r>
-        <w:rPr>
-          <w:b/>
-          <w:i w:val="0"/>
-          <w:sz w:val="22"/>
-        </w:rPr>
-        <w:t>Submitted to</w:t>
-      </w:r>
-    </w:p>
-    <w:p>
-      <w:pPr>
-        <w:spacing w:before="0" w:after="20"/>
-      </w:pPr>
-      <w:r>
-        <w:rPr>
-          <w:b/>
-          <w:i w:val="0"/>
-          <w:sz w:val="20"/>
-        </w:rPr>
-        <w:t>{{ bank_name }}</w:t>
-      </w:r>
-    </w:p>
-    <w:p>
-      <w:pPr>
-        <w:spacing w:before="0" w:after="20"/>
-      </w:pPr>
-      <w:r>
-        <w:rPr>
-          <w:b w:val="0"/>
-          <w:i w:val="0"/>
-          <w:sz w:val="20"/>
-        </w:rPr>
-        <w:t>{{ bank_branch }}</w:t>
-      </w:r>
-    </w:p>
-    <w:p>
-      <w:pPr>
-        <w:spacing w:before="200" w:after="0"/>
-      </w:pPr>
-    </w:p>
-    <w:p>
-      <w:pPr>
-        <w:spacing w:before="0" w:after="40"/>
-      </w:pPr>
-      <w:r>
-        <w:rPr>
-          <w:b w:val="0"/>
-          <w:i w:val="0"/>
-          <w:sz w:val="22"/>
-        </w:rPr>
-        <w:t xml:space="preserve">Fair Market Value of the Land &amp; Building: NRs. </w:t>
-      </w:r>
-      <w:r>
-        <w:rPr>
-          <w:b/>
-          <w:i w:val="0"/>
-          <w:sz w:val="22"/>
-        </w:rPr>
-        <w:t>{{ fair_market_value }}</w:t>
-      </w:r>
-    </w:p>
-    <w:p>
-      <w:pPr>
-        <w:spacing w:before="280" w:after="0"/>
-      </w:pPr>
-    </w:p>
-    <w:p>
-      <w:pPr>
-        <w:pBdr>
-          <w:bottom w:val="single" w:sz="6" w:color="1F3A2E"/>
-        </w:pBdr>
-        <w:spacing w:after="80"/>
-      </w:pPr>
-    </w:p>
-    <w:p>
-      <w:pPr>
-        <w:spacing w:before="160" w:after="0"/>
-      </w:pPr>
-      <w:r>
-        <w:rPr>
-          <w:b/>
-          <w:i w:val="0"/>
-          <w:sz w:val="22"/>
-        </w:rPr>
-        <w:t>Prepared by</w:t>
-      </w:r>
-    </w:p>
-    <w:p>
-      <w:pPr>
-        <w:spacing w:before="0" w:after="20"/>
-      </w:pPr>
-      <w:r>
-        <w:rPr>
-          <w:b w:val="0"/>
-          <w:i w:val="0"/>
-          <w:sz w:val="20"/>
-        </w:rPr>
-        <w:t>{{ firm_name }}</w:t>
-      </w:r>
-    </w:p>
-    <w:p>
-      <w:pPr>
-        <w:spacing w:before="0" w:after="20"/>
-      </w:pPr>
-      <w:r>
-        <w:rPr>
-          <w:b w:val="0"/>
-          <w:i w:val="0"/>
-          <w:sz w:val="20"/>
-        </w:rPr>
-        <w:t>{{ firm_address }}</w:t>
-      </w:r>
-    </w:p>
-    <w:p>
-      <w:pPr>
-        <w:spacing w:before="0" w:after="20"/>
-      </w:pPr>
-      <w:r>
-        <w:rPr>
-          <w:b w:val="0"/>
-          <w:i w:val="0"/>
-          <w:sz w:val="20"/>
-        </w:rPr>
-        <w:t>Tel: {{ firm_phone }}</w:t>
-      </w:r>
-    </w:p>
-    <w:p>
-      <w:pPr>
-        <w:spacing w:before="0" w:after="20"/>
-      </w:pPr>
-      <w:r>
-        <w:rPr>
-          <w:b w:val="0"/>
-          <w:i w:val="0"/>
-          <w:sz w:val="20"/>
-        </w:rPr>
-        <w:t>Email: {{ firm_email }}</w:t>
-      </w:r>
-    </w:p>
-    <w:p>
-      <w:pPr>
-        <w:spacing w:before="280" w:after="0"/>
-      </w:pPr>
-    </w:p>
-    <w:p>
-      <w:pPr>
-        <w:spacing w:before="0" w:after="0"/>
-        <w:jc w:val="center"/>
-      </w:pPr>
-      <w:r>
-        <w:rPr>
-          <w:b w:val="0"/>
-          <w:i w:val="0"/>
-          <w:sz w:val="20"/>
-        </w:rPr>
-        <w:t>{{ cert_date }}</w:t>
-      </w:r>
-    </w:p>
+    <w:tbl>
+      <w:tblPr>
+        <w:tblStyle w:val="TableGrid"/>
+        <w:tblW w:type="auto" w:w="0"/>
+        <w:tblLook w:firstColumn="1" w:firstRow="1" w:lastColumn="0" w:lastRow="0" w:noHBand="0" w:noVBand="1" w:val="04A0"/>
+      </w:tblPr>
+      <w:tblGrid>
+        <w:gridCol w:w="729"/>
+        <w:gridCol w:w="729"/>
+        <w:gridCol w:w="729"/>
+        <w:gridCol w:w="729"/>
+        <w:gridCol w:w="729"/>
+        <w:gridCol w:w="729"/>
+        <w:gridCol w:w="729"/>
+        <w:gridCol w:w="729"/>
+        <w:gridCol w:w="729"/>
+        <w:gridCol w:w="729"/>
+        <w:gridCol w:w="729"/>
+        <w:gridCol w:w="729"/>
+        <w:gridCol w:w="729"/>
+        <w:gridCol w:w="729"/>
+      </w:tblGrid>
+      <w:tr>
+        <w:trPr>
+          <w:trHeight w:val="95" w:hRule="exact"/>
+        </w:trPr>
+        <w:tc>
+          <w:tcPr>
+            <w:tcW w:type="dxa" w:w="729"/>
+            <w:tcBorders>
+              <w:top w:val="single" w:sz="4" w:color="B8CCE4" w:space="0"/>
+              <w:left w:val="single" w:sz="4" w:color="B8CCE4" w:space="0"/>
+              <w:bottom w:val="single" w:sz="4" w:color="B8CCE4" w:space="0"/>
+              <w:right w:val="single" w:sz="4" w:color="B8CCE4" w:space="0"/>
+            </w:tcBorders>
+          </w:tcPr>
+          <w:p/>
+        </w:tc>
+        <w:tc>
+          <w:tcPr>
+            <w:tcW w:type="dxa" w:w="729"/>
+            <w:tcBorders>
+              <w:top w:val="single" w:sz="4" w:color="B8CCE4" w:space="0"/>
+              <w:left w:val="single" w:sz="4" w:color="B8CCE4" w:space="0"/>
+              <w:bottom w:val="single" w:sz="4" w:color="B8CCE4" w:space="0"/>
+              <w:right w:val="single" w:sz="4" w:color="B8CCE4" w:space="0"/>
+            </w:tcBorders>
+          </w:tcPr>
+          <w:p/>
+        </w:tc>
+        <w:tc>
+          <w:tcPr>
+            <w:tcW w:type="dxa" w:w="729"/>
+            <w:tcBorders>
+              <w:top w:val="single" w:sz="4" w:color="B8CCE4" w:space="0"/>
+              <w:left w:val="single" w:sz="4" w:color="B8CCE4" w:space="0"/>
+              <w:bottom w:val="single" w:sz="4" w:color="B8CCE4" w:space="0"/>
+              <w:right w:val="single" w:sz="4" w:color="B8CCE4" w:space="0"/>
+            </w:tcBorders>
+          </w:tcPr>
+          <w:p/>
+        </w:tc>
+        <w:tc>
+          <w:tcPr>
+            <w:tcW w:type="dxa" w:w="729"/>
+            <w:tcBorders>
+              <w:top w:val="single" w:sz="4" w:color="B8CCE4" w:space="0"/>
+              <w:left w:val="single" w:sz="4" w:color="B8CCE4" w:space="0"/>
+              <w:bottom w:val="single" w:sz="4" w:color="B8CCE4" w:space="0"/>
+              <w:right w:val="single" w:sz="4" w:color="B8CCE4" w:space="0"/>
+            </w:tcBorders>
+          </w:tcPr>
+          <w:p/>
+        </w:tc>
+        <w:tc>
+          <w:tcPr>
+            <w:tcW w:type="dxa" w:w="729"/>
+            <w:tcBorders>
+              <w:top w:val="single" w:sz="4" w:color="B8CCE4" w:space="0"/>
+              <w:left w:val="single" w:sz="4" w:color="B8CCE4" w:space="0"/>
+              <w:bottom w:val="single" w:sz="4" w:color="B8CCE4" w:space="0"/>
+              <w:right w:val="single" w:sz="4" w:color="B8CCE4" w:space="0"/>
+            </w:tcBorders>
+          </w:tcPr>
+          <w:p/>
+        </w:tc>
+        <w:tc>
+          <w:tcPr>
+            <w:tcW w:type="dxa" w:w="729"/>
+            <w:tcBorders>
+              <w:top w:val="single" w:sz="4" w:color="B8CCE4" w:space="0"/>
+              <w:left w:val="single" w:sz="4" w:color="B8CCE4" w:space="0"/>
+              <w:bottom w:val="single" w:sz="4" w:color="B8CCE4" w:space="0"/>
+              <w:right w:val="single" w:sz="4" w:color="B8CCE4" w:space="0"/>
+            </w:tcBorders>
+          </w:tcPr>
+          <w:p/>
+        </w:tc>
+        <w:tc>
+          <w:tcPr>
+            <w:tcW w:type="dxa" w:w="729"/>
+            <w:tcBorders>
+              <w:top w:val="single" w:sz="4" w:color="B8CCE4" w:space="0"/>
+              <w:left w:val="single" w:sz="4" w:color="B8CCE4" w:space="0"/>
+              <w:bottom w:val="single" w:sz="4" w:color="B8CCE4" w:space="0"/>
+              <w:right w:val="single" w:sz="4" w:color="B8CCE4" w:space="0"/>
+            </w:tcBorders>
+          </w:tcPr>
+          <w:p/>
+        </w:tc>
+        <w:tc>
+          <w:tcPr>
+            <w:tcW w:type="dxa" w:w="729"/>
+            <w:tcBorders>
+              <w:top w:val="single" w:sz="4" w:color="B8CCE4" w:space="0"/>
+              <w:left w:val="single" w:sz="4" w:color="B8CCE4" w:space="0"/>
+              <w:bottom w:val="single" w:sz="4" w:color="B8CCE4" w:space="0"/>
+              <w:right w:val="single" w:sz="4" w:color="B8CCE4" w:space="0"/>
+            </w:tcBorders>
+          </w:tcPr>
+          <w:p/>
+        </w:tc>
+        <w:tc>
+          <w:tcPr>
+            <w:tcW w:type="dxa" w:w="729"/>
+            <w:tcBorders>
+              <w:top w:val="single" w:sz="4" w:color="B8CCE4" w:space="0"/>
+              <w:left w:val="single" w:sz="4" w:color="B8CCE4" w:space="0"/>
+              <w:bottom w:val="single" w:sz="4" w:color="B8CCE4" w:space="0"/>
+              <w:right w:val="single" w:sz="4" w:color="B8CCE4" w:space="0"/>
+            </w:tcBorders>
+          </w:tcPr>
+          <w:p/>
+        </w:tc>
+        <w:tc>
+          <w:tcPr>
+            <w:tcW w:type="dxa" w:w="729"/>
+            <w:tcBorders>
+              <w:top w:val="single" w:sz="4" w:color="B8CCE4" w:space="0"/>
+              <w:left w:val="single" w:sz="4" w:color="B8CCE4" w:space="0"/>
+              <w:bottom w:val="single" w:sz="4" w:color="B8CCE4" w:space="0"/>
+              <w:right w:val="single" w:sz="4" w:color="B8CCE4" w:space="0"/>
+            </w:tcBorders>
+          </w:tcPr>
+          <w:p/>
+        </w:tc>
+        <w:tc>
+          <w:tcPr>
+            <w:tcW w:type="dxa" w:w="729"/>
+            <w:tcBorders>
+              <w:top w:val="single" w:sz="4" w:color="B8CCE4" w:space="0"/>
+              <w:left w:val="single" w:sz="4" w:color="B8CCE4" w:space="0"/>
+              <w:bottom w:val="single" w:sz="4" w:color="B8CCE4" w:space="0"/>
+              <w:right w:val="single" w:sz="4" w:color="B8CCE4" w:space="0"/>
+            </w:tcBorders>
+          </w:tcPr>
+          <w:p/>
+        </w:tc>
+        <w:tc>
+          <w:tcPr>
+            <w:tcW w:type="dxa" w:w="729"/>
+            <w:tcBorders>
+              <w:top w:val="single" w:sz="4" w:color="B8CCE4" w:space="0"/>
+              <w:left w:val="single" w:sz="4" w:color="B8CCE4" w:space="0"/>
+              <w:bottom w:val="single" w:sz="4" w:color="B8CCE4" w:space="0"/>
+              <w:right w:val="single" w:sz="4" w:color="B8CCE4" w:space="0"/>
+            </w:tcBorders>
+          </w:tcPr>
+          <w:p/>
+        </w:tc>
+        <w:tc>
+          <w:tcPr>
+            <w:tcW w:type="dxa" w:w="729"/>
+            <w:tcBorders>
+              <w:top w:val="single" w:sz="4" w:color="B8CCE4" w:space="0"/>
+              <w:left w:val="single" w:sz="4" w:color="B8CCE4" w:space="0"/>
+              <w:bottom w:val="single" w:sz="4" w:color="B8CCE4" w:space="0"/>
+              <w:right w:val="single" w:sz="4" w:color="B8CCE4" w:space="0"/>
+            </w:tcBorders>
+          </w:tcPr>
+          <w:p/>
+        </w:tc>
+        <w:tc>
+          <w:tcPr>
+            <w:tcW w:type="dxa" w:w="729"/>
+            <w:tcBorders>
+              <w:top w:val="single" w:sz="4" w:color="B8CCE4" w:space="0"/>
+              <w:left w:val="single" w:sz="4" w:color="B8CCE4" w:space="0"/>
+              <w:bottom w:val="single" w:sz="4" w:color="B8CCE4" w:space="0"/>
+              <w:right w:val="single" w:sz="4" w:color="B8CCE4" w:space="0"/>
+            </w:tcBorders>
+          </w:tcPr>
+          <w:p/>
+        </w:tc>
+      </w:tr>
+      <w:tr>
+        <w:trPr>
+          <w:trHeight w:val="400" w:hRule="atLeast"/>
+        </w:trPr>
+        <w:tc>
+          <w:tcPr>
+            <w:tcW w:type="dxa" w:w="729"/>
+            <w:tcBorders>
+              <w:top w:val="single" w:sz="4" w:color="B8CCE4" w:space="0"/>
+              <w:left w:val="single" w:sz="4" w:color="B8CCE4" w:space="0"/>
+              <w:bottom w:val="single" w:sz="4" w:color="B8CCE4" w:space="0"/>
+              <w:right w:val="single" w:sz="4" w:color="B8CCE4" w:space="0"/>
+            </w:tcBorders>
+          </w:tcPr>
+          <w:p/>
+        </w:tc>
+        <w:tc>
+          <w:tcPr>
+            <w:tcW w:type="dxa" w:w="1458"/>
+            <w:gridSpan w:val="2"/>
+            <w:tcBorders>
+              <w:top w:val="none" w:sz="0" w:color="FFFFFF" w:space="0"/>
+              <w:left w:val="none" w:sz="0" w:color="FFFFFF" w:space="0"/>
+              <w:bottom w:val="none" w:sz="0" w:color="FFFFFF" w:space="0"/>
+              <w:right w:val="none" w:sz="0" w:color="FFFFFF" w:space="0"/>
+            </w:tcBorders>
+          </w:tcPr>
+          <w:p/>
+          <w:p>
+            <w:pPr>
+              <w:spacing w:before="200" w:after="40"/>
+              <w:jc w:val="center"/>
+            </w:pPr>
+            <w:r>
+              <w:rPr>
+                <w:b/>
+                <w:sz w:val="36"/>
+                <w:u w:val="none"/>
+              </w:rPr>
+              <w:t>Property Valuation Report</w:t>
+            </w:r>
+          </w:p>
+          <w:p>
+            <w:pPr>
+              <w:spacing w:before="0" w:after="200"/>
+              <w:jc w:val="center"/>
+            </w:pPr>
+            <w:r>
+              <w:rPr>
+                <w:b/>
+                <w:sz w:val="30"/>
+                <w:u w:val="none"/>
+              </w:rPr>
+              <w:t>({{ property_mortgaged }})</w:t>
+            </w:r>
+          </w:p>
+        </w:tc>
+        <w:tc>
+          <w:tcPr>
+            <w:tcW w:type="dxa" w:w="729"/>
+          </w:tcPr>
+          <w:p/>
+        </w:tc>
+        <w:tc>
+          <w:tcPr>
+            <w:tcW w:type="dxa" w:w="729"/>
+          </w:tcPr>
+          <w:p/>
+        </w:tc>
+        <w:tc>
+          <w:tcPr>
+            <w:tcW w:type="dxa" w:w="729"/>
+          </w:tcPr>
+          <w:p/>
+        </w:tc>
+        <w:tc>
+          <w:tcPr>
+            <w:tcW w:type="dxa" w:w="729"/>
+          </w:tcPr>
+          <w:p/>
+        </w:tc>
+        <w:tc>
+          <w:tcPr>
+            <w:tcW w:type="dxa" w:w="729"/>
+          </w:tcPr>
+          <w:p/>
+        </w:tc>
+        <w:tc>
+          <w:tcPr>
+            <w:tcW w:type="dxa" w:w="729"/>
+          </w:tcPr>
+          <w:p/>
+        </w:tc>
+        <w:tc>
+          <w:tcPr>
+            <w:tcW w:type="dxa" w:w="729"/>
+          </w:tcPr>
+          <w:p/>
+        </w:tc>
+        <w:tc>
+          <w:tcPr>
+            <w:tcW w:type="dxa" w:w="729"/>
+          </w:tcPr>
+          <w:p/>
+        </w:tc>
+        <w:tc>
+          <w:tcPr>
+            <w:tcW w:type="dxa" w:w="729"/>
+          </w:tcPr>
+          <w:p/>
+        </w:tc>
+        <w:tc>
+          <w:tcPr>
+            <w:tcW w:type="dxa" w:w="729"/>
+          </w:tcPr>
+          <w:p/>
+        </w:tc>
+        <w:tc>
+          <w:tcPr>
+            <w:tcW w:type="dxa" w:w="729"/>
+            <w:tcBorders>
+              <w:top w:val="single" w:sz="4" w:color="B8CCE4" w:space="0"/>
+              <w:left w:val="single" w:sz="4" w:color="B8CCE4" w:space="0"/>
+              <w:bottom w:val="single" w:sz="4" w:color="B8CCE4" w:space="0"/>
+              <w:right w:val="single" w:sz="4" w:color="B8CCE4" w:space="0"/>
+            </w:tcBorders>
+          </w:tcPr>
+          <w:p/>
+        </w:tc>
+      </w:tr>
+      <w:tr>
+        <w:trPr>
+          <w:trHeight w:val="95" w:hRule="exact"/>
+        </w:trPr>
+        <w:tc>
+          <w:tcPr>
+            <w:tcW w:type="dxa" w:w="729"/>
+            <w:tcBorders>
+              <w:top w:val="single" w:sz="4" w:color="B8CCE4" w:space="0"/>
+              <w:left w:val="single" w:sz="4" w:color="B8CCE4" w:space="0"/>
+              <w:bottom w:val="single" w:sz="4" w:color="B8CCE4" w:space="0"/>
+              <w:right w:val="single" w:sz="4" w:color="B8CCE4" w:space="0"/>
+            </w:tcBorders>
+          </w:tcPr>
+          <w:p/>
+        </w:tc>
+        <w:tc>
+          <w:tcPr>
+            <w:tcW w:type="dxa" w:w="729"/>
+            <w:tcBorders>
+              <w:top w:val="single" w:sz="4" w:color="B8CCE4" w:space="0"/>
+              <w:left w:val="single" w:sz="4" w:color="B8CCE4" w:space="0"/>
+              <w:bottom w:val="single" w:sz="4" w:color="B8CCE4" w:space="0"/>
+              <w:right w:val="single" w:sz="4" w:color="B8CCE4" w:space="0"/>
+            </w:tcBorders>
+          </w:tcPr>
+          <w:p/>
+        </w:tc>
+        <w:tc>
+          <w:tcPr>
+            <w:tcW w:type="dxa" w:w="729"/>
+            <w:tcBorders>
+              <w:top w:val="single" w:sz="4" w:color="B8CCE4" w:space="0"/>
+              <w:left w:val="single" w:sz="4" w:color="B8CCE4" w:space="0"/>
+              <w:bottom w:val="single" w:sz="4" w:color="B8CCE4" w:space="0"/>
+              <w:right w:val="single" w:sz="4" w:color="B8CCE4" w:space="0"/>
+            </w:tcBorders>
+          </w:tcPr>
+          <w:p/>
+        </w:tc>
+        <w:tc>
+          <w:tcPr>
+            <w:tcW w:type="dxa" w:w="729"/>
+            <w:tcBorders>
+              <w:top w:val="single" w:sz="4" w:color="B8CCE4" w:space="0"/>
+              <w:left w:val="single" w:sz="4" w:color="B8CCE4" w:space="0"/>
+              <w:bottom w:val="single" w:sz="4" w:color="B8CCE4" w:space="0"/>
+              <w:right w:val="single" w:sz="4" w:color="B8CCE4" w:space="0"/>
+            </w:tcBorders>
+          </w:tcPr>
+          <w:p/>
+        </w:tc>
+        <w:tc>
+          <w:tcPr>
+            <w:tcW w:type="dxa" w:w="729"/>
+            <w:tcBorders>
+              <w:top w:val="single" w:sz="4" w:color="B8CCE4" w:space="0"/>
+              <w:left w:val="single" w:sz="4" w:color="B8CCE4" w:space="0"/>
+              <w:bottom w:val="single" w:sz="4" w:color="B8CCE4" w:space="0"/>
+              <w:right w:val="single" w:sz="4" w:color="B8CCE4" w:space="0"/>
+            </w:tcBorders>
+          </w:tcPr>
+          <w:p/>
+        </w:tc>
+        <w:tc>
+          <w:tcPr>
+            <w:tcW w:type="dxa" w:w="729"/>
+            <w:tcBorders>
+              <w:top w:val="single" w:sz="4" w:color="B8CCE4" w:space="0"/>
+              <w:left w:val="single" w:sz="4" w:color="B8CCE4" w:space="0"/>
+              <w:bottom w:val="single" w:sz="4" w:color="B8CCE4" w:space="0"/>
+              <w:right w:val="single" w:sz="4" w:color="B8CCE4" w:space="0"/>
+            </w:tcBorders>
+          </w:tcPr>
+          <w:p/>
+        </w:tc>
+        <w:tc>
+          <w:tcPr>
+            <w:tcW w:type="dxa" w:w="729"/>
+            <w:tcBorders>
+              <w:top w:val="single" w:sz="4" w:color="B8CCE4" w:space="0"/>
+              <w:left w:val="single" w:sz="4" w:color="B8CCE4" w:space="0"/>
+              <w:bottom w:val="single" w:sz="4" w:color="B8CCE4" w:space="0"/>
+              <w:right w:val="single" w:sz="4" w:color="B8CCE4" w:space="0"/>
+            </w:tcBorders>
+          </w:tcPr>
+          <w:p/>
+        </w:tc>
+        <w:tc>
+          <w:tcPr>
+            <w:tcW w:type="dxa" w:w="729"/>
+            <w:tcBorders>
+              <w:top w:val="single" w:sz="4" w:color="B8CCE4" w:space="0"/>
+              <w:left w:val="single" w:sz="4" w:color="B8CCE4" w:space="0"/>
+              <w:bottom w:val="single" w:sz="4" w:color="B8CCE4" w:space="0"/>
+              <w:right w:val="single" w:sz="4" w:color="B8CCE4" w:space="0"/>
+            </w:tcBorders>
+          </w:tcPr>
+          <w:p/>
+        </w:tc>
+        <w:tc>
+          <w:tcPr>
+            <w:tcW w:type="dxa" w:w="729"/>
+            <w:tcBorders>
+              <w:top w:val="single" w:sz="4" w:color="B8CCE4" w:space="0"/>
+              <w:left w:val="single" w:sz="4" w:color="B8CCE4" w:space="0"/>
+              <w:bottom w:val="single" w:sz="4" w:color="B8CCE4" w:space="0"/>
+              <w:right w:val="single" w:sz="4" w:color="B8CCE4" w:space="0"/>
+            </w:tcBorders>
+          </w:tcPr>
+          <w:p/>
+        </w:tc>
+        <w:tc>
+          <w:tcPr>
+            <w:tcW w:type="dxa" w:w="729"/>
+            <w:tcBorders>
+              <w:top w:val="single" w:sz="4" w:color="B8CCE4" w:space="0"/>
+              <w:left w:val="single" w:sz="4" w:color="B8CCE4" w:space="0"/>
+              <w:bottom w:val="single" w:sz="4" w:color="B8CCE4" w:space="0"/>
+              <w:right w:val="single" w:sz="4" w:color="B8CCE4" w:space="0"/>
+            </w:tcBorders>
+          </w:tcPr>
+          <w:p/>
+        </w:tc>
+        <w:tc>
+          <w:tcPr>
+            <w:tcW w:type="dxa" w:w="729"/>
+            <w:tcBorders>
+              <w:top w:val="single" w:sz="4" w:color="B8CCE4" w:space="0"/>
+              <w:left w:val="single" w:sz="4" w:color="B8CCE4" w:space="0"/>
+              <w:bottom w:val="single" w:sz="4" w:color="B8CCE4" w:space="0"/>
+              <w:right w:val="single" w:sz="4" w:color="B8CCE4" w:space="0"/>
+            </w:tcBorders>
+          </w:tcPr>
+          <w:p/>
+        </w:tc>
+        <w:tc>
+          <w:tcPr>
+            <w:tcW w:type="dxa" w:w="729"/>
+            <w:tcBorders>
+              <w:top w:val="single" w:sz="4" w:color="B8CCE4" w:space="0"/>
+              <w:left w:val="single" w:sz="4" w:color="B8CCE4" w:space="0"/>
+              <w:bottom w:val="single" w:sz="4" w:color="B8CCE4" w:space="0"/>
+              <w:right w:val="single" w:sz="4" w:color="B8CCE4" w:space="0"/>
+            </w:tcBorders>
+          </w:tcPr>
+          <w:p/>
+        </w:tc>
+        <w:tc>
+          <w:tcPr>
+            <w:tcW w:type="dxa" w:w="729"/>
+            <w:tcBorders>
+              <w:top w:val="single" w:sz="4" w:color="B8CCE4" w:space="0"/>
+              <w:left w:val="single" w:sz="4" w:color="B8CCE4" w:space="0"/>
+              <w:bottom w:val="single" w:sz="4" w:color="B8CCE4" w:space="0"/>
+              <w:right w:val="single" w:sz="4" w:color="B8CCE4" w:space="0"/>
+            </w:tcBorders>
+          </w:tcPr>
+          <w:p/>
+        </w:tc>
+        <w:tc>
+          <w:tcPr>
+            <w:tcW w:type="dxa" w:w="729"/>
+            <w:tcBorders>
+              <w:top w:val="single" w:sz="4" w:color="B8CCE4" w:space="0"/>
+              <w:left w:val="single" w:sz="4" w:color="B8CCE4" w:space="0"/>
+              <w:bottom w:val="single" w:sz="4" w:color="B8CCE4" w:space="0"/>
+              <w:right w:val="single" w:sz="4" w:color="B8CCE4" w:space="0"/>
+            </w:tcBorders>
+          </w:tcPr>
+          <w:p/>
+        </w:tc>
+      </w:tr>
+      <w:tr>
+        <w:trPr>
+          <w:trHeight w:val="460" w:hRule="atLeast"/>
+        </w:trPr>
+        <w:tc>
+          <w:tcPr>
+            <w:tcW w:type="dxa" w:w="729"/>
+            <w:tcBorders>
+              <w:top w:val="single" w:sz="4" w:color="B8CCE4" w:space="0"/>
+              <w:left w:val="single" w:sz="4" w:color="B8CCE4" w:space="0"/>
+              <w:bottom w:val="single" w:sz="4" w:color="B8CCE4" w:space="0"/>
+              <w:right w:val="single" w:sz="4" w:color="B8CCE4" w:space="0"/>
+            </w:tcBorders>
+          </w:tcPr>
+          <w:p/>
+        </w:tc>
+        <w:tc>
+          <w:tcPr>
+            <w:tcW w:type="dxa" w:w="1458"/>
+            <w:gridSpan w:val="2"/>
+            <w:tcBorders>
+              <w:top w:val="none" w:sz="0" w:color="FFFFFF" w:space="0"/>
+              <w:left w:val="none" w:sz="0" w:color="FFFFFF" w:space="0"/>
+              <w:bottom w:val="none" w:sz="0" w:color="FFFFFF" w:space="0"/>
+              <w:right w:val="none" w:sz="0" w:color="FFFFFF" w:space="0"/>
+            </w:tcBorders>
+          </w:tcPr>
+          <w:p/>
+          <w:p>
+            <w:pPr>
+              <w:spacing w:before="160" w:after="80"/>
+              <w:jc w:val="center"/>
+            </w:pPr>
+            <w:r>
+              <w:rPr>
+                <w:b/>
+                <w:sz w:val="26"/>
+                <w:u w:val="single"/>
+              </w:rPr>
+              <w:t>Client</w:t>
+            </w:r>
+          </w:p>
+          <w:p>
+            <w:pPr>
+              <w:spacing w:before="0" w:after="80"/>
+              <w:jc w:val="center"/>
+            </w:pPr>
+            <w:r>
+              <w:rPr>
+                <w:b/>
+                <w:sz w:val="26"/>
+                <w:u w:val="none"/>
+              </w:rPr>
+              <w:t>{{ client_full_name }}</w:t>
+            </w:r>
+          </w:p>
+          <w:p>
+            <w:pPr>
+              <w:spacing w:before="0" w:after="40"/>
+              <w:jc w:val="center"/>
+            </w:pPr>
+            <w:r>
+              <w:rPr>
+                <w:b w:val="0"/>
+                <w:sz w:val="22"/>
+                <w:u w:val="none"/>
+              </w:rPr>
+              <w:t>{{ client_vdc_ward }}</w:t>
+            </w:r>
+          </w:p>
+          <w:p>
+            <w:pPr>
+              <w:spacing w:before="0" w:after="40"/>
+              <w:jc w:val="center"/>
+            </w:pPr>
+            <w:r>
+              <w:rPr>
+                <w:b w:val="0"/>
+                <w:sz w:val="22"/>
+                <w:u w:val="none"/>
+              </w:rPr>
+              <w:t>{{ client_district_country }}</w:t>
+            </w:r>
+          </w:p>
+          <w:p>
+            <w:pPr>
+              <w:spacing w:before="0" w:after="160"/>
+              <w:jc w:val="center"/>
+            </w:pPr>
+            <w:r>
+              <w:rPr>
+                <w:b w:val="0"/>
+                <w:sz w:val="22"/>
+                <w:u w:val="none"/>
+              </w:rPr>
+              <w:t>Contact No: {{ client_phone }}</w:t>
+            </w:r>
+          </w:p>
+        </w:tc>
+        <w:tc>
+          <w:tcPr>
+            <w:tcW w:type="dxa" w:w="729"/>
+          </w:tcPr>
+          <w:p/>
+        </w:tc>
+        <w:tc>
+          <w:tcPr>
+            <w:tcW w:type="dxa" w:w="729"/>
+          </w:tcPr>
+          <w:p/>
+        </w:tc>
+        <w:tc>
+          <w:tcPr>
+            <w:tcW w:type="dxa" w:w="729"/>
+          </w:tcPr>
+          <w:p/>
+        </w:tc>
+        <w:tc>
+          <w:tcPr>
+            <w:tcW w:type="dxa" w:w="729"/>
+          </w:tcPr>
+          <w:p/>
+        </w:tc>
+        <w:tc>
+          <w:tcPr>
+            <w:tcW w:type="dxa" w:w="729"/>
+          </w:tcPr>
+          <w:p/>
+        </w:tc>
+        <w:tc>
+          <w:tcPr>
+            <w:tcW w:type="dxa" w:w="729"/>
+          </w:tcPr>
+          <w:p/>
+        </w:tc>
+        <w:tc>
+          <w:tcPr>
+            <w:tcW w:type="dxa" w:w="729"/>
+          </w:tcPr>
+          <w:p/>
+        </w:tc>
+        <w:tc>
+          <w:tcPr>
+            <w:tcW w:type="dxa" w:w="729"/>
+          </w:tcPr>
+          <w:p/>
+        </w:tc>
+        <w:tc>
+          <w:tcPr>
+            <w:tcW w:type="dxa" w:w="729"/>
+          </w:tcPr>
+          <w:p/>
+        </w:tc>
+        <w:tc>
+          <w:tcPr>
+            <w:tcW w:type="dxa" w:w="729"/>
+          </w:tcPr>
+          <w:p/>
+        </w:tc>
+        <w:tc>
+          <w:tcPr>
+            <w:tcW w:type="dxa" w:w="729"/>
+            <w:tcBorders>
+              <w:top w:val="single" w:sz="4" w:color="B8CCE4" w:space="0"/>
+              <w:left w:val="single" w:sz="4" w:color="B8CCE4" w:space="0"/>
+              <w:bottom w:val="single" w:sz="4" w:color="B8CCE4" w:space="0"/>
+              <w:right w:val="single" w:sz="4" w:color="B8CCE4" w:space="0"/>
+            </w:tcBorders>
+          </w:tcPr>
+          <w:p/>
+        </w:tc>
+      </w:tr>
+      <w:tr>
+        <w:trPr>
+          <w:trHeight w:val="95" w:hRule="exact"/>
+        </w:trPr>
+        <w:tc>
+          <w:tcPr>
+            <w:tcW w:type="dxa" w:w="729"/>
+            <w:tcBorders>
+              <w:top w:val="single" w:sz="4" w:color="B8CCE4" w:space="0"/>
+              <w:left w:val="single" w:sz="4" w:color="B8CCE4" w:space="0"/>
+              <w:bottom w:val="single" w:sz="4" w:color="B8CCE4" w:space="0"/>
+              <w:right w:val="single" w:sz="4" w:color="B8CCE4" w:space="0"/>
+            </w:tcBorders>
+          </w:tcPr>
+          <w:p/>
+        </w:tc>
+        <w:tc>
+          <w:tcPr>
+            <w:tcW w:type="dxa" w:w="729"/>
+            <w:tcBorders>
+              <w:top w:val="single" w:sz="4" w:color="B8CCE4" w:space="0"/>
+              <w:left w:val="single" w:sz="4" w:color="B8CCE4" w:space="0"/>
+              <w:bottom w:val="single" w:sz="4" w:color="B8CCE4" w:space="0"/>
+              <w:right w:val="single" w:sz="4" w:color="B8CCE4" w:space="0"/>
+            </w:tcBorders>
+          </w:tcPr>
+          <w:p/>
+        </w:tc>
+        <w:tc>
+          <w:tcPr>
+            <w:tcW w:type="dxa" w:w="729"/>
+            <w:tcBorders>
+              <w:top w:val="single" w:sz="4" w:color="B8CCE4" w:space="0"/>
+              <w:left w:val="single" w:sz="4" w:color="B8CCE4" w:space="0"/>
+              <w:bottom w:val="single" w:sz="4" w:color="B8CCE4" w:space="0"/>
+              <w:right w:val="single" w:sz="4" w:color="B8CCE4" w:space="0"/>
+            </w:tcBorders>
+          </w:tcPr>
+          <w:p/>
+        </w:tc>
+        <w:tc>
+          <w:tcPr>
+            <w:tcW w:type="dxa" w:w="729"/>
+            <w:tcBorders>
+              <w:top w:val="single" w:sz="4" w:color="B8CCE4" w:space="0"/>
+              <w:left w:val="single" w:sz="4" w:color="B8CCE4" w:space="0"/>
+              <w:bottom w:val="single" w:sz="4" w:color="B8CCE4" w:space="0"/>
+              <w:right w:val="single" w:sz="4" w:color="B8CCE4" w:space="0"/>
+            </w:tcBorders>
+          </w:tcPr>
+          <w:p/>
+        </w:tc>
+        <w:tc>
+          <w:tcPr>
+            <w:tcW w:type="dxa" w:w="729"/>
+            <w:tcBorders>
+              <w:top w:val="single" w:sz="4" w:color="B8CCE4" w:space="0"/>
+              <w:left w:val="single" w:sz="4" w:color="B8CCE4" w:space="0"/>
+              <w:bottom w:val="single" w:sz="4" w:color="B8CCE4" w:space="0"/>
+              <w:right w:val="single" w:sz="4" w:color="B8CCE4" w:space="0"/>
+            </w:tcBorders>
+          </w:tcPr>
+          <w:p/>
+        </w:tc>
+        <w:tc>
+          <w:tcPr>
+            <w:tcW w:type="dxa" w:w="729"/>
+            <w:tcBorders>
+              <w:top w:val="single" w:sz="4" w:color="B8CCE4" w:space="0"/>
+              <w:left w:val="single" w:sz="4" w:color="B8CCE4" w:space="0"/>
+              <w:bottom w:val="single" w:sz="4" w:color="B8CCE4" w:space="0"/>
+              <w:right w:val="single" w:sz="4" w:color="B8CCE4" w:space="0"/>
+            </w:tcBorders>
+          </w:tcPr>
+          <w:p/>
+        </w:tc>
+        <w:tc>
+          <w:tcPr>
+            <w:tcW w:type="dxa" w:w="729"/>
+            <w:tcBorders>
+              <w:top w:val="single" w:sz="4" w:color="B8CCE4" w:space="0"/>
+              <w:left w:val="single" w:sz="4" w:color="B8CCE4" w:space="0"/>
+              <w:bottom w:val="single" w:sz="4" w:color="B8CCE4" w:space="0"/>
+              <w:right w:val="single" w:sz="4" w:color="B8CCE4" w:space="0"/>
+            </w:tcBorders>
+          </w:tcPr>
+          <w:p/>
+        </w:tc>
+        <w:tc>
+          <w:tcPr>
+            <w:tcW w:type="dxa" w:w="729"/>
+            <w:tcBorders>
+              <w:top w:val="single" w:sz="4" w:color="B8CCE4" w:space="0"/>
+              <w:left w:val="single" w:sz="4" w:color="B8CCE4" w:space="0"/>
+              <w:bottom w:val="single" w:sz="4" w:color="B8CCE4" w:space="0"/>
+              <w:right w:val="single" w:sz="4" w:color="B8CCE4" w:space="0"/>
+            </w:tcBorders>
+          </w:tcPr>
+          <w:p/>
+        </w:tc>
+        <w:tc>
+          <w:tcPr>
+            <w:tcW w:type="dxa" w:w="729"/>
+            <w:tcBorders>
+              <w:top w:val="single" w:sz="4" w:color="B8CCE4" w:space="0"/>
+              <w:left w:val="single" w:sz="4" w:color="B8CCE4" w:space="0"/>
+              <w:bottom w:val="single" w:sz="4" w:color="B8CCE4" w:space="0"/>
+              <w:right w:val="single" w:sz="4" w:color="B8CCE4" w:space="0"/>
+            </w:tcBorders>
+          </w:tcPr>
+          <w:p/>
+        </w:tc>
+        <w:tc>
+          <w:tcPr>
+            <w:tcW w:type="dxa" w:w="729"/>
+            <w:tcBorders>
+              <w:top w:val="single" w:sz="4" w:color="B8CCE4" w:space="0"/>
+              <w:left w:val="single" w:sz="4" w:color="B8CCE4" w:space="0"/>
+              <w:bottom w:val="single" w:sz="4" w:color="B8CCE4" w:space="0"/>
+              <w:right w:val="single" w:sz="4" w:color="B8CCE4" w:space="0"/>
+            </w:tcBorders>
+          </w:tcPr>
+          <w:p/>
+        </w:tc>
+        <w:tc>
+          <w:tcPr>
+            <w:tcW w:type="dxa" w:w="729"/>
+            <w:tcBorders>
+              <w:top w:val="single" w:sz="4" w:color="B8CCE4" w:space="0"/>
+              <w:left w:val="single" w:sz="4" w:color="B8CCE4" w:space="0"/>
+              <w:bottom w:val="single" w:sz="4" w:color="B8CCE4" w:space="0"/>
+              <w:right w:val="single" w:sz="4" w:color="B8CCE4" w:space="0"/>
+            </w:tcBorders>
+          </w:tcPr>
+          <w:p/>
+        </w:tc>
+        <w:tc>
+          <w:tcPr>
+            <w:tcW w:type="dxa" w:w="729"/>
+            <w:tcBorders>
+              <w:top w:val="single" w:sz="4" w:color="B8CCE4" w:space="0"/>
+              <w:left w:val="single" w:sz="4" w:color="B8CCE4" w:space="0"/>
+              <w:bottom w:val="single" w:sz="4" w:color="B8CCE4" w:space="0"/>
+              <w:right w:val="single" w:sz="4" w:color="B8CCE4" w:space="0"/>
+            </w:tcBorders>
+          </w:tcPr>
+          <w:p/>
+        </w:tc>
+        <w:tc>
+          <w:tcPr>
+            <w:tcW w:type="dxa" w:w="729"/>
+            <w:tcBorders>
+              <w:top w:val="single" w:sz="4" w:color="B8CCE4" w:space="0"/>
+              <w:left w:val="single" w:sz="4" w:color="B8CCE4" w:space="0"/>
+              <w:bottom w:val="single" w:sz="4" w:color="B8CCE4" w:space="0"/>
+              <w:right w:val="single" w:sz="4" w:color="B8CCE4" w:space="0"/>
+            </w:tcBorders>
+          </w:tcPr>
+          <w:p/>
+        </w:tc>
+        <w:tc>
+          <w:tcPr>
+            <w:tcW w:type="dxa" w:w="729"/>
+            <w:tcBorders>
+              <w:top w:val="single" w:sz="4" w:color="B8CCE4" w:space="0"/>
+              <w:left w:val="single" w:sz="4" w:color="B8CCE4" w:space="0"/>
+              <w:bottom w:val="single" w:sz="4" w:color="B8CCE4" w:space="0"/>
+              <w:right w:val="single" w:sz="4" w:color="B8CCE4" w:space="0"/>
+            </w:tcBorders>
+          </w:tcPr>
+          <w:p/>
+        </w:tc>
+      </w:tr>
+      <w:tr>
+        <w:trPr>
+          <w:trHeight w:val="480" w:hRule="atLeast"/>
+        </w:trPr>
+        <w:tc>
+          <w:tcPr>
+            <w:tcW w:type="dxa" w:w="729"/>
+            <w:tcBorders>
+              <w:top w:val="single" w:sz="4" w:color="B8CCE4" w:space="0"/>
+              <w:left w:val="single" w:sz="4" w:color="B8CCE4" w:space="0"/>
+              <w:bottom w:val="single" w:sz="4" w:color="B8CCE4" w:space="0"/>
+              <w:right w:val="single" w:sz="4" w:color="B8CCE4" w:space="0"/>
+            </w:tcBorders>
+          </w:tcPr>
+          <w:p/>
+        </w:tc>
+        <w:tc>
+          <w:tcPr>
+            <w:tcW w:type="dxa" w:w="1458"/>
+            <w:gridSpan w:val="2"/>
+            <w:tcBorders>
+              <w:top w:val="none" w:sz="0" w:color="FFFFFF" w:space="0"/>
+              <w:left w:val="none" w:sz="0" w:color="FFFFFF" w:space="0"/>
+              <w:bottom w:val="none" w:sz="0" w:color="FFFFFF" w:space="0"/>
+              <w:right w:val="none" w:sz="0" w:color="FFFFFF" w:space="0"/>
+            </w:tcBorders>
+          </w:tcPr>
+          <w:p/>
+          <w:p>
+            <w:pPr>
+              <w:spacing w:before="160" w:after="80"/>
+              <w:jc w:val="center"/>
+            </w:pPr>
+            <w:r>
+              <w:rPr>
+                <w:b/>
+                <w:sz w:val="26"/>
+                <w:u w:val="single"/>
+              </w:rPr>
+              <w:t>Properties to be Valued</w:t>
+            </w:r>
+          </w:p>
+          <w:p>
+            <w:pPr>
+              <w:spacing w:before="0" w:after="80"/>
+              <w:jc w:val="center"/>
+            </w:pPr>
+            <w:r>
+              <w:rPr>
+                <w:b/>
+                <w:sz w:val="22"/>
+                <w:u w:val="none"/>
+              </w:rPr>
+              <w:t>Land &amp; Building Located at</w:t>
+            </w:r>
+          </w:p>
+          <w:p>
+            <w:pPr>
+              <w:spacing w:before="0" w:after="40"/>
+              <w:jc w:val="center"/>
+            </w:pPr>
+            <w:r>
+              <w:rPr>
+                <w:b w:val="0"/>
+                <w:sz w:val="22"/>
+                <w:u w:val="none"/>
+              </w:rPr>
+              <w:t>Plot No:  {{ plot_no }}</w:t>
+            </w:r>
+          </w:p>
+          <w:p>
+            <w:pPr>
+              <w:spacing w:before="0" w:after="40"/>
+              <w:jc w:val="center"/>
+            </w:pPr>
+            <w:r>
+              <w:rPr>
+                <w:b w:val="0"/>
+                <w:sz w:val="22"/>
+                <w:u w:val="none"/>
+              </w:rPr>
+              <w:t>{{ property_location_full }}</w:t>
+            </w:r>
+          </w:p>
+          <w:p>
+            <w:pPr>
+              <w:spacing w:before="0" w:after="160"/>
+              <w:jc w:val="center"/>
+            </w:pPr>
+            <w:r>
+              <w:rPr>
+                <w:b w:val="0"/>
+                <w:sz w:val="22"/>
+                <w:u w:val="none"/>
+              </w:rPr>
+              <w:t>{{ sabik_display }}</w:t>
+            </w:r>
+          </w:p>
+        </w:tc>
+        <w:tc>
+          <w:tcPr>
+            <w:tcW w:type="dxa" w:w="729"/>
+          </w:tcPr>
+          <w:p/>
+        </w:tc>
+        <w:tc>
+          <w:tcPr>
+            <w:tcW w:type="dxa" w:w="729"/>
+          </w:tcPr>
+          <w:p/>
+        </w:tc>
+        <w:tc>
+          <w:tcPr>
+            <w:tcW w:type="dxa" w:w="729"/>
+          </w:tcPr>
+          <w:p/>
+        </w:tc>
+        <w:tc>
+          <w:tcPr>
+            <w:tcW w:type="dxa" w:w="729"/>
+          </w:tcPr>
+          <w:p/>
+        </w:tc>
+        <w:tc>
+          <w:tcPr>
+            <w:tcW w:type="dxa" w:w="729"/>
+          </w:tcPr>
+          <w:p/>
+        </w:tc>
+        <w:tc>
+          <w:tcPr>
+            <w:tcW w:type="dxa" w:w="729"/>
+          </w:tcPr>
+          <w:p/>
+        </w:tc>
+        <w:tc>
+          <w:tcPr>
+            <w:tcW w:type="dxa" w:w="729"/>
+          </w:tcPr>
+          <w:p/>
+        </w:tc>
+        <w:tc>
+          <w:tcPr>
+            <w:tcW w:type="dxa" w:w="729"/>
+          </w:tcPr>
+          <w:p/>
+        </w:tc>
+        <w:tc>
+          <w:tcPr>
+            <w:tcW w:type="dxa" w:w="729"/>
+          </w:tcPr>
+          <w:p/>
+        </w:tc>
+        <w:tc>
+          <w:tcPr>
+            <w:tcW w:type="dxa" w:w="729"/>
+          </w:tcPr>
+          <w:p/>
+        </w:tc>
+        <w:tc>
+          <w:tcPr>
+            <w:tcW w:type="dxa" w:w="729"/>
+            <w:tcBorders>
+              <w:top w:val="single" w:sz="4" w:color="B8CCE4" w:space="0"/>
+              <w:left w:val="single" w:sz="4" w:color="B8CCE4" w:space="0"/>
+              <w:bottom w:val="single" w:sz="4" w:color="B8CCE4" w:space="0"/>
+              <w:right w:val="single" w:sz="4" w:color="B8CCE4" w:space="0"/>
+            </w:tcBorders>
+          </w:tcPr>
+          <w:p/>
+        </w:tc>
+      </w:tr>
+      <w:tr>
+        <w:trPr>
+          <w:trHeight w:val="95" w:hRule="exact"/>
+        </w:trPr>
+        <w:tc>
+          <w:tcPr>
+            <w:tcW w:type="dxa" w:w="729"/>
+            <w:tcBorders>
+              <w:top w:val="single" w:sz="4" w:color="B8CCE4" w:space="0"/>
+              <w:left w:val="single" w:sz="4" w:color="B8CCE4" w:space="0"/>
+              <w:bottom w:val="single" w:sz="4" w:color="B8CCE4" w:space="0"/>
+              <w:right w:val="single" w:sz="4" w:color="B8CCE4" w:space="0"/>
+            </w:tcBorders>
+          </w:tcPr>
+          <w:p/>
+        </w:tc>
+        <w:tc>
+          <w:tcPr>
+            <w:tcW w:type="dxa" w:w="729"/>
+            <w:tcBorders>
+              <w:top w:val="single" w:sz="4" w:color="B8CCE4" w:space="0"/>
+              <w:left w:val="single" w:sz="4" w:color="B8CCE4" w:space="0"/>
+              <w:bottom w:val="single" w:sz="4" w:color="B8CCE4" w:space="0"/>
+              <w:right w:val="single" w:sz="4" w:color="B8CCE4" w:space="0"/>
+            </w:tcBorders>
+          </w:tcPr>
+          <w:p/>
+        </w:tc>
+        <w:tc>
+          <w:tcPr>
+            <w:tcW w:type="dxa" w:w="729"/>
+            <w:tcBorders>
+              <w:top w:val="single" w:sz="4" w:color="B8CCE4" w:space="0"/>
+              <w:left w:val="single" w:sz="4" w:color="B8CCE4" w:space="0"/>
+              <w:bottom w:val="single" w:sz="4" w:color="B8CCE4" w:space="0"/>
+              <w:right w:val="single" w:sz="4" w:color="B8CCE4" w:space="0"/>
+            </w:tcBorders>
+          </w:tcPr>
+          <w:p/>
+        </w:tc>
+        <w:tc>
+          <w:tcPr>
+            <w:tcW w:type="dxa" w:w="729"/>
+            <w:tcBorders>
+              <w:top w:val="single" w:sz="4" w:color="B8CCE4" w:space="0"/>
+              <w:left w:val="single" w:sz="4" w:color="B8CCE4" w:space="0"/>
+              <w:bottom w:val="single" w:sz="4" w:color="B8CCE4" w:space="0"/>
+              <w:right w:val="single" w:sz="4" w:color="B8CCE4" w:space="0"/>
+            </w:tcBorders>
+          </w:tcPr>
+          <w:p/>
+        </w:tc>
+        <w:tc>
+          <w:tcPr>
+            <w:tcW w:type="dxa" w:w="729"/>
+            <w:tcBorders>
+              <w:top w:val="single" w:sz="4" w:color="B8CCE4" w:space="0"/>
+              <w:left w:val="single" w:sz="4" w:color="B8CCE4" w:space="0"/>
+              <w:bottom w:val="single" w:sz="4" w:color="B8CCE4" w:space="0"/>
+              <w:right w:val="single" w:sz="4" w:color="B8CCE4" w:space="0"/>
+            </w:tcBorders>
+          </w:tcPr>
+          <w:p/>
+        </w:tc>
+        <w:tc>
+          <w:tcPr>
+            <w:tcW w:type="dxa" w:w="729"/>
+            <w:tcBorders>
+              <w:top w:val="single" w:sz="4" w:color="B8CCE4" w:space="0"/>
+              <w:left w:val="single" w:sz="4" w:color="B8CCE4" w:space="0"/>
+              <w:bottom w:val="single" w:sz="4" w:color="B8CCE4" w:space="0"/>
+              <w:right w:val="single" w:sz="4" w:color="B8CCE4" w:space="0"/>
+            </w:tcBorders>
+          </w:tcPr>
+          <w:p/>
+        </w:tc>
+        <w:tc>
+          <w:tcPr>
+            <w:tcW w:type="dxa" w:w="729"/>
+            <w:tcBorders>
+              <w:top w:val="single" w:sz="4" w:color="B8CCE4" w:space="0"/>
+              <w:left w:val="single" w:sz="4" w:color="B8CCE4" w:space="0"/>
+              <w:bottom w:val="single" w:sz="4" w:color="B8CCE4" w:space="0"/>
+              <w:right w:val="single" w:sz="4" w:color="B8CCE4" w:space="0"/>
+            </w:tcBorders>
+          </w:tcPr>
+          <w:p/>
+        </w:tc>
+        <w:tc>
+          <w:tcPr>
+            <w:tcW w:type="dxa" w:w="729"/>
+            <w:tcBorders>
+              <w:top w:val="single" w:sz="4" w:color="B8CCE4" w:space="0"/>
+              <w:left w:val="single" w:sz="4" w:color="B8CCE4" w:space="0"/>
+              <w:bottom w:val="single" w:sz="4" w:color="B8CCE4" w:space="0"/>
+              <w:right w:val="single" w:sz="4" w:color="B8CCE4" w:space="0"/>
+            </w:tcBorders>
+          </w:tcPr>
+          <w:p/>
+        </w:tc>
+        <w:tc>
+          <w:tcPr>
+            <w:tcW w:type="dxa" w:w="729"/>
+            <w:tcBorders>
+              <w:top w:val="single" w:sz="4" w:color="B8CCE4" w:space="0"/>
+              <w:left w:val="single" w:sz="4" w:color="B8CCE4" w:space="0"/>
+              <w:bottom w:val="single" w:sz="4" w:color="B8CCE4" w:space="0"/>
+              <w:right w:val="single" w:sz="4" w:color="B8CCE4" w:space="0"/>
+            </w:tcBorders>
+          </w:tcPr>
+          <w:p/>
+        </w:tc>
+        <w:tc>
+          <w:tcPr>
+            <w:tcW w:type="dxa" w:w="729"/>
+            <w:tcBorders>
+              <w:top w:val="single" w:sz="4" w:color="B8CCE4" w:space="0"/>
+              <w:left w:val="single" w:sz="4" w:color="B8CCE4" w:space="0"/>
+              <w:bottom w:val="single" w:sz="4" w:color="B8CCE4" w:space="0"/>
+              <w:right w:val="single" w:sz="4" w:color="B8CCE4" w:space="0"/>
+            </w:tcBorders>
+          </w:tcPr>
+          <w:p/>
+        </w:tc>
+        <w:tc>
+          <w:tcPr>
+            <w:tcW w:type="dxa" w:w="729"/>
+            <w:tcBorders>
+              <w:top w:val="single" w:sz="4" w:color="B8CCE4" w:space="0"/>
+              <w:left w:val="single" w:sz="4" w:color="B8CCE4" w:space="0"/>
+              <w:bottom w:val="single" w:sz="4" w:color="B8CCE4" w:space="0"/>
+              <w:right w:val="single" w:sz="4" w:color="B8CCE4" w:space="0"/>
+            </w:tcBorders>
+          </w:tcPr>
+          <w:p/>
+        </w:tc>
+        <w:tc>
+          <w:tcPr>
+            <w:tcW w:type="dxa" w:w="729"/>
+            <w:tcBorders>
+              <w:top w:val="single" w:sz="4" w:color="B8CCE4" w:space="0"/>
+              <w:left w:val="single" w:sz="4" w:color="B8CCE4" w:space="0"/>
+              <w:bottom w:val="single" w:sz="4" w:color="B8CCE4" w:space="0"/>
+              <w:right w:val="single" w:sz="4" w:color="B8CCE4" w:space="0"/>
+            </w:tcBorders>
+          </w:tcPr>
+          <w:p/>
+        </w:tc>
+        <w:tc>
+          <w:tcPr>
+            <w:tcW w:type="dxa" w:w="729"/>
+            <w:tcBorders>
+              <w:top w:val="single" w:sz="4" w:color="B8CCE4" w:space="0"/>
+              <w:left w:val="single" w:sz="4" w:color="B8CCE4" w:space="0"/>
+              <w:bottom w:val="single" w:sz="4" w:color="B8CCE4" w:space="0"/>
+              <w:right w:val="single" w:sz="4" w:color="B8CCE4" w:space="0"/>
+            </w:tcBorders>
+          </w:tcPr>
+          <w:p/>
+        </w:tc>
+        <w:tc>
+          <w:tcPr>
+            <w:tcW w:type="dxa" w:w="729"/>
+            <w:tcBorders>
+              <w:top w:val="single" w:sz="4" w:color="B8CCE4" w:space="0"/>
+              <w:left w:val="single" w:sz="4" w:color="B8CCE4" w:space="0"/>
+              <w:bottom w:val="single" w:sz="4" w:color="B8CCE4" w:space="0"/>
+              <w:right w:val="single" w:sz="4" w:color="B8CCE4" w:space="0"/>
+            </w:tcBorders>
+          </w:tcPr>
+          <w:p/>
+        </w:tc>
+      </w:tr>
+      <w:tr>
+        <w:trPr>
+          <w:trHeight w:val="460" w:hRule="atLeast"/>
+        </w:trPr>
+        <w:tc>
+          <w:tcPr>
+            <w:tcW w:type="dxa" w:w="729"/>
+            <w:tcBorders>
+              <w:top w:val="single" w:sz="4" w:color="B8CCE4" w:space="0"/>
+              <w:left w:val="single" w:sz="4" w:color="B8CCE4" w:space="0"/>
+              <w:bottom w:val="single" w:sz="4" w:color="B8CCE4" w:space="0"/>
+              <w:right w:val="single" w:sz="4" w:color="B8CCE4" w:space="0"/>
+            </w:tcBorders>
+          </w:tcPr>
+          <w:p/>
+        </w:tc>
+        <w:tc>
+          <w:tcPr>
+            <w:tcW w:type="dxa" w:w="1458"/>
+            <w:gridSpan w:val="2"/>
+            <w:tcBorders>
+              <w:top w:val="none" w:sz="0" w:color="FFFFFF" w:space="0"/>
+              <w:left w:val="none" w:sz="0" w:color="FFFFFF" w:space="0"/>
+              <w:bottom w:val="none" w:sz="0" w:color="FFFFFF" w:space="0"/>
+              <w:right w:val="none" w:sz="0" w:color="FFFFFF" w:space="0"/>
+            </w:tcBorders>
+          </w:tcPr>
+          <w:p/>
+          <w:p>
+            <w:pPr>
+              <w:spacing w:before="160" w:after="80"/>
+              <w:jc w:val="center"/>
+            </w:pPr>
+            <w:r>
+              <w:rPr>
+                <w:b/>
+                <w:sz w:val="26"/>
+                <w:u w:val="single"/>
+              </w:rPr>
+              <w:t>Owner 1</w:t>
+            </w:r>
+          </w:p>
+          <w:p>
+            <w:pPr>
+              <w:spacing w:before="0" w:after="80"/>
+              <w:jc w:val="center"/>
+            </w:pPr>
+            <w:r>
+              <w:rPr>
+                <w:b/>
+                <w:sz w:val="26"/>
+                <w:u w:val="none"/>
+              </w:rPr>
+              <w:t>{{ owner1_name }}</w:t>
+            </w:r>
+          </w:p>
+          <w:p>
+            <w:pPr>
+              <w:spacing w:before="0" w:after="40"/>
+              <w:jc w:val="center"/>
+            </w:pPr>
+            <w:r>
+              <w:rPr>
+                <w:b w:val="0"/>
+                <w:sz w:val="22"/>
+                <w:u w:val="none"/>
+              </w:rPr>
+              <w:t>{{ owner1_vdc_ward }}</w:t>
+            </w:r>
+          </w:p>
+          <w:p>
+            <w:pPr>
+              <w:spacing w:before="0" w:after="40"/>
+              <w:jc w:val="center"/>
+            </w:pPr>
+            <w:r>
+              <w:rPr>
+                <w:b w:val="0"/>
+                <w:sz w:val="22"/>
+                <w:u w:val="none"/>
+              </w:rPr>
+              <w:t>{{ owner1_district_country }}</w:t>
+            </w:r>
+          </w:p>
+          <w:p>
+            <w:pPr>
+              <w:spacing w:before="0" w:after="160"/>
+              <w:jc w:val="center"/>
+            </w:pPr>
+            <w:r>
+              <w:rPr>
+                <w:b w:val="0"/>
+                <w:sz w:val="22"/>
+                <w:u w:val="none"/>
+              </w:rPr>
+              <w:t>Contact No: {{ owner1_phone }}</w:t>
+            </w:r>
+          </w:p>
+        </w:tc>
+        <w:tc>
+          <w:tcPr>
+            <w:tcW w:type="dxa" w:w="729"/>
+          </w:tcPr>
+          <w:p/>
+        </w:tc>
+        <w:tc>
+          <w:tcPr>
+            <w:tcW w:type="dxa" w:w="729"/>
+          </w:tcPr>
+          <w:p/>
+        </w:tc>
+        <w:tc>
+          <w:tcPr>
+            <w:tcW w:type="dxa" w:w="729"/>
+          </w:tcPr>
+          <w:p/>
+        </w:tc>
+        <w:tc>
+          <w:tcPr>
+            <w:tcW w:type="dxa" w:w="729"/>
+          </w:tcPr>
+          <w:p/>
+        </w:tc>
+        <w:tc>
+          <w:tcPr>
+            <w:tcW w:type="dxa" w:w="729"/>
+          </w:tcPr>
+          <w:p/>
+        </w:tc>
+        <w:tc>
+          <w:tcPr>
+            <w:tcW w:type="dxa" w:w="729"/>
+          </w:tcPr>
+          <w:p/>
+        </w:tc>
+        <w:tc>
+          <w:tcPr>
+            <w:tcW w:type="dxa" w:w="729"/>
+          </w:tcPr>
+          <w:p/>
+        </w:tc>
+        <w:tc>
+          <w:tcPr>
+            <w:tcW w:type="dxa" w:w="729"/>
+          </w:tcPr>
+          <w:p/>
+        </w:tc>
+        <w:tc>
+          <w:tcPr>
+            <w:tcW w:type="dxa" w:w="729"/>
+          </w:tcPr>
+          <w:p/>
+        </w:tc>
+        <w:tc>
+          <w:tcPr>
+            <w:tcW w:type="dxa" w:w="729"/>
+          </w:tcPr>
+          <w:p/>
+        </w:tc>
+        <w:tc>
+          <w:tcPr>
+            <w:tcW w:type="dxa" w:w="729"/>
+            <w:tcBorders>
+              <w:top w:val="single" w:sz="4" w:color="B8CCE4" w:space="0"/>
+              <w:left w:val="single" w:sz="4" w:color="B8CCE4" w:space="0"/>
+              <w:bottom w:val="single" w:sz="4" w:color="B8CCE4" w:space="0"/>
+              <w:right w:val="single" w:sz="4" w:color="B8CCE4" w:space="0"/>
+            </w:tcBorders>
+          </w:tcPr>
+          <w:p/>
+        </w:tc>
+      </w:tr>
+      <w:tr>
+        <w:trPr>
+          <w:trHeight w:val="95" w:hRule="exact"/>
+        </w:trPr>
+        <w:tc>
+          <w:tcPr>
+            <w:tcW w:type="dxa" w:w="729"/>
+            <w:tcBorders>
+              <w:top w:val="single" w:sz="4" w:color="B8CCE4" w:space="0"/>
+              <w:left w:val="single" w:sz="4" w:color="B8CCE4" w:space="0"/>
+              <w:bottom w:val="single" w:sz="4" w:color="B8CCE4" w:space="0"/>
+              <w:right w:val="single" w:sz="4" w:color="B8CCE4" w:space="0"/>
+            </w:tcBorders>
+          </w:tcPr>
+          <w:p/>
+        </w:tc>
+        <w:tc>
+          <w:tcPr>
+            <w:tcW w:type="dxa" w:w="729"/>
+            <w:tcBorders>
+              <w:top w:val="single" w:sz="4" w:color="B8CCE4" w:space="0"/>
+              <w:left w:val="single" w:sz="4" w:color="B8CCE4" w:space="0"/>
+              <w:bottom w:val="single" w:sz="4" w:color="B8CCE4" w:space="0"/>
+              <w:right w:val="single" w:sz="4" w:color="B8CCE4" w:space="0"/>
+            </w:tcBorders>
+          </w:tcPr>
+          <w:p/>
+        </w:tc>
+        <w:tc>
+          <w:tcPr>
+            <w:tcW w:type="dxa" w:w="729"/>
+            <w:tcBorders>
+              <w:top w:val="single" w:sz="4" w:color="B8CCE4" w:space="0"/>
+              <w:left w:val="single" w:sz="4" w:color="B8CCE4" w:space="0"/>
+              <w:bottom w:val="single" w:sz="4" w:color="B8CCE4" w:space="0"/>
+              <w:right w:val="single" w:sz="4" w:color="B8CCE4" w:space="0"/>
+            </w:tcBorders>
+          </w:tcPr>
+          <w:p/>
+        </w:tc>
+        <w:tc>
+          <w:tcPr>
+            <w:tcW w:type="dxa" w:w="729"/>
+            <w:tcBorders>
+              <w:top w:val="single" w:sz="4" w:color="B8CCE4" w:space="0"/>
+              <w:left w:val="single" w:sz="4" w:color="B8CCE4" w:space="0"/>
+              <w:bottom w:val="single" w:sz="4" w:color="B8CCE4" w:space="0"/>
+              <w:right w:val="single" w:sz="4" w:color="B8CCE4" w:space="0"/>
+            </w:tcBorders>
+          </w:tcPr>
+          <w:p/>
+        </w:tc>
+        <w:tc>
+          <w:tcPr>
+            <w:tcW w:type="dxa" w:w="729"/>
+            <w:tcBorders>
+              <w:top w:val="single" w:sz="4" w:color="B8CCE4" w:space="0"/>
+              <w:left w:val="single" w:sz="4" w:color="B8CCE4" w:space="0"/>
+              <w:bottom w:val="single" w:sz="4" w:color="B8CCE4" w:space="0"/>
+              <w:right w:val="single" w:sz="4" w:color="B8CCE4" w:space="0"/>
+            </w:tcBorders>
+          </w:tcPr>
+          <w:p/>
+        </w:tc>
+        <w:tc>
+          <w:tcPr>
+            <w:tcW w:type="dxa" w:w="729"/>
+            <w:tcBorders>
+              <w:top w:val="single" w:sz="4" w:color="B8CCE4" w:space="0"/>
+              <w:left w:val="single" w:sz="4" w:color="B8CCE4" w:space="0"/>
+              <w:bottom w:val="single" w:sz="4" w:color="B8CCE4" w:space="0"/>
+              <w:right w:val="single" w:sz="4" w:color="B8CCE4" w:space="0"/>
+            </w:tcBorders>
+          </w:tcPr>
+          <w:p/>
+        </w:tc>
+        <w:tc>
+          <w:tcPr>
+            <w:tcW w:type="dxa" w:w="729"/>
+            <w:tcBorders>
+              <w:top w:val="single" w:sz="4" w:color="B8CCE4" w:space="0"/>
+              <w:left w:val="single" w:sz="4" w:color="B8CCE4" w:space="0"/>
+              <w:bottom w:val="single" w:sz="4" w:color="B8CCE4" w:space="0"/>
+              <w:right w:val="single" w:sz="4" w:color="B8CCE4" w:space="0"/>
+            </w:tcBorders>
+          </w:tcPr>
+          <w:p/>
+        </w:tc>
+        <w:tc>
+          <w:tcPr>
+            <w:tcW w:type="dxa" w:w="729"/>
+            <w:tcBorders>
+              <w:top w:val="single" w:sz="4" w:color="B8CCE4" w:space="0"/>
+              <w:left w:val="single" w:sz="4" w:color="B8CCE4" w:space="0"/>
+              <w:bottom w:val="single" w:sz="4" w:color="B8CCE4" w:space="0"/>
+              <w:right w:val="single" w:sz="4" w:color="B8CCE4" w:space="0"/>
+            </w:tcBorders>
+          </w:tcPr>
+          <w:p/>
+        </w:tc>
+        <w:tc>
+          <w:tcPr>
+            <w:tcW w:type="dxa" w:w="729"/>
+            <w:tcBorders>
+              <w:top w:val="single" w:sz="4" w:color="B8CCE4" w:space="0"/>
+              <w:left w:val="single" w:sz="4" w:color="B8CCE4" w:space="0"/>
+              <w:bottom w:val="single" w:sz="4" w:color="B8CCE4" w:space="0"/>
+              <w:right w:val="single" w:sz="4" w:color="B8CCE4" w:space="0"/>
+            </w:tcBorders>
+          </w:tcPr>
+          <w:p/>
+        </w:tc>
+        <w:tc>
+          <w:tcPr>
+            <w:tcW w:type="dxa" w:w="729"/>
+            <w:tcBorders>
+              <w:top w:val="single" w:sz="4" w:color="B8CCE4" w:space="0"/>
+              <w:left w:val="single" w:sz="4" w:color="B8CCE4" w:space="0"/>
+              <w:bottom w:val="single" w:sz="4" w:color="B8CCE4" w:space="0"/>
+              <w:right w:val="single" w:sz="4" w:color="B8CCE4" w:space="0"/>
+            </w:tcBorders>
+          </w:tcPr>
+          <w:p/>
+        </w:tc>
+        <w:tc>
+          <w:tcPr>
+            <w:tcW w:type="dxa" w:w="729"/>
+            <w:tcBorders>
+              <w:top w:val="single" w:sz="4" w:color="B8CCE4" w:space="0"/>
+              <w:left w:val="single" w:sz="4" w:color="B8CCE4" w:space="0"/>
+              <w:bottom w:val="single" w:sz="4" w:color="B8CCE4" w:space="0"/>
+              <w:right w:val="single" w:sz="4" w:color="B8CCE4" w:space="0"/>
+            </w:tcBorders>
+          </w:tcPr>
+          <w:p/>
+        </w:tc>
+        <w:tc>
+          <w:tcPr>
+            <w:tcW w:type="dxa" w:w="729"/>
+            <w:tcBorders>
+              <w:top w:val="single" w:sz="4" w:color="B8CCE4" w:space="0"/>
+              <w:left w:val="single" w:sz="4" w:color="B8CCE4" w:space="0"/>
+              <w:bottom w:val="single" w:sz="4" w:color="B8CCE4" w:space="0"/>
+              <w:right w:val="single" w:sz="4" w:color="B8CCE4" w:space="0"/>
+            </w:tcBorders>
+          </w:tcPr>
+          <w:p/>
+        </w:tc>
+        <w:tc>
+          <w:tcPr>
+            <w:tcW w:type="dxa" w:w="729"/>
+            <w:tcBorders>
+              <w:top w:val="single" w:sz="4" w:color="B8CCE4" w:space="0"/>
+              <w:left w:val="single" w:sz="4" w:color="B8CCE4" w:space="0"/>
+              <w:bottom w:val="single" w:sz="4" w:color="B8CCE4" w:space="0"/>
+              <w:right w:val="single" w:sz="4" w:color="B8CCE4" w:space="0"/>
+            </w:tcBorders>
+          </w:tcPr>
+          <w:p/>
+        </w:tc>
+        <w:tc>
+          <w:tcPr>
+            <w:tcW w:type="dxa" w:w="729"/>
+            <w:tcBorders>
+              <w:top w:val="single" w:sz="4" w:color="B8CCE4" w:space="0"/>
+              <w:left w:val="single" w:sz="4" w:color="B8CCE4" w:space="0"/>
+              <w:bottom w:val="single" w:sz="4" w:color="B8CCE4" w:space="0"/>
+              <w:right w:val="single" w:sz="4" w:color="B8CCE4" w:space="0"/>
+            </w:tcBorders>
+          </w:tcPr>
+          <w:p/>
+        </w:tc>
+      </w:tr>
+      <w:tr>
+        <w:trPr>
+          <w:trHeight w:val="460" w:hRule="atLeast"/>
+        </w:trPr>
+        <w:tc>
+          <w:tcPr>
+            <w:tcW w:type="dxa" w:w="729"/>
+            <w:tcBorders>
+              <w:top w:val="single" w:sz="4" w:color="B8CCE4" w:space="0"/>
+              <w:left w:val="single" w:sz="4" w:color="B8CCE4" w:space="0"/>
+              <w:bottom w:val="single" w:sz="4" w:color="B8CCE4" w:space="0"/>
+              <w:right w:val="single" w:sz="4" w:color="B8CCE4" w:space="0"/>
+            </w:tcBorders>
+          </w:tcPr>
+          <w:p/>
+        </w:tc>
+        <w:tc>
+          <w:tcPr>
+            <w:tcW w:type="dxa" w:w="1458"/>
+            <w:gridSpan w:val="2"/>
+            <w:tcBorders>
+              <w:top w:val="none" w:sz="0" w:color="FFFFFF" w:space="0"/>
+              <w:left w:val="none" w:sz="0" w:color="FFFFFF" w:space="0"/>
+              <w:bottom w:val="none" w:sz="0" w:color="FFFFFF" w:space="0"/>
+              <w:right w:val="none" w:sz="0" w:color="FFFFFF" w:space="0"/>
+            </w:tcBorders>
+          </w:tcPr>
+          <w:p/>
+          <w:p>
+            <w:pPr>
+              <w:spacing w:before="0" w:after="0"/>
+              <w:jc w:val="center"/>
+            </w:pPr>
+            <w:r>
+              <w:rPr>
+                <w:sz w:val="1"/>
+              </w:rPr>
+              <w:t>{%p if owner2_name and owner2_name != '—' %}</w:t>
+            </w:r>
+          </w:p>
+          <w:p>
+            <w:pPr>
+              <w:spacing w:before="160" w:after="80"/>
+              <w:jc w:val="center"/>
+            </w:pPr>
+            <w:r>
+              <w:rPr>
+                <w:b/>
+                <w:sz w:val="26"/>
+                <w:u w:val="single"/>
+              </w:rPr>
+              <w:t>Owner 2</w:t>
+            </w:r>
+          </w:p>
+          <w:p>
+            <w:pPr>
+              <w:spacing w:before="0" w:after="80"/>
+              <w:jc w:val="center"/>
+            </w:pPr>
+            <w:r>
+              <w:rPr>
+                <w:b/>
+                <w:sz w:val="26"/>
+                <w:u w:val="none"/>
+              </w:rPr>
+              <w:t>{{ owner2_name }}</w:t>
+            </w:r>
+          </w:p>
+          <w:p>
+            <w:pPr>
+              <w:spacing w:before="0" w:after="40"/>
+              <w:jc w:val="center"/>
+            </w:pPr>
+            <w:r>
+              <w:rPr>
+                <w:b w:val="0"/>
+                <w:sz w:val="22"/>
+                <w:u w:val="none"/>
+              </w:rPr>
+              <w:t>{{ owner2_vdc_ward }}</w:t>
+            </w:r>
+          </w:p>
+          <w:p>
+            <w:pPr>
+              <w:spacing w:before="0" w:after="40"/>
+              <w:jc w:val="center"/>
+            </w:pPr>
+            <w:r>
+              <w:rPr>
+                <w:b w:val="0"/>
+                <w:sz w:val="22"/>
+                <w:u w:val="none"/>
+              </w:rPr>
+              <w:t>{{ owner2_district_country }}</w:t>
+            </w:r>
+          </w:p>
+          <w:p>
+            <w:pPr>
+              <w:spacing w:before="0" w:after="160"/>
+              <w:jc w:val="center"/>
+            </w:pPr>
+            <w:r>
+              <w:rPr>
+                <w:b w:val="0"/>
+                <w:sz w:val="22"/>
+                <w:u w:val="none"/>
+              </w:rPr>
+              <w:t>Contact No: {{ owner2_phone }}</w:t>
+            </w:r>
+          </w:p>
+          <w:p>
+            <w:pPr>
+              <w:spacing w:before="0" w:after="0"/>
+              <w:jc w:val="center"/>
+            </w:pPr>
+            <w:r>
+              <w:rPr>
+                <w:sz w:val="1"/>
+              </w:rPr>
+              <w:t>{%p endif %}</w:t>
+            </w:r>
+          </w:p>
+        </w:tc>
+        <w:tc>
+          <w:tcPr>
+            <w:tcW w:type="dxa" w:w="729"/>
+          </w:tcPr>
+          <w:p/>
+        </w:tc>
+        <w:tc>
+          <w:tcPr>
+            <w:tcW w:type="dxa" w:w="729"/>
+          </w:tcPr>
+          <w:p/>
+        </w:tc>
+        <w:tc>
+          <w:tcPr>
+            <w:tcW w:type="dxa" w:w="729"/>
+          </w:tcPr>
+          <w:p/>
+        </w:tc>
+        <w:tc>
+          <w:tcPr>
+            <w:tcW w:type="dxa" w:w="729"/>
+          </w:tcPr>
+          <w:p/>
+        </w:tc>
+        <w:tc>
+          <w:tcPr>
+            <w:tcW w:type="dxa" w:w="729"/>
+          </w:tcPr>
+          <w:p/>
+        </w:tc>
+        <w:tc>
+          <w:tcPr>
+            <w:tcW w:type="dxa" w:w="729"/>
+          </w:tcPr>
+          <w:p/>
+        </w:tc>
+        <w:tc>
+          <w:tcPr>
+            <w:tcW w:type="dxa" w:w="729"/>
+          </w:tcPr>
+          <w:p/>
+        </w:tc>
+        <w:tc>
+          <w:tcPr>
+            <w:tcW w:type="dxa" w:w="729"/>
+          </w:tcPr>
+          <w:p/>
+        </w:tc>
+        <w:tc>
+          <w:tcPr>
+            <w:tcW w:type="dxa" w:w="729"/>
+          </w:tcPr>
+          <w:p/>
+        </w:tc>
+        <w:tc>
+          <w:tcPr>
+            <w:tcW w:type="dxa" w:w="729"/>
+          </w:tcPr>
+          <w:p/>
+        </w:tc>
+        <w:tc>
+          <w:tcPr>
+            <w:tcW w:type="dxa" w:w="729"/>
+            <w:tcBorders>
+              <w:top w:val="single" w:sz="4" w:color="B8CCE4" w:space="0"/>
+              <w:left w:val="single" w:sz="4" w:color="B8CCE4" w:space="0"/>
+              <w:bottom w:val="single" w:sz="4" w:color="B8CCE4" w:space="0"/>
+              <w:right w:val="single" w:sz="4" w:color="B8CCE4" w:space="0"/>
+            </w:tcBorders>
+          </w:tcPr>
+          <w:p/>
+        </w:tc>
+      </w:tr>
+      <w:tr>
+        <w:trPr>
+          <w:trHeight w:val="95" w:hRule="exact"/>
+        </w:trPr>
+        <w:tc>
+          <w:tcPr>
+            <w:tcW w:type="dxa" w:w="729"/>
+            <w:tcBorders>
+              <w:top w:val="single" w:sz="4" w:color="B8CCE4" w:space="0"/>
+              <w:left w:val="single" w:sz="4" w:color="B8CCE4" w:space="0"/>
+              <w:bottom w:val="single" w:sz="4" w:color="B8CCE4" w:space="0"/>
+              <w:right w:val="single" w:sz="4" w:color="B8CCE4" w:space="0"/>
+            </w:tcBorders>
+          </w:tcPr>
+          <w:p/>
+        </w:tc>
+        <w:tc>
+          <w:tcPr>
+            <w:tcW w:type="dxa" w:w="729"/>
+            <w:tcBorders>
+              <w:top w:val="single" w:sz="4" w:color="B8CCE4" w:space="0"/>
+              <w:left w:val="single" w:sz="4" w:color="B8CCE4" w:space="0"/>
+              <w:bottom w:val="single" w:sz="4" w:color="B8CCE4" w:space="0"/>
+              <w:right w:val="single" w:sz="4" w:color="B8CCE4" w:space="0"/>
+            </w:tcBorders>
+          </w:tcPr>
+          <w:p/>
+        </w:tc>
+        <w:tc>
+          <w:tcPr>
+            <w:tcW w:type="dxa" w:w="729"/>
+            <w:tcBorders>
+              <w:top w:val="single" w:sz="4" w:color="B8CCE4" w:space="0"/>
+              <w:left w:val="single" w:sz="4" w:color="B8CCE4" w:space="0"/>
+              <w:bottom w:val="single" w:sz="4" w:color="B8CCE4" w:space="0"/>
+              <w:right w:val="single" w:sz="4" w:color="B8CCE4" w:space="0"/>
+            </w:tcBorders>
+          </w:tcPr>
+          <w:p/>
+        </w:tc>
+        <w:tc>
+          <w:tcPr>
+            <w:tcW w:type="dxa" w:w="729"/>
+            <w:tcBorders>
+              <w:top w:val="single" w:sz="4" w:color="B8CCE4" w:space="0"/>
+              <w:left w:val="single" w:sz="4" w:color="B8CCE4" w:space="0"/>
+              <w:bottom w:val="single" w:sz="4" w:color="B8CCE4" w:space="0"/>
+              <w:right w:val="single" w:sz="4" w:color="B8CCE4" w:space="0"/>
+            </w:tcBorders>
+          </w:tcPr>
+          <w:p/>
+        </w:tc>
+        <w:tc>
+          <w:tcPr>
+            <w:tcW w:type="dxa" w:w="729"/>
+            <w:tcBorders>
+              <w:top w:val="single" w:sz="4" w:color="B8CCE4" w:space="0"/>
+              <w:left w:val="single" w:sz="4" w:color="B8CCE4" w:space="0"/>
+              <w:bottom w:val="single" w:sz="4" w:color="B8CCE4" w:space="0"/>
+              <w:right w:val="single" w:sz="4" w:color="B8CCE4" w:space="0"/>
+            </w:tcBorders>
+          </w:tcPr>
+          <w:p/>
+        </w:tc>
+        <w:tc>
+          <w:tcPr>
+            <w:tcW w:type="dxa" w:w="729"/>
+            <w:tcBorders>
+              <w:top w:val="single" w:sz="4" w:color="B8CCE4" w:space="0"/>
+              <w:left w:val="single" w:sz="4" w:color="B8CCE4" w:space="0"/>
+              <w:bottom w:val="single" w:sz="4" w:color="B8CCE4" w:space="0"/>
+              <w:right w:val="single" w:sz="4" w:color="B8CCE4" w:space="0"/>
+            </w:tcBorders>
+          </w:tcPr>
+          <w:p/>
+        </w:tc>
+        <w:tc>
+          <w:tcPr>
+            <w:tcW w:type="dxa" w:w="729"/>
+            <w:tcBorders>
+              <w:top w:val="single" w:sz="4" w:color="B8CCE4" w:space="0"/>
+              <w:left w:val="single" w:sz="4" w:color="B8CCE4" w:space="0"/>
+              <w:bottom w:val="single" w:sz="4" w:color="B8CCE4" w:space="0"/>
+              <w:right w:val="single" w:sz="4" w:color="B8CCE4" w:space="0"/>
+            </w:tcBorders>
+          </w:tcPr>
+          <w:p/>
+        </w:tc>
+        <w:tc>
+          <w:tcPr>
+            <w:tcW w:type="dxa" w:w="729"/>
+            <w:tcBorders>
+              <w:top w:val="single" w:sz="4" w:color="B8CCE4" w:space="0"/>
+              <w:left w:val="single" w:sz="4" w:color="B8CCE4" w:space="0"/>
+              <w:bottom w:val="single" w:sz="4" w:color="B8CCE4" w:space="0"/>
+              <w:right w:val="single" w:sz="4" w:color="B8CCE4" w:space="0"/>
+            </w:tcBorders>
+          </w:tcPr>
+          <w:p/>
+        </w:tc>
+        <w:tc>
+          <w:tcPr>
+            <w:tcW w:type="dxa" w:w="729"/>
+            <w:tcBorders>
+              <w:top w:val="single" w:sz="4" w:color="B8CCE4" w:space="0"/>
+              <w:left w:val="single" w:sz="4" w:color="B8CCE4" w:space="0"/>
+              <w:bottom w:val="single" w:sz="4" w:color="B8CCE4" w:space="0"/>
+              <w:right w:val="single" w:sz="4" w:color="B8CCE4" w:space="0"/>
+            </w:tcBorders>
+          </w:tcPr>
+          <w:p/>
+        </w:tc>
+        <w:tc>
+          <w:tcPr>
+            <w:tcW w:type="dxa" w:w="729"/>
+            <w:tcBorders>
+              <w:top w:val="single" w:sz="4" w:color="B8CCE4" w:space="0"/>
+              <w:left w:val="single" w:sz="4" w:color="B8CCE4" w:space="0"/>
+              <w:bottom w:val="single" w:sz="4" w:color="B8CCE4" w:space="0"/>
+              <w:right w:val="single" w:sz="4" w:color="B8CCE4" w:space="0"/>
+            </w:tcBorders>
+          </w:tcPr>
+          <w:p/>
+        </w:tc>
+        <w:tc>
+          <w:tcPr>
+            <w:tcW w:type="dxa" w:w="729"/>
+            <w:tcBorders>
+              <w:top w:val="single" w:sz="4" w:color="B8CCE4" w:space="0"/>
+              <w:left w:val="single" w:sz="4" w:color="B8CCE4" w:space="0"/>
+              <w:bottom w:val="single" w:sz="4" w:color="B8CCE4" w:space="0"/>
+              <w:right w:val="single" w:sz="4" w:color="B8CCE4" w:space="0"/>
+            </w:tcBorders>
+          </w:tcPr>
+          <w:p/>
+        </w:tc>
+        <w:tc>
+          <w:tcPr>
+            <w:tcW w:type="dxa" w:w="729"/>
+            <w:tcBorders>
+              <w:top w:val="single" w:sz="4" w:color="B8CCE4" w:space="0"/>
+              <w:left w:val="single" w:sz="4" w:color="B8CCE4" w:space="0"/>
+              <w:bottom w:val="single" w:sz="4" w:color="B8CCE4" w:space="0"/>
+              <w:right w:val="single" w:sz="4" w:color="B8CCE4" w:space="0"/>
+            </w:tcBorders>
+          </w:tcPr>
+          <w:p/>
+        </w:tc>
+        <w:tc>
+          <w:tcPr>
+            <w:tcW w:type="dxa" w:w="729"/>
+            <w:tcBorders>
+              <w:top w:val="single" w:sz="4" w:color="B8CCE4" w:space="0"/>
+              <w:left w:val="single" w:sz="4" w:color="B8CCE4" w:space="0"/>
+              <w:bottom w:val="single" w:sz="4" w:color="B8CCE4" w:space="0"/>
+              <w:right w:val="single" w:sz="4" w:color="B8CCE4" w:space="0"/>
+            </w:tcBorders>
+          </w:tcPr>
+          <w:p/>
+        </w:tc>
+        <w:tc>
+          <w:tcPr>
+            <w:tcW w:type="dxa" w:w="729"/>
+            <w:tcBorders>
+              <w:top w:val="single" w:sz="4" w:color="B8CCE4" w:space="0"/>
+              <w:left w:val="single" w:sz="4" w:color="B8CCE4" w:space="0"/>
+              <w:bottom w:val="single" w:sz="4" w:color="B8CCE4" w:space="0"/>
+              <w:right w:val="single" w:sz="4" w:color="B8CCE4" w:space="0"/>
+            </w:tcBorders>
+          </w:tcPr>
+          <w:p/>
+        </w:tc>
+      </w:tr>
+      <w:tr>
+        <w:trPr>
+          <w:trHeight w:val="360" w:hRule="atLeast"/>
+        </w:trPr>
+        <w:tc>
+          <w:tcPr>
+            <w:tcW w:type="dxa" w:w="729"/>
+            <w:tcBorders>
+              <w:top w:val="single" w:sz="4" w:color="B8CCE4" w:space="0"/>
+              <w:left w:val="single" w:sz="4" w:color="B8CCE4" w:space="0"/>
+              <w:bottom w:val="single" w:sz="4" w:color="B8CCE4" w:space="0"/>
+              <w:right w:val="single" w:sz="4" w:color="B8CCE4" w:space="0"/>
+            </w:tcBorders>
+          </w:tcPr>
+          <w:p/>
+        </w:tc>
+        <w:tc>
+          <w:tcPr>
+            <w:tcW w:type="dxa" w:w="1458"/>
+            <w:gridSpan w:val="2"/>
+            <w:tcBorders>
+              <w:top w:val="none" w:sz="0" w:color="FFFFFF" w:space="0"/>
+              <w:left w:val="none" w:sz="0" w:color="FFFFFF" w:space="0"/>
+              <w:bottom w:val="none" w:sz="0" w:color="FFFFFF" w:space="0"/>
+              <w:right w:val="none" w:sz="0" w:color="FFFFFF" w:space="0"/>
+            </w:tcBorders>
+          </w:tcPr>
+          <w:p/>
+          <w:p>
+            <w:pPr>
+              <w:spacing w:before="160" w:after="160"/>
+              <w:jc w:val="center"/>
+            </w:pPr>
+            <w:r>
+              <w:rPr>
+                <w:b/>
+                <w:sz w:val="26"/>
+                <w:u w:val="single"/>
+              </w:rPr>
+              <w:t>Submitted to</w:t>
+            </w:r>
+          </w:p>
+          <w:p>
+            <w:pPr>
+              <w:spacing w:before="0" w:after="80"/>
+              <w:jc w:val="center"/>
+            </w:pPr>
+            <w:r>
+              <w:rPr>
+                <w:b/>
+                <w:sz w:val="26"/>
+                <w:u w:val="single"/>
+              </w:rPr>
+              <w:t>{{ bank_name }}</w:t>
+            </w:r>
+          </w:p>
+          <w:p>
+            <w:pPr>
+              <w:spacing w:before="0" w:after="160"/>
+              <w:jc w:val="center"/>
+            </w:pPr>
+            <w:r>
+              <w:rPr>
+                <w:b w:val="0"/>
+                <w:sz w:val="22"/>
+                <w:u w:val="none"/>
+              </w:rPr>
+              <w:t>{{ bank_branch }}</w:t>
+            </w:r>
+          </w:p>
+        </w:tc>
+        <w:tc>
+          <w:tcPr>
+            <w:tcW w:type="dxa" w:w="729"/>
+          </w:tcPr>
+          <w:p/>
+        </w:tc>
+        <w:tc>
+          <w:tcPr>
+            <w:tcW w:type="dxa" w:w="729"/>
+          </w:tcPr>
+          <w:p/>
+        </w:tc>
+        <w:tc>
+          <w:tcPr>
+            <w:tcW w:type="dxa" w:w="729"/>
+          </w:tcPr>
+          <w:p/>
+        </w:tc>
+        <w:tc>
+          <w:tcPr>
+            <w:tcW w:type="dxa" w:w="729"/>
+          </w:tcPr>
+          <w:p/>
+        </w:tc>
+        <w:tc>
+          <w:tcPr>
+            <w:tcW w:type="dxa" w:w="729"/>
+          </w:tcPr>
+          <w:p/>
+        </w:tc>
+        <w:tc>
+          <w:tcPr>
+            <w:tcW w:type="dxa" w:w="729"/>
+          </w:tcPr>
+          <w:p/>
+        </w:tc>
+        <w:tc>
+          <w:tcPr>
+            <w:tcW w:type="dxa" w:w="729"/>
+          </w:tcPr>
+          <w:p/>
+        </w:tc>
+        <w:tc>
+          <w:tcPr>
+            <w:tcW w:type="dxa" w:w="729"/>
+          </w:tcPr>
+          <w:p/>
+        </w:tc>
+        <w:tc>
+          <w:tcPr>
+            <w:tcW w:type="dxa" w:w="729"/>
+          </w:tcPr>
+          <w:p/>
+        </w:tc>
+        <w:tc>
+          <w:tcPr>
+            <w:tcW w:type="dxa" w:w="729"/>
+          </w:tcPr>
+          <w:p/>
+        </w:tc>
+        <w:tc>
+          <w:tcPr>
+            <w:tcW w:type="dxa" w:w="729"/>
+            <w:tcBorders>
+              <w:top w:val="single" w:sz="4" w:color="B8CCE4" w:space="0"/>
+              <w:left w:val="single" w:sz="4" w:color="B8CCE4" w:space="0"/>
+              <w:bottom w:val="single" w:sz="4" w:color="B8CCE4" w:space="0"/>
+              <w:right w:val="single" w:sz="4" w:color="B8CCE4" w:space="0"/>
+            </w:tcBorders>
+          </w:tcPr>
+          <w:p/>
+        </w:tc>
+      </w:tr>
+      <w:tr>
+        <w:trPr>
+          <w:trHeight w:val="95" w:hRule="exact"/>
+        </w:trPr>
+        <w:tc>
+          <w:tcPr>
+            <w:tcW w:type="dxa" w:w="729"/>
+            <w:tcBorders>
+              <w:top w:val="single" w:sz="4" w:color="B8CCE4" w:space="0"/>
+              <w:left w:val="single" w:sz="4" w:color="B8CCE4" w:space="0"/>
+              <w:bottom w:val="single" w:sz="4" w:color="B8CCE4" w:space="0"/>
+              <w:right w:val="single" w:sz="4" w:color="B8CCE4" w:space="0"/>
+            </w:tcBorders>
+          </w:tcPr>
+          <w:p/>
+        </w:tc>
+        <w:tc>
+          <w:tcPr>
+            <w:tcW w:type="dxa" w:w="729"/>
+            <w:tcBorders>
+              <w:top w:val="single" w:sz="4" w:color="B8CCE4" w:space="0"/>
+              <w:left w:val="single" w:sz="4" w:color="B8CCE4" w:space="0"/>
+              <w:bottom w:val="single" w:sz="4" w:color="B8CCE4" w:space="0"/>
+              <w:right w:val="single" w:sz="4" w:color="B8CCE4" w:space="0"/>
+            </w:tcBorders>
+          </w:tcPr>
+          <w:p/>
+        </w:tc>
+        <w:tc>
+          <w:tcPr>
+            <w:tcW w:type="dxa" w:w="729"/>
+            <w:tcBorders>
+              <w:top w:val="single" w:sz="4" w:color="B8CCE4" w:space="0"/>
+              <w:left w:val="single" w:sz="4" w:color="B8CCE4" w:space="0"/>
+              <w:bottom w:val="single" w:sz="4" w:color="B8CCE4" w:space="0"/>
+              <w:right w:val="single" w:sz="4" w:color="B8CCE4" w:space="0"/>
+            </w:tcBorders>
+          </w:tcPr>
+          <w:p/>
+        </w:tc>
+        <w:tc>
+          <w:tcPr>
+            <w:tcW w:type="dxa" w:w="729"/>
+            <w:tcBorders>
+              <w:top w:val="single" w:sz="4" w:color="B8CCE4" w:space="0"/>
+              <w:left w:val="single" w:sz="4" w:color="B8CCE4" w:space="0"/>
+              <w:bottom w:val="single" w:sz="4" w:color="B8CCE4" w:space="0"/>
+              <w:right w:val="single" w:sz="4" w:color="B8CCE4" w:space="0"/>
+            </w:tcBorders>
+          </w:tcPr>
+          <w:p/>
+        </w:tc>
+        <w:tc>
+          <w:tcPr>
+            <w:tcW w:type="dxa" w:w="729"/>
+            <w:tcBorders>
+              <w:top w:val="single" w:sz="4" w:color="B8CCE4" w:space="0"/>
+              <w:left w:val="single" w:sz="4" w:color="B8CCE4" w:space="0"/>
+              <w:bottom w:val="single" w:sz="4" w:color="B8CCE4" w:space="0"/>
+              <w:right w:val="single" w:sz="4" w:color="B8CCE4" w:space="0"/>
+            </w:tcBorders>
+          </w:tcPr>
+          <w:p/>
+        </w:tc>
+        <w:tc>
+          <w:tcPr>
+            <w:tcW w:type="dxa" w:w="729"/>
+            <w:tcBorders>
+              <w:top w:val="single" w:sz="4" w:color="B8CCE4" w:space="0"/>
+              <w:left w:val="single" w:sz="4" w:color="B8CCE4" w:space="0"/>
+              <w:bottom w:val="single" w:sz="4" w:color="B8CCE4" w:space="0"/>
+              <w:right w:val="single" w:sz="4" w:color="B8CCE4" w:space="0"/>
+            </w:tcBorders>
+          </w:tcPr>
+          <w:p/>
+        </w:tc>
+        <w:tc>
+          <w:tcPr>
+            <w:tcW w:type="dxa" w:w="729"/>
+            <w:tcBorders>
+              <w:top w:val="single" w:sz="4" w:color="B8CCE4" w:space="0"/>
+              <w:left w:val="single" w:sz="4" w:color="B8CCE4" w:space="0"/>
+              <w:bottom w:val="single" w:sz="4" w:color="B8CCE4" w:space="0"/>
+              <w:right w:val="single" w:sz="4" w:color="B8CCE4" w:space="0"/>
+            </w:tcBorders>
+          </w:tcPr>
+          <w:p/>
+        </w:tc>
+        <w:tc>
+          <w:tcPr>
+            <w:tcW w:type="dxa" w:w="729"/>
+            <w:tcBorders>
+              <w:top w:val="single" w:sz="4" w:color="B8CCE4" w:space="0"/>
+              <w:left w:val="single" w:sz="4" w:color="B8CCE4" w:space="0"/>
+              <w:bottom w:val="single" w:sz="4" w:color="B8CCE4" w:space="0"/>
+              <w:right w:val="single" w:sz="4" w:color="B8CCE4" w:space="0"/>
+            </w:tcBorders>
+          </w:tcPr>
+          <w:p/>
+        </w:tc>
+        <w:tc>
+          <w:tcPr>
+            <w:tcW w:type="dxa" w:w="729"/>
+            <w:tcBorders>
+              <w:top w:val="single" w:sz="4" w:color="B8CCE4" w:space="0"/>
+              <w:left w:val="single" w:sz="4" w:color="B8CCE4" w:space="0"/>
+              <w:bottom w:val="single" w:sz="4" w:color="B8CCE4" w:space="0"/>
+              <w:right w:val="single" w:sz="4" w:color="B8CCE4" w:space="0"/>
+            </w:tcBorders>
+          </w:tcPr>
+          <w:p/>
+        </w:tc>
+        <w:tc>
+          <w:tcPr>
+            <w:tcW w:type="dxa" w:w="729"/>
+            <w:tcBorders>
+              <w:top w:val="single" w:sz="4" w:color="B8CCE4" w:space="0"/>
+              <w:left w:val="single" w:sz="4" w:color="B8CCE4" w:space="0"/>
+              <w:bottom w:val="single" w:sz="4" w:color="B8CCE4" w:space="0"/>
+              <w:right w:val="single" w:sz="4" w:color="B8CCE4" w:space="0"/>
+            </w:tcBorders>
+          </w:tcPr>
+          <w:p/>
+        </w:tc>
+        <w:tc>
+          <w:tcPr>
+            <w:tcW w:type="dxa" w:w="729"/>
+            <w:tcBorders>
+              <w:top w:val="single" w:sz="4" w:color="B8CCE4" w:space="0"/>
+              <w:left w:val="single" w:sz="4" w:color="B8CCE4" w:space="0"/>
+              <w:bottom w:val="single" w:sz="4" w:color="B8CCE4" w:space="0"/>
+              <w:right w:val="single" w:sz="4" w:color="B8CCE4" w:space="0"/>
+            </w:tcBorders>
+          </w:tcPr>
+          <w:p/>
+        </w:tc>
+        <w:tc>
+          <w:tcPr>
+            <w:tcW w:type="dxa" w:w="729"/>
+            <w:tcBorders>
+              <w:top w:val="single" w:sz="4" w:color="B8CCE4" w:space="0"/>
+              <w:left w:val="single" w:sz="4" w:color="B8CCE4" w:space="0"/>
+              <w:bottom w:val="single" w:sz="4" w:color="B8CCE4" w:space="0"/>
+              <w:right w:val="single" w:sz="4" w:color="B8CCE4" w:space="0"/>
+            </w:tcBorders>
+          </w:tcPr>
+          <w:p/>
+        </w:tc>
+        <w:tc>
+          <w:tcPr>
+            <w:tcW w:type="dxa" w:w="729"/>
+            <w:tcBorders>
+              <w:top w:val="single" w:sz="4" w:color="B8CCE4" w:space="0"/>
+              <w:left w:val="single" w:sz="4" w:color="B8CCE4" w:space="0"/>
+              <w:bottom w:val="single" w:sz="4" w:color="B8CCE4" w:space="0"/>
+              <w:right w:val="single" w:sz="4" w:color="B8CCE4" w:space="0"/>
+            </w:tcBorders>
+          </w:tcPr>
+          <w:p/>
+        </w:tc>
+        <w:tc>
+          <w:tcPr>
+            <w:tcW w:type="dxa" w:w="729"/>
+            <w:tcBorders>
+              <w:top w:val="single" w:sz="4" w:color="B8CCE4" w:space="0"/>
+              <w:left w:val="single" w:sz="4" w:color="B8CCE4" w:space="0"/>
+              <w:bottom w:val="single" w:sz="4" w:color="B8CCE4" w:space="0"/>
+              <w:right w:val="single" w:sz="4" w:color="B8CCE4" w:space="0"/>
+            </w:tcBorders>
+          </w:tcPr>
+          <w:p/>
+        </w:tc>
+      </w:tr>
+      <w:tr>
+        <w:trPr>
+          <w:trHeight w:val="180" w:hRule="atLeast"/>
+        </w:trPr>
+        <w:tc>
+          <w:tcPr>
+            <w:tcW w:type="dxa" w:w="729"/>
+            <w:tcBorders>
+              <w:top w:val="single" w:sz="4" w:color="B8CCE4" w:space="0"/>
+              <w:left w:val="single" w:sz="4" w:color="B8CCE4" w:space="0"/>
+              <w:bottom w:val="single" w:sz="4" w:color="B8CCE4" w:space="0"/>
+              <w:right w:val="single" w:sz="4" w:color="B8CCE4" w:space="0"/>
+            </w:tcBorders>
+          </w:tcPr>
+          <w:p/>
+        </w:tc>
+        <w:tc>
+          <w:tcPr>
+            <w:tcW w:type="dxa" w:w="1458"/>
+            <w:gridSpan w:val="2"/>
+            <w:tcBorders>
+              <w:top w:val="none" w:sz="0" w:color="FFFFFF" w:space="0"/>
+              <w:left w:val="none" w:sz="0" w:color="FFFFFF" w:space="0"/>
+              <w:bottom w:val="none" w:sz="0" w:color="FFFFFF" w:space="0"/>
+              <w:right w:val="none" w:sz="0" w:color="FFFFFF" w:space="0"/>
+            </w:tcBorders>
+          </w:tcPr>
+          <w:p/>
+          <w:p>
+            <w:pPr>
+              <w:spacing w:before="160" w:after="160"/>
+              <w:jc w:val="center"/>
+            </w:pPr>
+            <w:r>
+              <w:rPr>
+                <w:b/>
+                <w:sz w:val="24"/>
+                <w:u w:val="none"/>
+              </w:rPr>
+              <w:t>Fair Market Value of the Land &amp; Building: NRs. {{ fair_market_value }}</w:t>
+            </w:r>
+          </w:p>
+        </w:tc>
+        <w:tc>
+          <w:tcPr>
+            <w:tcW w:type="dxa" w:w="729"/>
+          </w:tcPr>
+          <w:p/>
+        </w:tc>
+        <w:tc>
+          <w:tcPr>
+            <w:tcW w:type="dxa" w:w="729"/>
+          </w:tcPr>
+          <w:p/>
+        </w:tc>
+        <w:tc>
+          <w:tcPr>
+            <w:tcW w:type="dxa" w:w="729"/>
+          </w:tcPr>
+          <w:p/>
+        </w:tc>
+        <w:tc>
+          <w:tcPr>
+            <w:tcW w:type="dxa" w:w="729"/>
+          </w:tcPr>
+          <w:p/>
+        </w:tc>
+        <w:tc>
+          <w:tcPr>
+            <w:tcW w:type="dxa" w:w="729"/>
+          </w:tcPr>
+          <w:p/>
+        </w:tc>
+        <w:tc>
+          <w:tcPr>
+            <w:tcW w:type="dxa" w:w="729"/>
+          </w:tcPr>
+          <w:p/>
+        </w:tc>
+        <w:tc>
+          <w:tcPr>
+            <w:tcW w:type="dxa" w:w="729"/>
+          </w:tcPr>
+          <w:p/>
+        </w:tc>
+        <w:tc>
+          <w:tcPr>
+            <w:tcW w:type="dxa" w:w="729"/>
+          </w:tcPr>
+          <w:p/>
+        </w:tc>
+        <w:tc>
+          <w:tcPr>
+            <w:tcW w:type="dxa" w:w="729"/>
+          </w:tcPr>
+          <w:p/>
+        </w:tc>
+        <w:tc>
+          <w:tcPr>
+            <w:tcW w:type="dxa" w:w="729"/>
+          </w:tcPr>
+          <w:p/>
+        </w:tc>
+        <w:tc>
+          <w:tcPr>
+            <w:tcW w:type="dxa" w:w="729"/>
+            <w:tcBorders>
+              <w:top w:val="single" w:sz="4" w:color="B8CCE4" w:space="0"/>
+              <w:left w:val="single" w:sz="4" w:color="B8CCE4" w:space="0"/>
+              <w:bottom w:val="single" w:sz="4" w:color="B8CCE4" w:space="0"/>
+              <w:right w:val="single" w:sz="4" w:color="B8CCE4" w:space="0"/>
+            </w:tcBorders>
+          </w:tcPr>
+          <w:p/>
+        </w:tc>
+      </w:tr>
+      <w:tr>
+        <w:trPr>
+          <w:trHeight w:val="95" w:hRule="exact"/>
+        </w:trPr>
+        <w:tc>
+          <w:tcPr>
+            <w:tcW w:type="dxa" w:w="729"/>
+            <w:tcBorders>
+              <w:top w:val="single" w:sz="4" w:color="B8CCE4" w:space="0"/>
+              <w:left w:val="single" w:sz="4" w:color="B8CCE4" w:space="0"/>
+              <w:bottom w:val="single" w:sz="4" w:color="B8CCE4" w:space="0"/>
+              <w:right w:val="single" w:sz="4" w:color="B8CCE4" w:space="0"/>
+            </w:tcBorders>
+          </w:tcPr>
+          <w:p/>
+        </w:tc>
+        <w:tc>
+          <w:tcPr>
+            <w:tcW w:type="dxa" w:w="729"/>
+            <w:tcBorders>
+              <w:top w:val="single" w:sz="4" w:color="B8CCE4" w:space="0"/>
+              <w:left w:val="single" w:sz="4" w:color="B8CCE4" w:space="0"/>
+              <w:bottom w:val="single" w:sz="4" w:color="B8CCE4" w:space="0"/>
+              <w:right w:val="single" w:sz="4" w:color="B8CCE4" w:space="0"/>
+            </w:tcBorders>
+          </w:tcPr>
+          <w:p/>
+        </w:tc>
+        <w:tc>
+          <w:tcPr>
+            <w:tcW w:type="dxa" w:w="729"/>
+            <w:tcBorders>
+              <w:top w:val="single" w:sz="4" w:color="B8CCE4" w:space="0"/>
+              <w:left w:val="single" w:sz="4" w:color="B8CCE4" w:space="0"/>
+              <w:bottom w:val="single" w:sz="4" w:color="B8CCE4" w:space="0"/>
+              <w:right w:val="single" w:sz="4" w:color="B8CCE4" w:space="0"/>
+            </w:tcBorders>
+          </w:tcPr>
+          <w:p/>
+        </w:tc>
+        <w:tc>
+          <w:tcPr>
+            <w:tcW w:type="dxa" w:w="729"/>
+            <w:tcBorders>
+              <w:top w:val="single" w:sz="4" w:color="B8CCE4" w:space="0"/>
+              <w:left w:val="single" w:sz="4" w:color="B8CCE4" w:space="0"/>
+              <w:bottom w:val="single" w:sz="4" w:color="B8CCE4" w:space="0"/>
+              <w:right w:val="single" w:sz="4" w:color="B8CCE4" w:space="0"/>
+            </w:tcBorders>
+          </w:tcPr>
+          <w:p/>
+        </w:tc>
+        <w:tc>
+          <w:tcPr>
+            <w:tcW w:type="dxa" w:w="729"/>
+            <w:tcBorders>
+              <w:top w:val="single" w:sz="4" w:color="B8CCE4" w:space="0"/>
+              <w:left w:val="single" w:sz="4" w:color="B8CCE4" w:space="0"/>
+              <w:bottom w:val="single" w:sz="4" w:color="B8CCE4" w:space="0"/>
+              <w:right w:val="single" w:sz="4" w:color="B8CCE4" w:space="0"/>
+            </w:tcBorders>
+          </w:tcPr>
+          <w:p/>
+        </w:tc>
+        <w:tc>
+          <w:tcPr>
+            <w:tcW w:type="dxa" w:w="729"/>
+            <w:tcBorders>
+              <w:top w:val="single" w:sz="4" w:color="B8CCE4" w:space="0"/>
+              <w:left w:val="single" w:sz="4" w:color="B8CCE4" w:space="0"/>
+              <w:bottom w:val="single" w:sz="4" w:color="B8CCE4" w:space="0"/>
+              <w:right w:val="single" w:sz="4" w:color="B8CCE4" w:space="0"/>
+            </w:tcBorders>
+          </w:tcPr>
+          <w:p/>
+        </w:tc>
+        <w:tc>
+          <w:tcPr>
+            <w:tcW w:type="dxa" w:w="729"/>
+            <w:tcBorders>
+              <w:top w:val="single" w:sz="4" w:color="B8CCE4" w:space="0"/>
+              <w:left w:val="single" w:sz="4" w:color="B8CCE4" w:space="0"/>
+              <w:bottom w:val="single" w:sz="4" w:color="B8CCE4" w:space="0"/>
+              <w:right w:val="single" w:sz="4" w:color="B8CCE4" w:space="0"/>
+            </w:tcBorders>
+          </w:tcPr>
+          <w:p/>
+        </w:tc>
+        <w:tc>
+          <w:tcPr>
+            <w:tcW w:type="dxa" w:w="729"/>
+            <w:tcBorders>
+              <w:top w:val="single" w:sz="4" w:color="B8CCE4" w:space="0"/>
+              <w:left w:val="single" w:sz="4" w:color="B8CCE4" w:space="0"/>
+              <w:bottom w:val="single" w:sz="4" w:color="B8CCE4" w:space="0"/>
+              <w:right w:val="single" w:sz="4" w:color="B8CCE4" w:space="0"/>
+            </w:tcBorders>
+          </w:tcPr>
+          <w:p/>
+        </w:tc>
+        <w:tc>
+          <w:tcPr>
+            <w:tcW w:type="dxa" w:w="729"/>
+            <w:tcBorders>
+              <w:top w:val="single" w:sz="4" w:color="B8CCE4" w:space="0"/>
+              <w:left w:val="single" w:sz="4" w:color="B8CCE4" w:space="0"/>
+              <w:bottom w:val="single" w:sz="4" w:color="B8CCE4" w:space="0"/>
+              <w:right w:val="single" w:sz="4" w:color="B8CCE4" w:space="0"/>
+            </w:tcBorders>
+          </w:tcPr>
+          <w:p/>
+        </w:tc>
+        <w:tc>
+          <w:tcPr>
+            <w:tcW w:type="dxa" w:w="729"/>
+            <w:tcBorders>
+              <w:top w:val="single" w:sz="4" w:color="B8CCE4" w:space="0"/>
+              <w:left w:val="single" w:sz="4" w:color="B8CCE4" w:space="0"/>
+              <w:bottom w:val="single" w:sz="4" w:color="B8CCE4" w:space="0"/>
+              <w:right w:val="single" w:sz="4" w:color="B8CCE4" w:space="0"/>
+            </w:tcBorders>
+          </w:tcPr>
+          <w:p/>
+        </w:tc>
+        <w:tc>
+          <w:tcPr>
+            <w:tcW w:type="dxa" w:w="729"/>
+            <w:tcBorders>
+              <w:top w:val="single" w:sz="4" w:color="B8CCE4" w:space="0"/>
+              <w:left w:val="single" w:sz="4" w:color="B8CCE4" w:space="0"/>
+              <w:bottom w:val="single" w:sz="4" w:color="B8CCE4" w:space="0"/>
+              <w:right w:val="single" w:sz="4" w:color="B8CCE4" w:space="0"/>
+            </w:tcBorders>
+          </w:tcPr>
+          <w:p/>
+        </w:tc>
+        <w:tc>
+          <w:tcPr>
+            <w:tcW w:type="dxa" w:w="729"/>
+            <w:tcBorders>
+              <w:top w:val="single" w:sz="4" w:color="B8CCE4" w:space="0"/>
+              <w:left w:val="single" w:sz="4" w:color="B8CCE4" w:space="0"/>
+              <w:bottom w:val="single" w:sz="4" w:color="B8CCE4" w:space="0"/>
+              <w:right w:val="single" w:sz="4" w:color="B8CCE4" w:space="0"/>
+            </w:tcBorders>
+          </w:tcPr>
+          <w:p/>
+        </w:tc>
+        <w:tc>
+          <w:tcPr>
+            <w:tcW w:type="dxa" w:w="729"/>
+            <w:tcBorders>
+              <w:top w:val="single" w:sz="4" w:color="B8CCE4" w:space="0"/>
+              <w:left w:val="single" w:sz="4" w:color="B8CCE4" w:space="0"/>
+              <w:bottom w:val="single" w:sz="4" w:color="B8CCE4" w:space="0"/>
+              <w:right w:val="single" w:sz="4" w:color="B8CCE4" w:space="0"/>
+            </w:tcBorders>
+          </w:tcPr>
+          <w:p/>
+        </w:tc>
+        <w:tc>
+          <w:tcPr>
+            <w:tcW w:type="dxa" w:w="729"/>
+            <w:tcBorders>
+              <w:top w:val="single" w:sz="4" w:color="B8CCE4" w:space="0"/>
+              <w:left w:val="single" w:sz="4" w:color="B8CCE4" w:space="0"/>
+              <w:bottom w:val="single" w:sz="4" w:color="B8CCE4" w:space="0"/>
+              <w:right w:val="single" w:sz="4" w:color="B8CCE4" w:space="0"/>
+            </w:tcBorders>
+          </w:tcPr>
+          <w:p/>
+        </w:tc>
+      </w:tr>
+      <w:tr>
+        <w:trPr>
+          <w:trHeight w:val="160" w:hRule="atLeast"/>
+        </w:trPr>
+        <w:tc>
+          <w:tcPr>
+            <w:tcW w:type="dxa" w:w="729"/>
+            <w:tcBorders>
+              <w:top w:val="single" w:sz="4" w:color="B8CCE4" w:space="0"/>
+              <w:left w:val="single" w:sz="4" w:color="B8CCE4" w:space="0"/>
+              <w:bottom w:val="single" w:sz="4" w:color="B8CCE4" w:space="0"/>
+              <w:right w:val="single" w:sz="4" w:color="B8CCE4" w:space="0"/>
+            </w:tcBorders>
+          </w:tcPr>
+          <w:p/>
+        </w:tc>
+        <w:tc>
+          <w:tcPr>
+            <w:tcW w:type="dxa" w:w="1458"/>
+            <w:gridSpan w:val="2"/>
+            <w:tcBorders>
+              <w:top w:val="none" w:sz="0" w:color="FFFFFF" w:space="0"/>
+              <w:left w:val="none" w:sz="0" w:color="FFFFFF" w:space="0"/>
+              <w:bottom w:val="none" w:sz="0" w:color="FFFFFF" w:space="0"/>
+              <w:right w:val="none" w:sz="0" w:color="FFFFFF" w:space="0"/>
+            </w:tcBorders>
+          </w:tcPr>
+          <w:p/>
+          <w:p>
+            <w:pPr>
+              <w:spacing w:before="160" w:after="160"/>
+              <w:jc w:val="center"/>
+            </w:pPr>
+            <w:r>
+              <w:rPr>
+                <w:b/>
+                <w:sz w:val="26"/>
+                <w:u w:val="single"/>
+              </w:rPr>
+              <w:t>Prepared by</w:t>
+            </w:r>
+          </w:p>
+        </w:tc>
+        <w:tc>
+          <w:tcPr>
+            <w:tcW w:type="dxa" w:w="729"/>
+          </w:tcPr>
+          <w:p/>
+        </w:tc>
+        <w:tc>
+          <w:tcPr>
+            <w:tcW w:type="dxa" w:w="729"/>
+          </w:tcPr>
+          <w:p/>
+        </w:tc>
+        <w:tc>
+          <w:tcPr>
+            <w:tcW w:type="dxa" w:w="729"/>
+          </w:tcPr>
+          <w:p/>
+        </w:tc>
+        <w:tc>
+          <w:tcPr>
+            <w:tcW w:type="dxa" w:w="729"/>
+          </w:tcPr>
+          <w:p/>
+        </w:tc>
+        <w:tc>
+          <w:tcPr>
+            <w:tcW w:type="dxa" w:w="729"/>
+          </w:tcPr>
+          <w:p/>
+        </w:tc>
+        <w:tc>
+          <w:tcPr>
+            <w:tcW w:type="dxa" w:w="729"/>
+          </w:tcPr>
+          <w:p/>
+        </w:tc>
+        <w:tc>
+          <w:tcPr>
+            <w:tcW w:type="dxa" w:w="729"/>
+          </w:tcPr>
+          <w:p/>
+        </w:tc>
+        <w:tc>
+          <w:tcPr>
+            <w:tcW w:type="dxa" w:w="729"/>
+          </w:tcPr>
+          <w:p/>
+        </w:tc>
+        <w:tc>
+          <w:tcPr>
+            <w:tcW w:type="dxa" w:w="729"/>
+          </w:tcPr>
+          <w:p/>
+        </w:tc>
+        <w:tc>
+          <w:tcPr>
+            <w:tcW w:type="dxa" w:w="729"/>
+          </w:tcPr>
+          <w:p/>
+        </w:tc>
+        <w:tc>
+          <w:tcPr>
+            <w:tcW w:type="dxa" w:w="729"/>
+            <w:tcBorders>
+              <w:top w:val="single" w:sz="4" w:color="B8CCE4" w:space="0"/>
+              <w:left w:val="single" w:sz="4" w:color="B8CCE4" w:space="0"/>
+              <w:bottom w:val="single" w:sz="4" w:color="B8CCE4" w:space="0"/>
+              <w:right w:val="single" w:sz="4" w:color="B8CCE4" w:space="0"/>
+            </w:tcBorders>
+          </w:tcPr>
+          <w:p/>
+        </w:tc>
+      </w:tr>
+      <w:tr>
+        <w:trPr>
+          <w:trHeight w:val="1500" w:hRule="atLeast"/>
+        </w:trPr>
+        <w:tc>
+          <w:tcPr>
+            <w:tcW w:type="dxa" w:w="729"/>
+            <w:tcBorders>
+              <w:top w:val="single" w:sz="4" w:color="B8CCE4" w:space="0"/>
+              <w:left w:val="single" w:sz="4" w:color="B8CCE4" w:space="0"/>
+              <w:bottom w:val="single" w:sz="4" w:color="B8CCE4" w:space="0"/>
+              <w:right w:val="single" w:sz="4" w:color="B8CCE4" w:space="0"/>
+            </w:tcBorders>
+          </w:tcPr>
+          <w:p/>
+        </w:tc>
+        <w:tc>
+          <w:tcPr>
+            <w:tcW w:type="dxa" w:w="1458"/>
+            <w:gridSpan w:val="2"/>
+            <w:tcBorders>
+              <w:top w:val="none" w:sz="0" w:color="FFFFFF" w:space="0"/>
+              <w:left w:val="none" w:sz="0" w:color="FFFFFF" w:space="0"/>
+              <w:bottom w:val="none" w:sz="0" w:color="FFFFFF" w:space="0"/>
+              <w:right w:val="none" w:sz="0" w:color="FFFFFF" w:space="0"/>
+            </w:tcBorders>
+          </w:tcPr>
+          <w:p/>
+          <w:p>
+            <w:pPr>
+              <w:spacing w:before="0" w:after="0"/>
+              <w:jc w:val="center"/>
+            </w:pPr>
+            <w:r>
+              <w:rPr>
+                <w:b w:val="0"/>
+                <w:sz w:val="22"/>
+                <w:u w:val="none"/>
+              </w:rPr>
+            </w:r>
+          </w:p>
+        </w:tc>
+        <w:tc>
+          <w:tcPr>
+            <w:tcW w:type="dxa" w:w="729"/>
+          </w:tcPr>
+          <w:p/>
+        </w:tc>
+        <w:tc>
+          <w:tcPr>
+            <w:tcW w:type="dxa" w:w="729"/>
+          </w:tcPr>
+          <w:p/>
+        </w:tc>
+        <w:tc>
+          <w:tcPr>
+            <w:tcW w:type="dxa" w:w="729"/>
+          </w:tcPr>
+          <w:p/>
+        </w:tc>
+        <w:tc>
+          <w:tcPr>
+            <w:tcW w:type="dxa" w:w="729"/>
+          </w:tcPr>
+          <w:p/>
+        </w:tc>
+        <w:tc>
+          <w:tcPr>
+            <w:tcW w:type="dxa" w:w="729"/>
+          </w:tcPr>
+          <w:p/>
+        </w:tc>
+        <w:tc>
+          <w:tcPr>
+            <w:tcW w:type="dxa" w:w="729"/>
+          </w:tcPr>
+          <w:p/>
+        </w:tc>
+        <w:tc>
+          <w:tcPr>
+            <w:tcW w:type="dxa" w:w="729"/>
+          </w:tcPr>
+          <w:p/>
+        </w:tc>
+        <w:tc>
+          <w:tcPr>
+            <w:tcW w:type="dxa" w:w="729"/>
+          </w:tcPr>
+          <w:p/>
+        </w:tc>
+        <w:tc>
+          <w:tcPr>
+            <w:tcW w:type="dxa" w:w="729"/>
+          </w:tcPr>
+          <w:p/>
+        </w:tc>
+        <w:tc>
+          <w:tcPr>
+            <w:tcW w:type="dxa" w:w="729"/>
+          </w:tcPr>
+          <w:p/>
+        </w:tc>
+        <w:tc>
+          <w:tcPr>
+            <w:tcW w:type="dxa" w:w="729"/>
+            <w:tcBorders>
+              <w:top w:val="single" w:sz="4" w:color="B8CCE4" w:space="0"/>
+              <w:left w:val="single" w:sz="4" w:color="B8CCE4" w:space="0"/>
+              <w:bottom w:val="single" w:sz="4" w:color="B8CCE4" w:space="0"/>
+              <w:right w:val="single" w:sz="4" w:color="B8CCE4" w:space="0"/>
+            </w:tcBorders>
+          </w:tcPr>
+          <w:p/>
+        </w:tc>
+      </w:tr>
+      <w:tr>
+        <w:trPr>
+          <w:trHeight w:val="95" w:hRule="exact"/>
+        </w:trPr>
+        <w:tc>
+          <w:tcPr>
+            <w:tcW w:type="dxa" w:w="729"/>
+            <w:tcBorders>
+              <w:top w:val="single" w:sz="4" w:color="B8CCE4" w:space="0"/>
+              <w:left w:val="single" w:sz="4" w:color="B8CCE4" w:space="0"/>
+              <w:bottom w:val="single" w:sz="4" w:color="B8CCE4" w:space="0"/>
+              <w:right w:val="single" w:sz="4" w:color="B8CCE4" w:space="0"/>
+            </w:tcBorders>
+          </w:tcPr>
+          <w:p/>
+        </w:tc>
+        <w:tc>
+          <w:tcPr>
+            <w:tcW w:type="dxa" w:w="729"/>
+            <w:tcBorders>
+              <w:top w:val="single" w:sz="4" w:color="B8CCE4" w:space="0"/>
+              <w:left w:val="single" w:sz="4" w:color="B8CCE4" w:space="0"/>
+              <w:bottom w:val="single" w:sz="4" w:color="B8CCE4" w:space="0"/>
+              <w:right w:val="single" w:sz="4" w:color="B8CCE4" w:space="0"/>
+            </w:tcBorders>
+          </w:tcPr>
+          <w:p/>
+        </w:tc>
+        <w:tc>
+          <w:tcPr>
+            <w:tcW w:type="dxa" w:w="729"/>
+            <w:tcBorders>
+              <w:top w:val="single" w:sz="4" w:color="B8CCE4" w:space="0"/>
+              <w:left w:val="single" w:sz="4" w:color="B8CCE4" w:space="0"/>
+              <w:bottom w:val="single" w:sz="4" w:color="B8CCE4" w:space="0"/>
+              <w:right w:val="single" w:sz="4" w:color="B8CCE4" w:space="0"/>
+            </w:tcBorders>
+          </w:tcPr>
+          <w:p/>
+        </w:tc>
+        <w:tc>
+          <w:tcPr>
+            <w:tcW w:type="dxa" w:w="729"/>
+            <w:tcBorders>
+              <w:top w:val="single" w:sz="4" w:color="B8CCE4" w:space="0"/>
+              <w:left w:val="single" w:sz="4" w:color="B8CCE4" w:space="0"/>
+              <w:bottom w:val="single" w:sz="4" w:color="B8CCE4" w:space="0"/>
+              <w:right w:val="single" w:sz="4" w:color="B8CCE4" w:space="0"/>
+            </w:tcBorders>
+          </w:tcPr>
+          <w:p/>
+        </w:tc>
+        <w:tc>
+          <w:tcPr>
+            <w:tcW w:type="dxa" w:w="729"/>
+            <w:tcBorders>
+              <w:top w:val="single" w:sz="4" w:color="B8CCE4" w:space="0"/>
+              <w:left w:val="single" w:sz="4" w:color="B8CCE4" w:space="0"/>
+              <w:bottom w:val="single" w:sz="4" w:color="B8CCE4" w:space="0"/>
+              <w:right w:val="single" w:sz="4" w:color="B8CCE4" w:space="0"/>
+            </w:tcBorders>
+          </w:tcPr>
+          <w:p/>
+        </w:tc>
+        <w:tc>
+          <w:tcPr>
+            <w:tcW w:type="dxa" w:w="729"/>
+            <w:tcBorders>
+              <w:top w:val="single" w:sz="4" w:color="B8CCE4" w:space="0"/>
+              <w:left w:val="single" w:sz="4" w:color="B8CCE4" w:space="0"/>
+              <w:bottom w:val="single" w:sz="4" w:color="B8CCE4" w:space="0"/>
+              <w:right w:val="single" w:sz="4" w:color="B8CCE4" w:space="0"/>
+            </w:tcBorders>
+          </w:tcPr>
+          <w:p/>
+        </w:tc>
+        <w:tc>
+          <w:tcPr>
+            <w:tcW w:type="dxa" w:w="729"/>
+            <w:tcBorders>
+              <w:top w:val="single" w:sz="4" w:color="B8CCE4" w:space="0"/>
+              <w:left w:val="single" w:sz="4" w:color="B8CCE4" w:space="0"/>
+              <w:bottom w:val="single" w:sz="4" w:color="B8CCE4" w:space="0"/>
+              <w:right w:val="single" w:sz="4" w:color="B8CCE4" w:space="0"/>
+            </w:tcBorders>
+          </w:tcPr>
+          <w:p/>
+        </w:tc>
+        <w:tc>
+          <w:tcPr>
+            <w:tcW w:type="dxa" w:w="729"/>
+            <w:tcBorders>
+              <w:top w:val="single" w:sz="4" w:color="B8CCE4" w:space="0"/>
+              <w:left w:val="single" w:sz="4" w:color="B8CCE4" w:space="0"/>
+              <w:bottom w:val="single" w:sz="4" w:color="B8CCE4" w:space="0"/>
+              <w:right w:val="single" w:sz="4" w:color="B8CCE4" w:space="0"/>
+            </w:tcBorders>
+          </w:tcPr>
+          <w:p/>
+        </w:tc>
+        <w:tc>
+          <w:tcPr>
+            <w:tcW w:type="dxa" w:w="729"/>
+            <w:tcBorders>
+              <w:top w:val="single" w:sz="4" w:color="B8CCE4" w:space="0"/>
+              <w:left w:val="single" w:sz="4" w:color="B8CCE4" w:space="0"/>
+              <w:bottom w:val="single" w:sz="4" w:color="B8CCE4" w:space="0"/>
+              <w:right w:val="single" w:sz="4" w:color="B8CCE4" w:space="0"/>
+            </w:tcBorders>
+          </w:tcPr>
+          <w:p/>
+        </w:tc>
+        <w:tc>
+          <w:tcPr>
+            <w:tcW w:type="dxa" w:w="729"/>
+            <w:tcBorders>
+              <w:top w:val="single" w:sz="4" w:color="B8CCE4" w:space="0"/>
+              <w:left w:val="single" w:sz="4" w:color="B8CCE4" w:space="0"/>
+              <w:bottom w:val="single" w:sz="4" w:color="B8CCE4" w:space="0"/>
+              <w:right w:val="single" w:sz="4" w:color="B8CCE4" w:space="0"/>
+            </w:tcBorders>
+          </w:tcPr>
+          <w:p/>
+        </w:tc>
+        <w:tc>
+          <w:tcPr>
+            <w:tcW w:type="dxa" w:w="729"/>
+            <w:tcBorders>
+              <w:top w:val="single" w:sz="4" w:color="B8CCE4" w:space="0"/>
+              <w:left w:val="single" w:sz="4" w:color="B8CCE4" w:space="0"/>
+              <w:bottom w:val="single" w:sz="4" w:color="B8CCE4" w:space="0"/>
+              <w:right w:val="single" w:sz="4" w:color="B8CCE4" w:space="0"/>
+            </w:tcBorders>
+          </w:tcPr>
+          <w:p/>
+        </w:tc>
+        <w:tc>
+          <w:tcPr>
+            <w:tcW w:type="dxa" w:w="729"/>
+            <w:tcBorders>
+              <w:top w:val="single" w:sz="4" w:color="B8CCE4" w:space="0"/>
+              <w:left w:val="single" w:sz="4" w:color="B8CCE4" w:space="0"/>
+              <w:bottom w:val="single" w:sz="4" w:color="B8CCE4" w:space="0"/>
+              <w:right w:val="single" w:sz="4" w:color="B8CCE4" w:space="0"/>
+            </w:tcBorders>
+          </w:tcPr>
+          <w:p/>
+        </w:tc>
+        <w:tc>
+          <w:tcPr>
+            <w:tcW w:type="dxa" w:w="729"/>
+            <w:tcBorders>
+              <w:top w:val="single" w:sz="4" w:color="B8CCE4" w:space="0"/>
+              <w:left w:val="single" w:sz="4" w:color="B8CCE4" w:space="0"/>
+              <w:bottom w:val="single" w:sz="4" w:color="B8CCE4" w:space="0"/>
+              <w:right w:val="single" w:sz="4" w:color="B8CCE4" w:space="0"/>
+            </w:tcBorders>
+          </w:tcPr>
+          <w:p/>
+        </w:tc>
+        <w:tc>
+          <w:tcPr>
+            <w:tcW w:type="dxa" w:w="729"/>
+            <w:tcBorders>
+              <w:top w:val="single" w:sz="4" w:color="B8CCE4" w:space="0"/>
+              <w:left w:val="single" w:sz="4" w:color="B8CCE4" w:space="0"/>
+              <w:bottom w:val="single" w:sz="4" w:color="B8CCE4" w:space="0"/>
+              <w:right w:val="single" w:sz="4" w:color="B8CCE4" w:space="0"/>
+            </w:tcBorders>
+          </w:tcPr>
+          <w:p/>
+        </w:tc>
+      </w:tr>
+      <w:tr>
+        <w:trPr>
+          <w:trHeight w:val="560" w:hRule="atLeast"/>
+        </w:trPr>
+        <w:tc>
+          <w:tcPr>
+            <w:tcW w:type="dxa" w:w="729"/>
+            <w:tcBorders>
+              <w:top w:val="single" w:sz="4" w:color="B8CCE4" w:space="0"/>
+              <w:left w:val="single" w:sz="4" w:color="B8CCE4" w:space="0"/>
+              <w:bottom w:val="single" w:sz="4" w:color="B8CCE4" w:space="0"/>
+              <w:right w:val="single" w:sz="4" w:color="B8CCE4" w:space="0"/>
+            </w:tcBorders>
+          </w:tcPr>
+          <w:p/>
+        </w:tc>
+        <w:tc>
+          <w:tcPr>
+            <w:tcW w:type="dxa" w:w="1458"/>
+            <w:gridSpan w:val="2"/>
+            <w:tcBorders>
+              <w:top w:val="none" w:sz="0" w:color="FFFFFF" w:space="0"/>
+              <w:left w:val="none" w:sz="0" w:color="FFFFFF" w:space="0"/>
+              <w:bottom w:val="none" w:sz="0" w:color="FFFFFF" w:space="0"/>
+              <w:right w:val="none" w:sz="0" w:color="FFFFFF" w:space="0"/>
+            </w:tcBorders>
+          </w:tcPr>
+          <w:p/>
+          <w:p>
+            <w:pPr>
+              <w:spacing w:before="160" w:after="40"/>
+              <w:jc w:val="center"/>
+            </w:pPr>
+            <w:r>
+              <w:rPr>
+                <w:b w:val="0"/>
+                <w:sz w:val="22"/>
+                <w:u w:val="none"/>
+              </w:rPr>
+              <w:t>{{ firm_name }}</w:t>
+            </w:r>
+          </w:p>
+          <w:p>
+            <w:pPr>
+              <w:spacing w:before="0" w:after="40"/>
+              <w:jc w:val="center"/>
+            </w:pPr>
+            <w:r>
+              <w:rPr>
+                <w:b w:val="0"/>
+                <w:sz w:val="22"/>
+                <w:u w:val="none"/>
+              </w:rPr>
+              <w:t>{{ firm_street }}</w:t>
+            </w:r>
+          </w:p>
+          <w:p>
+            <w:pPr>
+              <w:spacing w:before="0" w:after="40"/>
+              <w:jc w:val="center"/>
+            </w:pPr>
+            <w:r>
+              <w:rPr>
+                <w:b w:val="0"/>
+                <w:sz w:val="22"/>
+                <w:u w:val="none"/>
+              </w:rPr>
+              <w:t>{{ firm_city_country }}</w:t>
+            </w:r>
+          </w:p>
+          <w:p>
+            <w:pPr>
+              <w:spacing w:before="0" w:after="40"/>
+              <w:jc w:val="center"/>
+            </w:pPr>
+            <w:r>
+              <w:rPr>
+                <w:b w:val="0"/>
+                <w:sz w:val="22"/>
+                <w:u w:val="none"/>
+              </w:rPr>
+              <w:t>Tel: {{ firm_phone }}</w:t>
+            </w:r>
+          </w:p>
+          <w:p>
+            <w:pPr>
+              <w:spacing w:before="0" w:after="160"/>
+              <w:jc w:val="center"/>
+            </w:pPr>
+            <w:r>
+              <w:rPr>
+                <w:b w:val="0"/>
+                <w:sz w:val="22"/>
+                <w:u w:val="none"/>
+              </w:rPr>
+              <w:t>Email: {{ firm_email }}</w:t>
+            </w:r>
+          </w:p>
+        </w:tc>
+        <w:tc>
+          <w:tcPr>
+            <w:tcW w:type="dxa" w:w="729"/>
+          </w:tcPr>
+          <w:p/>
+        </w:tc>
+        <w:tc>
+          <w:tcPr>
+            <w:tcW w:type="dxa" w:w="729"/>
+          </w:tcPr>
+          <w:p/>
+        </w:tc>
+        <w:tc>
+          <w:tcPr>
+            <w:tcW w:type="dxa" w:w="729"/>
+          </w:tcPr>
+          <w:p/>
+        </w:tc>
+        <w:tc>
+          <w:tcPr>
+            <w:tcW w:type="dxa" w:w="729"/>
+          </w:tcPr>
+          <w:p/>
+        </w:tc>
+        <w:tc>
+          <w:tcPr>
+            <w:tcW w:type="dxa" w:w="729"/>
+          </w:tcPr>
+          <w:p/>
+        </w:tc>
+        <w:tc>
+          <w:tcPr>
+            <w:tcW w:type="dxa" w:w="729"/>
+          </w:tcPr>
+          <w:p/>
+        </w:tc>
+        <w:tc>
+          <w:tcPr>
+            <w:tcW w:type="dxa" w:w="729"/>
+          </w:tcPr>
+          <w:p/>
+        </w:tc>
+        <w:tc>
+          <w:tcPr>
+            <w:tcW w:type="dxa" w:w="729"/>
+          </w:tcPr>
+          <w:p/>
+        </w:tc>
+        <w:tc>
+          <w:tcPr>
+            <w:tcW w:type="dxa" w:w="729"/>
+          </w:tcPr>
+          <w:p/>
+        </w:tc>
+        <w:tc>
+          <w:tcPr>
+            <w:tcW w:type="dxa" w:w="729"/>
+          </w:tcPr>
+          <w:p/>
+        </w:tc>
+        <w:tc>
+          <w:tcPr>
+            <w:tcW w:type="dxa" w:w="729"/>
+            <w:tcBorders>
+              <w:top w:val="single" w:sz="4" w:color="B8CCE4" w:space="0"/>
+              <w:left w:val="single" w:sz="4" w:color="B8CCE4" w:space="0"/>
+              <w:bottom w:val="single" w:sz="4" w:color="B8CCE4" w:space="0"/>
+              <w:right w:val="single" w:sz="4" w:color="B8CCE4" w:space="0"/>
+            </w:tcBorders>
+          </w:tcPr>
+          <w:p/>
+        </w:tc>
+      </w:tr>
+      <w:tr>
+        <w:trPr>
+          <w:trHeight w:val="95" w:hRule="exact"/>
+        </w:trPr>
+        <w:tc>
+          <w:tcPr>
+            <w:tcW w:type="dxa" w:w="729"/>
+            <w:tcBorders>
+              <w:top w:val="single" w:sz="4" w:color="B8CCE4" w:space="0"/>
+              <w:left w:val="single" w:sz="4" w:color="B8CCE4" w:space="0"/>
+              <w:bottom w:val="single" w:sz="4" w:color="B8CCE4" w:space="0"/>
+              <w:right w:val="single" w:sz="4" w:color="B8CCE4" w:space="0"/>
+            </w:tcBorders>
+          </w:tcPr>
+          <w:p/>
+        </w:tc>
+        <w:tc>
+          <w:tcPr>
+            <w:tcW w:type="dxa" w:w="729"/>
+            <w:tcBorders>
+              <w:top w:val="single" w:sz="4" w:color="B8CCE4" w:space="0"/>
+              <w:left w:val="single" w:sz="4" w:color="B8CCE4" w:space="0"/>
+              <w:bottom w:val="single" w:sz="4" w:color="B8CCE4" w:space="0"/>
+              <w:right w:val="single" w:sz="4" w:color="B8CCE4" w:space="0"/>
+            </w:tcBorders>
+          </w:tcPr>
+          <w:p/>
+        </w:tc>
+        <w:tc>
+          <w:tcPr>
+            <w:tcW w:type="dxa" w:w="729"/>
+            <w:tcBorders>
+              <w:top w:val="single" w:sz="4" w:color="B8CCE4" w:space="0"/>
+              <w:left w:val="single" w:sz="4" w:color="B8CCE4" w:space="0"/>
+              <w:bottom w:val="single" w:sz="4" w:color="B8CCE4" w:space="0"/>
+              <w:right w:val="single" w:sz="4" w:color="B8CCE4" w:space="0"/>
+            </w:tcBorders>
+          </w:tcPr>
+          <w:p/>
+        </w:tc>
+        <w:tc>
+          <w:tcPr>
+            <w:tcW w:type="dxa" w:w="729"/>
+            <w:tcBorders>
+              <w:top w:val="single" w:sz="4" w:color="B8CCE4" w:space="0"/>
+              <w:left w:val="single" w:sz="4" w:color="B8CCE4" w:space="0"/>
+              <w:bottom w:val="single" w:sz="4" w:color="B8CCE4" w:space="0"/>
+              <w:right w:val="single" w:sz="4" w:color="B8CCE4" w:space="0"/>
+            </w:tcBorders>
+          </w:tcPr>
+          <w:p/>
+        </w:tc>
+        <w:tc>
+          <w:tcPr>
+            <w:tcW w:type="dxa" w:w="729"/>
+            <w:tcBorders>
+              <w:top w:val="single" w:sz="4" w:color="B8CCE4" w:space="0"/>
+              <w:left w:val="single" w:sz="4" w:color="B8CCE4" w:space="0"/>
+              <w:bottom w:val="single" w:sz="4" w:color="B8CCE4" w:space="0"/>
+              <w:right w:val="single" w:sz="4" w:color="B8CCE4" w:space="0"/>
+            </w:tcBorders>
+          </w:tcPr>
+          <w:p/>
+        </w:tc>
+        <w:tc>
+          <w:tcPr>
+            <w:tcW w:type="dxa" w:w="729"/>
+            <w:tcBorders>
+              <w:top w:val="single" w:sz="4" w:color="B8CCE4" w:space="0"/>
+              <w:left w:val="single" w:sz="4" w:color="B8CCE4" w:space="0"/>
+              <w:bottom w:val="single" w:sz="4" w:color="B8CCE4" w:space="0"/>
+              <w:right w:val="single" w:sz="4" w:color="B8CCE4" w:space="0"/>
+            </w:tcBorders>
+          </w:tcPr>
+          <w:p/>
+        </w:tc>
+        <w:tc>
+          <w:tcPr>
+            <w:tcW w:type="dxa" w:w="729"/>
+            <w:tcBorders>
+              <w:top w:val="single" w:sz="4" w:color="B8CCE4" w:space="0"/>
+              <w:left w:val="single" w:sz="4" w:color="B8CCE4" w:space="0"/>
+              <w:bottom w:val="single" w:sz="4" w:color="B8CCE4" w:space="0"/>
+              <w:right w:val="single" w:sz="4" w:color="B8CCE4" w:space="0"/>
+            </w:tcBorders>
+          </w:tcPr>
+          <w:p/>
+        </w:tc>
+        <w:tc>
+          <w:tcPr>
+            <w:tcW w:type="dxa" w:w="729"/>
+            <w:tcBorders>
+              <w:top w:val="single" w:sz="4" w:color="B8CCE4" w:space="0"/>
+              <w:left w:val="single" w:sz="4" w:color="B8CCE4" w:space="0"/>
+              <w:bottom w:val="single" w:sz="4" w:color="B8CCE4" w:space="0"/>
+              <w:right w:val="single" w:sz="4" w:color="B8CCE4" w:space="0"/>
+            </w:tcBorders>
+          </w:tcPr>
+          <w:p/>
+        </w:tc>
+        <w:tc>
+          <w:tcPr>
+            <w:tcW w:type="dxa" w:w="729"/>
+            <w:tcBorders>
+              <w:top w:val="single" w:sz="4" w:color="B8CCE4" w:space="0"/>
+              <w:left w:val="single" w:sz="4" w:color="B8CCE4" w:space="0"/>
+              <w:bottom w:val="single" w:sz="4" w:color="B8CCE4" w:space="0"/>
+              <w:right w:val="single" w:sz="4" w:color="B8CCE4" w:space="0"/>
+            </w:tcBorders>
+          </w:tcPr>
+          <w:p/>
+        </w:tc>
+        <w:tc>
+          <w:tcPr>
+            <w:tcW w:type="dxa" w:w="729"/>
+            <w:tcBorders>
+              <w:top w:val="single" w:sz="4" w:color="B8CCE4" w:space="0"/>
+              <w:left w:val="single" w:sz="4" w:color="B8CCE4" w:space="0"/>
+              <w:bottom w:val="single" w:sz="4" w:color="B8CCE4" w:space="0"/>
+              <w:right w:val="single" w:sz="4" w:color="B8CCE4" w:space="0"/>
+            </w:tcBorders>
+          </w:tcPr>
+          <w:p/>
+        </w:tc>
+        <w:tc>
+          <w:tcPr>
+            <w:tcW w:type="dxa" w:w="729"/>
+            <w:tcBorders>
+              <w:top w:val="single" w:sz="4" w:color="B8CCE4" w:space="0"/>
+              <w:left w:val="single" w:sz="4" w:color="B8CCE4" w:space="0"/>
+              <w:bottom w:val="single" w:sz="4" w:color="B8CCE4" w:space="0"/>
+              <w:right w:val="single" w:sz="4" w:color="B8CCE4" w:space="0"/>
+            </w:tcBorders>
+          </w:tcPr>
+          <w:p/>
+        </w:tc>
+        <w:tc>
+          <w:tcPr>
+            <w:tcW w:type="dxa" w:w="729"/>
+            <w:tcBorders>
+              <w:top w:val="single" w:sz="4" w:color="B8CCE4" w:space="0"/>
+              <w:left w:val="single" w:sz="4" w:color="B8CCE4" w:space="0"/>
+              <w:bottom w:val="single" w:sz="4" w:color="B8CCE4" w:space="0"/>
+              <w:right w:val="single" w:sz="4" w:color="B8CCE4" w:space="0"/>
+            </w:tcBorders>
+          </w:tcPr>
+          <w:p/>
+        </w:tc>
+        <w:tc>
+          <w:tcPr>
+            <w:tcW w:type="dxa" w:w="729"/>
+            <w:tcBorders>
+              <w:top w:val="single" w:sz="4" w:color="B8CCE4" w:space="0"/>
+              <w:left w:val="single" w:sz="4" w:color="B8CCE4" w:space="0"/>
+              <w:bottom w:val="single" w:sz="4" w:color="B8CCE4" w:space="0"/>
+              <w:right w:val="single" w:sz="4" w:color="B8CCE4" w:space="0"/>
+            </w:tcBorders>
+          </w:tcPr>
+          <w:p/>
+        </w:tc>
+        <w:tc>
+          <w:tcPr>
+            <w:tcW w:type="dxa" w:w="729"/>
+            <w:tcBorders>
+              <w:top w:val="single" w:sz="4" w:color="B8CCE4" w:space="0"/>
+              <w:left w:val="single" w:sz="4" w:color="B8CCE4" w:space="0"/>
+              <w:bottom w:val="single" w:sz="4" w:color="B8CCE4" w:space="0"/>
+              <w:right w:val="single" w:sz="4" w:color="B8CCE4" w:space="0"/>
+            </w:tcBorders>
+          </w:tcPr>
+          <w:p/>
+        </w:tc>
+      </w:tr>
+      <w:tr>
+        <w:trPr>
+          <w:trHeight w:val="95" w:hRule="exact"/>
+        </w:trPr>
+        <w:tc>
+          <w:tcPr>
+            <w:tcW w:type="dxa" w:w="729"/>
+            <w:tcBorders>
+              <w:top w:val="single" w:sz="4" w:color="B8CCE4" w:space="0"/>
+              <w:left w:val="single" w:sz="4" w:color="B8CCE4" w:space="0"/>
+              <w:bottom w:val="single" w:sz="4" w:color="B8CCE4" w:space="0"/>
+              <w:right w:val="single" w:sz="4" w:color="B8CCE4" w:space="0"/>
+            </w:tcBorders>
+          </w:tcPr>
+          <w:p/>
+        </w:tc>
+        <w:tc>
+          <w:tcPr>
+            <w:tcW w:type="dxa" w:w="729"/>
+            <w:tcBorders>
+              <w:top w:val="single" w:sz="4" w:color="B8CCE4" w:space="0"/>
+              <w:left w:val="single" w:sz="4" w:color="B8CCE4" w:space="0"/>
+              <w:bottom w:val="single" w:sz="4" w:color="B8CCE4" w:space="0"/>
+              <w:right w:val="single" w:sz="4" w:color="B8CCE4" w:space="0"/>
+            </w:tcBorders>
+          </w:tcPr>
+          <w:p/>
+        </w:tc>
+        <w:tc>
+          <w:tcPr>
+            <w:tcW w:type="dxa" w:w="729"/>
+            <w:tcBorders>
+              <w:top w:val="single" w:sz="4" w:color="B8CCE4" w:space="0"/>
+              <w:left w:val="single" w:sz="4" w:color="B8CCE4" w:space="0"/>
+              <w:bottom w:val="single" w:sz="4" w:color="B8CCE4" w:space="0"/>
+              <w:right w:val="single" w:sz="4" w:color="B8CCE4" w:space="0"/>
+            </w:tcBorders>
+          </w:tcPr>
+          <w:p/>
+        </w:tc>
+        <w:tc>
+          <w:tcPr>
+            <w:tcW w:type="dxa" w:w="729"/>
+            <w:tcBorders>
+              <w:top w:val="single" w:sz="4" w:color="B8CCE4" w:space="0"/>
+              <w:left w:val="single" w:sz="4" w:color="B8CCE4" w:space="0"/>
+              <w:bottom w:val="single" w:sz="4" w:color="B8CCE4" w:space="0"/>
+              <w:right w:val="single" w:sz="4" w:color="B8CCE4" w:space="0"/>
+            </w:tcBorders>
+          </w:tcPr>
+          <w:p/>
+        </w:tc>
+        <w:tc>
+          <w:tcPr>
+            <w:tcW w:type="dxa" w:w="729"/>
+            <w:tcBorders>
+              <w:top w:val="single" w:sz="4" w:color="B8CCE4" w:space="0"/>
+              <w:left w:val="single" w:sz="4" w:color="B8CCE4" w:space="0"/>
+              <w:bottom w:val="single" w:sz="4" w:color="B8CCE4" w:space="0"/>
+              <w:right w:val="single" w:sz="4" w:color="B8CCE4" w:space="0"/>
+            </w:tcBorders>
+          </w:tcPr>
+          <w:p/>
+        </w:tc>
+        <w:tc>
+          <w:tcPr>
+            <w:tcW w:type="dxa" w:w="729"/>
+            <w:tcBorders>
+              <w:top w:val="single" w:sz="4" w:color="B8CCE4" w:space="0"/>
+              <w:left w:val="single" w:sz="4" w:color="B8CCE4" w:space="0"/>
+              <w:bottom w:val="single" w:sz="4" w:color="B8CCE4" w:space="0"/>
+              <w:right w:val="single" w:sz="4" w:color="B8CCE4" w:space="0"/>
+            </w:tcBorders>
+          </w:tcPr>
+          <w:p/>
+        </w:tc>
+        <w:tc>
+          <w:tcPr>
+            <w:tcW w:type="dxa" w:w="729"/>
+            <w:tcBorders>
+              <w:top w:val="single" w:sz="4" w:color="B8CCE4" w:space="0"/>
+              <w:left w:val="single" w:sz="4" w:color="B8CCE4" w:space="0"/>
+              <w:bottom w:val="single" w:sz="4" w:color="B8CCE4" w:space="0"/>
+              <w:right w:val="single" w:sz="4" w:color="B8CCE4" w:space="0"/>
+            </w:tcBorders>
+          </w:tcPr>
+          <w:p/>
+        </w:tc>
+        <w:tc>
+          <w:tcPr>
+            <w:tcW w:type="dxa" w:w="729"/>
+            <w:tcBorders>
+              <w:top w:val="single" w:sz="4" w:color="B8CCE4" w:space="0"/>
+              <w:left w:val="single" w:sz="4" w:color="B8CCE4" w:space="0"/>
+              <w:bottom w:val="single" w:sz="4" w:color="B8CCE4" w:space="0"/>
+              <w:right w:val="single" w:sz="4" w:color="B8CCE4" w:space="0"/>
+            </w:tcBorders>
+          </w:tcPr>
+          <w:p/>
+        </w:tc>
+        <w:tc>
+          <w:tcPr>
+            <w:tcW w:type="dxa" w:w="729"/>
+            <w:tcBorders>
+              <w:top w:val="single" w:sz="4" w:color="B8CCE4" w:space="0"/>
+              <w:left w:val="single" w:sz="4" w:color="B8CCE4" w:space="0"/>
+              <w:bottom w:val="single" w:sz="4" w:color="B8CCE4" w:space="0"/>
+              <w:right w:val="single" w:sz="4" w:color="B8CCE4" w:space="0"/>
+            </w:tcBorders>
+          </w:tcPr>
+          <w:p/>
+        </w:tc>
+        <w:tc>
+          <w:tcPr>
+            <w:tcW w:type="dxa" w:w="729"/>
+            <w:tcBorders>
+              <w:top w:val="single" w:sz="4" w:color="B8CCE4" w:space="0"/>
+              <w:left w:val="single" w:sz="4" w:color="B8CCE4" w:space="0"/>
+              <w:bottom w:val="single" w:sz="4" w:color="B8CCE4" w:space="0"/>
+              <w:right w:val="single" w:sz="4" w:color="B8CCE4" w:space="0"/>
+            </w:tcBorders>
+          </w:tcPr>
+          <w:p/>
+        </w:tc>
+        <w:tc>
+          <w:tcPr>
+            <w:tcW w:type="dxa" w:w="729"/>
+            <w:tcBorders>
+              <w:top w:val="single" w:sz="4" w:color="B8CCE4" w:space="0"/>
+              <w:left w:val="single" w:sz="4" w:color="B8CCE4" w:space="0"/>
+              <w:bottom w:val="single" w:sz="4" w:color="B8CCE4" w:space="0"/>
+              <w:right w:val="single" w:sz="4" w:color="B8CCE4" w:space="0"/>
+            </w:tcBorders>
+          </w:tcPr>
+          <w:p/>
+        </w:tc>
+        <w:tc>
+          <w:tcPr>
+            <w:tcW w:type="dxa" w:w="729"/>
+            <w:tcBorders>
+              <w:top w:val="single" w:sz="4" w:color="B8CCE4" w:space="0"/>
+              <w:left w:val="single" w:sz="4" w:color="B8CCE4" w:space="0"/>
+              <w:bottom w:val="single" w:sz="4" w:color="B8CCE4" w:space="0"/>
+              <w:right w:val="single" w:sz="4" w:color="B8CCE4" w:space="0"/>
+            </w:tcBorders>
+          </w:tcPr>
+          <w:p/>
+        </w:tc>
+        <w:tc>
+          <w:tcPr>
+            <w:tcW w:type="dxa" w:w="729"/>
+            <w:tcBorders>
+              <w:top w:val="single" w:sz="4" w:color="B8CCE4" w:space="0"/>
+              <w:left w:val="single" w:sz="4" w:color="B8CCE4" w:space="0"/>
+              <w:bottom w:val="single" w:sz="4" w:color="B8CCE4" w:space="0"/>
+              <w:right w:val="single" w:sz="4" w:color="B8CCE4" w:space="0"/>
+            </w:tcBorders>
+          </w:tcPr>
+          <w:p/>
+        </w:tc>
+        <w:tc>
+          <w:tcPr>
+            <w:tcW w:type="dxa" w:w="729"/>
+            <w:tcBorders>
+              <w:top w:val="single" w:sz="4" w:color="B8CCE4" w:space="0"/>
+              <w:left w:val="single" w:sz="4" w:color="B8CCE4" w:space="0"/>
+              <w:bottom w:val="single" w:sz="4" w:color="B8CCE4" w:space="0"/>
+              <w:right w:val="single" w:sz="4" w:color="B8CCE4" w:space="0"/>
+            </w:tcBorders>
+          </w:tcPr>
+          <w:p/>
+        </w:tc>
+      </w:tr>
+    </w:tbl>
     <w:sectPr>
-      <w:pgSz w:w="12240" w:h="15840"/>
-      <w:pgMar w:top="1440" w:right="1728" w:bottom="1440" w:left="1728" w:header="720" w:footer="720" w:gutter="0"/>
+      <w:pgSz w:w="11906" w:h="16838"/>
+      <w:pgMar w:top="567" w:right="850" w:bottom="567" w:left="850" w:header="720" w:footer="720" w:gutter="0"/>
       <w:cols w:space="720"/>
       <w:docGrid w:linePitch="360"/>
     </w:sectPr>

</xml_diff>

<commit_message>
feat: add AddToAccountModal component for managing clients, owners, and properties
- Implemented AddToAccountModal component to handle the addition of clients, owners, and properties with a structured form.
- Introduced ClearInput and SelectInput components for better form handling.
- Added area calculation functionality with AreaCalculatorModal integration.
- Enhanced accountApi service with createClient, createOwner, and createProperty methods for API interactions.
</commit_message>
<xml_diff>
--- a/backend/templates/cover_template.docx
+++ b/backend/templates/cover_template.docx
@@ -2,3440 +2,417 @@
 <file path=word/document.xml><?xml version="1.0" encoding="utf-8"?>
 <w:document xmlns:wpc="http://schemas.microsoft.com/office/word/2010/wordprocessingCanvas" xmlns:mo="http://schemas.microsoft.com/office/mac/office/2008/main" xmlns:mc="http://schemas.openxmlformats.org/markup-compatibility/2006" xmlns:mv="urn:schemas-microsoft-com:mac:vml" xmlns:o="urn:schemas-microsoft-com:office:office" xmlns:r="http://schemas.openxmlformats.org/officeDocument/2006/relationships" xmlns:m="http://schemas.openxmlformats.org/officeDocument/2006/math" xmlns:v="urn:schemas-microsoft-com:vml" xmlns:wp14="http://schemas.microsoft.com/office/word/2010/wordprocessingDrawing" xmlns:wp="http://schemas.openxmlformats.org/drawingml/2006/wordprocessingDrawing" xmlns:w10="urn:schemas-microsoft-com:office:word" xmlns:w="http://schemas.openxmlformats.org/wordprocessingml/2006/main" xmlns:w14="http://schemas.microsoft.com/office/word/2010/wordml" xmlns:wpg="http://schemas.microsoft.com/office/word/2010/wordprocessingGroup" xmlns:wpi="http://schemas.microsoft.com/office/word/2010/wordprocessingInk" xmlns:wne="http://schemas.microsoft.com/office/word/2006/wordml" xmlns:wps="http://schemas.microsoft.com/office/word/2010/wordprocessingShape" mc:Ignorable="w14 wp14">
   <w:body>
-    <w:tbl>
-      <w:tblPr>
-        <w:tblStyle w:val="TableGrid"/>
-        <w:tblW w:type="auto" w:w="0"/>
-        <w:tblLook w:firstColumn="1" w:firstRow="1" w:lastColumn="0" w:lastRow="0" w:noHBand="0" w:noVBand="1" w:val="04A0"/>
-      </w:tblPr>
-      <w:tblGrid>
-        <w:gridCol w:w="729"/>
-        <w:gridCol w:w="729"/>
-        <w:gridCol w:w="729"/>
-        <w:gridCol w:w="729"/>
-        <w:gridCol w:w="729"/>
-        <w:gridCol w:w="729"/>
-        <w:gridCol w:w="729"/>
-        <w:gridCol w:w="729"/>
-        <w:gridCol w:w="729"/>
-        <w:gridCol w:w="729"/>
-        <w:gridCol w:w="729"/>
-        <w:gridCol w:w="729"/>
-        <w:gridCol w:w="729"/>
-        <w:gridCol w:w="729"/>
-      </w:tblGrid>
-      <w:tr>
-        <w:trPr>
-          <w:trHeight w:val="95" w:hRule="exact"/>
-        </w:trPr>
-        <w:tc>
-          <w:tcPr>
-            <w:tcW w:type="dxa" w:w="729"/>
-            <w:tcBorders>
-              <w:top w:val="single" w:sz="4" w:color="B8CCE4" w:space="0"/>
-              <w:left w:val="single" w:sz="4" w:color="B8CCE4" w:space="0"/>
-              <w:bottom w:val="single" w:sz="4" w:color="B8CCE4" w:space="0"/>
-              <w:right w:val="single" w:sz="4" w:color="B8CCE4" w:space="0"/>
-            </w:tcBorders>
-          </w:tcPr>
-          <w:p/>
-        </w:tc>
-        <w:tc>
-          <w:tcPr>
-            <w:tcW w:type="dxa" w:w="729"/>
-            <w:tcBorders>
-              <w:top w:val="single" w:sz="4" w:color="B8CCE4" w:space="0"/>
-              <w:left w:val="single" w:sz="4" w:color="B8CCE4" w:space="0"/>
-              <w:bottom w:val="single" w:sz="4" w:color="B8CCE4" w:space="0"/>
-              <w:right w:val="single" w:sz="4" w:color="B8CCE4" w:space="0"/>
-            </w:tcBorders>
-          </w:tcPr>
-          <w:p/>
-        </w:tc>
-        <w:tc>
-          <w:tcPr>
-            <w:tcW w:type="dxa" w:w="729"/>
-            <w:tcBorders>
-              <w:top w:val="single" w:sz="4" w:color="B8CCE4" w:space="0"/>
-              <w:left w:val="single" w:sz="4" w:color="B8CCE4" w:space="0"/>
-              <w:bottom w:val="single" w:sz="4" w:color="B8CCE4" w:space="0"/>
-              <w:right w:val="single" w:sz="4" w:color="B8CCE4" w:space="0"/>
-            </w:tcBorders>
-          </w:tcPr>
-          <w:p/>
-        </w:tc>
-        <w:tc>
-          <w:tcPr>
-            <w:tcW w:type="dxa" w:w="729"/>
-            <w:tcBorders>
-              <w:top w:val="single" w:sz="4" w:color="B8CCE4" w:space="0"/>
-              <w:left w:val="single" w:sz="4" w:color="B8CCE4" w:space="0"/>
-              <w:bottom w:val="single" w:sz="4" w:color="B8CCE4" w:space="0"/>
-              <w:right w:val="single" w:sz="4" w:color="B8CCE4" w:space="0"/>
-            </w:tcBorders>
-          </w:tcPr>
-          <w:p/>
-        </w:tc>
-        <w:tc>
-          <w:tcPr>
-            <w:tcW w:type="dxa" w:w="729"/>
-            <w:tcBorders>
-              <w:top w:val="single" w:sz="4" w:color="B8CCE4" w:space="0"/>
-              <w:left w:val="single" w:sz="4" w:color="B8CCE4" w:space="0"/>
-              <w:bottom w:val="single" w:sz="4" w:color="B8CCE4" w:space="0"/>
-              <w:right w:val="single" w:sz="4" w:color="B8CCE4" w:space="0"/>
-            </w:tcBorders>
-          </w:tcPr>
-          <w:p/>
-        </w:tc>
-        <w:tc>
-          <w:tcPr>
-            <w:tcW w:type="dxa" w:w="729"/>
-            <w:tcBorders>
-              <w:top w:val="single" w:sz="4" w:color="B8CCE4" w:space="0"/>
-              <w:left w:val="single" w:sz="4" w:color="B8CCE4" w:space="0"/>
-              <w:bottom w:val="single" w:sz="4" w:color="B8CCE4" w:space="0"/>
-              <w:right w:val="single" w:sz="4" w:color="B8CCE4" w:space="0"/>
-            </w:tcBorders>
-          </w:tcPr>
-          <w:p/>
-        </w:tc>
-        <w:tc>
-          <w:tcPr>
-            <w:tcW w:type="dxa" w:w="729"/>
-            <w:tcBorders>
-              <w:top w:val="single" w:sz="4" w:color="B8CCE4" w:space="0"/>
-              <w:left w:val="single" w:sz="4" w:color="B8CCE4" w:space="0"/>
-              <w:bottom w:val="single" w:sz="4" w:color="B8CCE4" w:space="0"/>
-              <w:right w:val="single" w:sz="4" w:color="B8CCE4" w:space="0"/>
-            </w:tcBorders>
-          </w:tcPr>
-          <w:p/>
-        </w:tc>
-        <w:tc>
-          <w:tcPr>
-            <w:tcW w:type="dxa" w:w="729"/>
-            <w:tcBorders>
-              <w:top w:val="single" w:sz="4" w:color="B8CCE4" w:space="0"/>
-              <w:left w:val="single" w:sz="4" w:color="B8CCE4" w:space="0"/>
-              <w:bottom w:val="single" w:sz="4" w:color="B8CCE4" w:space="0"/>
-              <w:right w:val="single" w:sz="4" w:color="B8CCE4" w:space="0"/>
-            </w:tcBorders>
-          </w:tcPr>
-          <w:p/>
-        </w:tc>
-        <w:tc>
-          <w:tcPr>
-            <w:tcW w:type="dxa" w:w="729"/>
-            <w:tcBorders>
-              <w:top w:val="single" w:sz="4" w:color="B8CCE4" w:space="0"/>
-              <w:left w:val="single" w:sz="4" w:color="B8CCE4" w:space="0"/>
-              <w:bottom w:val="single" w:sz="4" w:color="B8CCE4" w:space="0"/>
-              <w:right w:val="single" w:sz="4" w:color="B8CCE4" w:space="0"/>
-            </w:tcBorders>
-          </w:tcPr>
-          <w:p/>
-        </w:tc>
-        <w:tc>
-          <w:tcPr>
-            <w:tcW w:type="dxa" w:w="729"/>
-            <w:tcBorders>
-              <w:top w:val="single" w:sz="4" w:color="B8CCE4" w:space="0"/>
-              <w:left w:val="single" w:sz="4" w:color="B8CCE4" w:space="0"/>
-              <w:bottom w:val="single" w:sz="4" w:color="B8CCE4" w:space="0"/>
-              <w:right w:val="single" w:sz="4" w:color="B8CCE4" w:space="0"/>
-            </w:tcBorders>
-          </w:tcPr>
-          <w:p/>
-        </w:tc>
-        <w:tc>
-          <w:tcPr>
-            <w:tcW w:type="dxa" w:w="729"/>
-            <w:tcBorders>
-              <w:top w:val="single" w:sz="4" w:color="B8CCE4" w:space="0"/>
-              <w:left w:val="single" w:sz="4" w:color="B8CCE4" w:space="0"/>
-              <w:bottom w:val="single" w:sz="4" w:color="B8CCE4" w:space="0"/>
-              <w:right w:val="single" w:sz="4" w:color="B8CCE4" w:space="0"/>
-            </w:tcBorders>
-          </w:tcPr>
-          <w:p/>
-        </w:tc>
-        <w:tc>
-          <w:tcPr>
-            <w:tcW w:type="dxa" w:w="729"/>
-            <w:tcBorders>
-              <w:top w:val="single" w:sz="4" w:color="B8CCE4" w:space="0"/>
-              <w:left w:val="single" w:sz="4" w:color="B8CCE4" w:space="0"/>
-              <w:bottom w:val="single" w:sz="4" w:color="B8CCE4" w:space="0"/>
-              <w:right w:val="single" w:sz="4" w:color="B8CCE4" w:space="0"/>
-            </w:tcBorders>
-          </w:tcPr>
-          <w:p/>
-        </w:tc>
-        <w:tc>
-          <w:tcPr>
-            <w:tcW w:type="dxa" w:w="729"/>
-            <w:tcBorders>
-              <w:top w:val="single" w:sz="4" w:color="B8CCE4" w:space="0"/>
-              <w:left w:val="single" w:sz="4" w:color="B8CCE4" w:space="0"/>
-              <w:bottom w:val="single" w:sz="4" w:color="B8CCE4" w:space="0"/>
-              <w:right w:val="single" w:sz="4" w:color="B8CCE4" w:space="0"/>
-            </w:tcBorders>
-          </w:tcPr>
-          <w:p/>
-        </w:tc>
-        <w:tc>
-          <w:tcPr>
-            <w:tcW w:type="dxa" w:w="729"/>
-            <w:tcBorders>
-              <w:top w:val="single" w:sz="4" w:color="B8CCE4" w:space="0"/>
-              <w:left w:val="single" w:sz="4" w:color="B8CCE4" w:space="0"/>
-              <w:bottom w:val="single" w:sz="4" w:color="B8CCE4" w:space="0"/>
-              <w:right w:val="single" w:sz="4" w:color="B8CCE4" w:space="0"/>
-            </w:tcBorders>
-          </w:tcPr>
-          <w:p/>
-        </w:tc>
-      </w:tr>
-      <w:tr>
-        <w:trPr>
-          <w:trHeight w:val="400" w:hRule="atLeast"/>
-        </w:trPr>
-        <w:tc>
-          <w:tcPr>
-            <w:tcW w:type="dxa" w:w="729"/>
-            <w:tcBorders>
-              <w:top w:val="single" w:sz="4" w:color="B8CCE4" w:space="0"/>
-              <w:left w:val="single" w:sz="4" w:color="B8CCE4" w:space="0"/>
-              <w:bottom w:val="single" w:sz="4" w:color="B8CCE4" w:space="0"/>
-              <w:right w:val="single" w:sz="4" w:color="B8CCE4" w:space="0"/>
-            </w:tcBorders>
-          </w:tcPr>
-          <w:p/>
-        </w:tc>
-        <w:tc>
-          <w:tcPr>
-            <w:tcW w:type="dxa" w:w="1458"/>
-            <w:gridSpan w:val="2"/>
-            <w:tcBorders>
-              <w:top w:val="none" w:sz="0" w:color="FFFFFF" w:space="0"/>
-              <w:left w:val="none" w:sz="0" w:color="FFFFFF" w:space="0"/>
-              <w:bottom w:val="none" w:sz="0" w:color="FFFFFF" w:space="0"/>
-              <w:right w:val="none" w:sz="0" w:color="FFFFFF" w:space="0"/>
-            </w:tcBorders>
-          </w:tcPr>
-          <w:p/>
-          <w:p>
-            <w:pPr>
-              <w:spacing w:before="200" w:after="40"/>
-              <w:jc w:val="center"/>
-            </w:pPr>
-            <w:r>
-              <w:rPr>
-                <w:b/>
-                <w:sz w:val="36"/>
-                <w:u w:val="none"/>
-              </w:rPr>
-              <w:t>Property Valuation Report</w:t>
-            </w:r>
-          </w:p>
-          <w:p>
-            <w:pPr>
-              <w:spacing w:before="0" w:after="200"/>
-              <w:jc w:val="center"/>
-            </w:pPr>
-            <w:r>
-              <w:rPr>
-                <w:b/>
-                <w:sz w:val="30"/>
-                <w:u w:val="none"/>
-              </w:rPr>
-              <w:t>({{ property_mortgaged }})</w:t>
-            </w:r>
-          </w:p>
-        </w:tc>
-        <w:tc>
-          <w:tcPr>
-            <w:tcW w:type="dxa" w:w="729"/>
-          </w:tcPr>
-          <w:p/>
-        </w:tc>
-        <w:tc>
-          <w:tcPr>
-            <w:tcW w:type="dxa" w:w="729"/>
-          </w:tcPr>
-          <w:p/>
-        </w:tc>
-        <w:tc>
-          <w:tcPr>
-            <w:tcW w:type="dxa" w:w="729"/>
-          </w:tcPr>
-          <w:p/>
-        </w:tc>
-        <w:tc>
-          <w:tcPr>
-            <w:tcW w:type="dxa" w:w="729"/>
-          </w:tcPr>
-          <w:p/>
-        </w:tc>
-        <w:tc>
-          <w:tcPr>
-            <w:tcW w:type="dxa" w:w="729"/>
-          </w:tcPr>
-          <w:p/>
-        </w:tc>
-        <w:tc>
-          <w:tcPr>
-            <w:tcW w:type="dxa" w:w="729"/>
-          </w:tcPr>
-          <w:p/>
-        </w:tc>
-        <w:tc>
-          <w:tcPr>
-            <w:tcW w:type="dxa" w:w="729"/>
-          </w:tcPr>
-          <w:p/>
-        </w:tc>
-        <w:tc>
-          <w:tcPr>
-            <w:tcW w:type="dxa" w:w="729"/>
-          </w:tcPr>
-          <w:p/>
-        </w:tc>
-        <w:tc>
-          <w:tcPr>
-            <w:tcW w:type="dxa" w:w="729"/>
-          </w:tcPr>
-          <w:p/>
-        </w:tc>
-        <w:tc>
-          <w:tcPr>
-            <w:tcW w:type="dxa" w:w="729"/>
-          </w:tcPr>
-          <w:p/>
-        </w:tc>
-        <w:tc>
-          <w:tcPr>
-            <w:tcW w:type="dxa" w:w="729"/>
-            <w:tcBorders>
-              <w:top w:val="single" w:sz="4" w:color="B8CCE4" w:space="0"/>
-              <w:left w:val="single" w:sz="4" w:color="B8CCE4" w:space="0"/>
-              <w:bottom w:val="single" w:sz="4" w:color="B8CCE4" w:space="0"/>
-              <w:right w:val="single" w:sz="4" w:color="B8CCE4" w:space="0"/>
-            </w:tcBorders>
-          </w:tcPr>
-          <w:p/>
-        </w:tc>
-      </w:tr>
-      <w:tr>
-        <w:trPr>
-          <w:trHeight w:val="95" w:hRule="exact"/>
-        </w:trPr>
-        <w:tc>
-          <w:tcPr>
-            <w:tcW w:type="dxa" w:w="729"/>
-            <w:tcBorders>
-              <w:top w:val="single" w:sz="4" w:color="B8CCE4" w:space="0"/>
-              <w:left w:val="single" w:sz="4" w:color="B8CCE4" w:space="0"/>
-              <w:bottom w:val="single" w:sz="4" w:color="B8CCE4" w:space="0"/>
-              <w:right w:val="single" w:sz="4" w:color="B8CCE4" w:space="0"/>
-            </w:tcBorders>
-          </w:tcPr>
-          <w:p/>
-        </w:tc>
-        <w:tc>
-          <w:tcPr>
-            <w:tcW w:type="dxa" w:w="729"/>
-            <w:tcBorders>
-              <w:top w:val="single" w:sz="4" w:color="B8CCE4" w:space="0"/>
-              <w:left w:val="single" w:sz="4" w:color="B8CCE4" w:space="0"/>
-              <w:bottom w:val="single" w:sz="4" w:color="B8CCE4" w:space="0"/>
-              <w:right w:val="single" w:sz="4" w:color="B8CCE4" w:space="0"/>
-            </w:tcBorders>
-          </w:tcPr>
-          <w:p/>
-        </w:tc>
-        <w:tc>
-          <w:tcPr>
-            <w:tcW w:type="dxa" w:w="729"/>
-            <w:tcBorders>
-              <w:top w:val="single" w:sz="4" w:color="B8CCE4" w:space="0"/>
-              <w:left w:val="single" w:sz="4" w:color="B8CCE4" w:space="0"/>
-              <w:bottom w:val="single" w:sz="4" w:color="B8CCE4" w:space="0"/>
-              <w:right w:val="single" w:sz="4" w:color="B8CCE4" w:space="0"/>
-            </w:tcBorders>
-          </w:tcPr>
-          <w:p/>
-        </w:tc>
-        <w:tc>
-          <w:tcPr>
-            <w:tcW w:type="dxa" w:w="729"/>
-            <w:tcBorders>
-              <w:top w:val="single" w:sz="4" w:color="B8CCE4" w:space="0"/>
-              <w:left w:val="single" w:sz="4" w:color="B8CCE4" w:space="0"/>
-              <w:bottom w:val="single" w:sz="4" w:color="B8CCE4" w:space="0"/>
-              <w:right w:val="single" w:sz="4" w:color="B8CCE4" w:space="0"/>
-            </w:tcBorders>
-          </w:tcPr>
-          <w:p/>
-        </w:tc>
-        <w:tc>
-          <w:tcPr>
-            <w:tcW w:type="dxa" w:w="729"/>
-            <w:tcBorders>
-              <w:top w:val="single" w:sz="4" w:color="B8CCE4" w:space="0"/>
-              <w:left w:val="single" w:sz="4" w:color="B8CCE4" w:space="0"/>
-              <w:bottom w:val="single" w:sz="4" w:color="B8CCE4" w:space="0"/>
-              <w:right w:val="single" w:sz="4" w:color="B8CCE4" w:space="0"/>
-            </w:tcBorders>
-          </w:tcPr>
-          <w:p/>
-        </w:tc>
-        <w:tc>
-          <w:tcPr>
-            <w:tcW w:type="dxa" w:w="729"/>
-            <w:tcBorders>
-              <w:top w:val="single" w:sz="4" w:color="B8CCE4" w:space="0"/>
-              <w:left w:val="single" w:sz="4" w:color="B8CCE4" w:space="0"/>
-              <w:bottom w:val="single" w:sz="4" w:color="B8CCE4" w:space="0"/>
-              <w:right w:val="single" w:sz="4" w:color="B8CCE4" w:space="0"/>
-            </w:tcBorders>
-          </w:tcPr>
-          <w:p/>
-        </w:tc>
-        <w:tc>
-          <w:tcPr>
-            <w:tcW w:type="dxa" w:w="729"/>
-            <w:tcBorders>
-              <w:top w:val="single" w:sz="4" w:color="B8CCE4" w:space="0"/>
-              <w:left w:val="single" w:sz="4" w:color="B8CCE4" w:space="0"/>
-              <w:bottom w:val="single" w:sz="4" w:color="B8CCE4" w:space="0"/>
-              <w:right w:val="single" w:sz="4" w:color="B8CCE4" w:space="0"/>
-            </w:tcBorders>
-          </w:tcPr>
-          <w:p/>
-        </w:tc>
-        <w:tc>
-          <w:tcPr>
-            <w:tcW w:type="dxa" w:w="729"/>
-            <w:tcBorders>
-              <w:top w:val="single" w:sz="4" w:color="B8CCE4" w:space="0"/>
-              <w:left w:val="single" w:sz="4" w:color="B8CCE4" w:space="0"/>
-              <w:bottom w:val="single" w:sz="4" w:color="B8CCE4" w:space="0"/>
-              <w:right w:val="single" w:sz="4" w:color="B8CCE4" w:space="0"/>
-            </w:tcBorders>
-          </w:tcPr>
-          <w:p/>
-        </w:tc>
-        <w:tc>
-          <w:tcPr>
-            <w:tcW w:type="dxa" w:w="729"/>
-            <w:tcBorders>
-              <w:top w:val="single" w:sz="4" w:color="B8CCE4" w:space="0"/>
-              <w:left w:val="single" w:sz="4" w:color="B8CCE4" w:space="0"/>
-              <w:bottom w:val="single" w:sz="4" w:color="B8CCE4" w:space="0"/>
-              <w:right w:val="single" w:sz="4" w:color="B8CCE4" w:space="0"/>
-            </w:tcBorders>
-          </w:tcPr>
-          <w:p/>
-        </w:tc>
-        <w:tc>
-          <w:tcPr>
-            <w:tcW w:type="dxa" w:w="729"/>
-            <w:tcBorders>
-              <w:top w:val="single" w:sz="4" w:color="B8CCE4" w:space="0"/>
-              <w:left w:val="single" w:sz="4" w:color="B8CCE4" w:space="0"/>
-              <w:bottom w:val="single" w:sz="4" w:color="B8CCE4" w:space="0"/>
-              <w:right w:val="single" w:sz="4" w:color="B8CCE4" w:space="0"/>
-            </w:tcBorders>
-          </w:tcPr>
-          <w:p/>
-        </w:tc>
-        <w:tc>
-          <w:tcPr>
-            <w:tcW w:type="dxa" w:w="729"/>
-            <w:tcBorders>
-              <w:top w:val="single" w:sz="4" w:color="B8CCE4" w:space="0"/>
-              <w:left w:val="single" w:sz="4" w:color="B8CCE4" w:space="0"/>
-              <w:bottom w:val="single" w:sz="4" w:color="B8CCE4" w:space="0"/>
-              <w:right w:val="single" w:sz="4" w:color="B8CCE4" w:space="0"/>
-            </w:tcBorders>
-          </w:tcPr>
-          <w:p/>
-        </w:tc>
-        <w:tc>
-          <w:tcPr>
-            <w:tcW w:type="dxa" w:w="729"/>
-            <w:tcBorders>
-              <w:top w:val="single" w:sz="4" w:color="B8CCE4" w:space="0"/>
-              <w:left w:val="single" w:sz="4" w:color="B8CCE4" w:space="0"/>
-              <w:bottom w:val="single" w:sz="4" w:color="B8CCE4" w:space="0"/>
-              <w:right w:val="single" w:sz="4" w:color="B8CCE4" w:space="0"/>
-            </w:tcBorders>
-          </w:tcPr>
-          <w:p/>
-        </w:tc>
-        <w:tc>
-          <w:tcPr>
-            <w:tcW w:type="dxa" w:w="729"/>
-            <w:tcBorders>
-              <w:top w:val="single" w:sz="4" w:color="B8CCE4" w:space="0"/>
-              <w:left w:val="single" w:sz="4" w:color="B8CCE4" w:space="0"/>
-              <w:bottom w:val="single" w:sz="4" w:color="B8CCE4" w:space="0"/>
-              <w:right w:val="single" w:sz="4" w:color="B8CCE4" w:space="0"/>
-            </w:tcBorders>
-          </w:tcPr>
-          <w:p/>
-        </w:tc>
-        <w:tc>
-          <w:tcPr>
-            <w:tcW w:type="dxa" w:w="729"/>
-            <w:tcBorders>
-              <w:top w:val="single" w:sz="4" w:color="B8CCE4" w:space="0"/>
-              <w:left w:val="single" w:sz="4" w:color="B8CCE4" w:space="0"/>
-              <w:bottom w:val="single" w:sz="4" w:color="B8CCE4" w:space="0"/>
-              <w:right w:val="single" w:sz="4" w:color="B8CCE4" w:space="0"/>
-            </w:tcBorders>
-          </w:tcPr>
-          <w:p/>
-        </w:tc>
-      </w:tr>
-      <w:tr>
-        <w:trPr>
-          <w:trHeight w:val="460" w:hRule="atLeast"/>
-        </w:trPr>
-        <w:tc>
-          <w:tcPr>
-            <w:tcW w:type="dxa" w:w="729"/>
-            <w:tcBorders>
-              <w:top w:val="single" w:sz="4" w:color="B8CCE4" w:space="0"/>
-              <w:left w:val="single" w:sz="4" w:color="B8CCE4" w:space="0"/>
-              <w:bottom w:val="single" w:sz="4" w:color="B8CCE4" w:space="0"/>
-              <w:right w:val="single" w:sz="4" w:color="B8CCE4" w:space="0"/>
-            </w:tcBorders>
-          </w:tcPr>
-          <w:p/>
-        </w:tc>
-        <w:tc>
-          <w:tcPr>
-            <w:tcW w:type="dxa" w:w="1458"/>
-            <w:gridSpan w:val="2"/>
-            <w:tcBorders>
-              <w:top w:val="none" w:sz="0" w:color="FFFFFF" w:space="0"/>
-              <w:left w:val="none" w:sz="0" w:color="FFFFFF" w:space="0"/>
-              <w:bottom w:val="none" w:sz="0" w:color="FFFFFF" w:space="0"/>
-              <w:right w:val="none" w:sz="0" w:color="FFFFFF" w:space="0"/>
-            </w:tcBorders>
-          </w:tcPr>
-          <w:p/>
-          <w:p>
-            <w:pPr>
-              <w:spacing w:before="160" w:after="80"/>
-              <w:jc w:val="center"/>
-            </w:pPr>
-            <w:r>
-              <w:rPr>
-                <w:b/>
-                <w:sz w:val="26"/>
-                <w:u w:val="single"/>
-              </w:rPr>
-              <w:t>Client</w:t>
-            </w:r>
-          </w:p>
-          <w:p>
-            <w:pPr>
-              <w:spacing w:before="0" w:after="80"/>
-              <w:jc w:val="center"/>
-            </w:pPr>
-            <w:r>
-              <w:rPr>
-                <w:b/>
-                <w:sz w:val="26"/>
-                <w:u w:val="none"/>
-              </w:rPr>
-              <w:t>{{ client_full_name }}</w:t>
-            </w:r>
-          </w:p>
-          <w:p>
-            <w:pPr>
-              <w:spacing w:before="0" w:after="40"/>
-              <w:jc w:val="center"/>
-            </w:pPr>
-            <w:r>
-              <w:rPr>
-                <w:b w:val="0"/>
-                <w:sz w:val="22"/>
-                <w:u w:val="none"/>
-              </w:rPr>
-              <w:t>{{ client_vdc_ward }}</w:t>
-            </w:r>
-          </w:p>
-          <w:p>
-            <w:pPr>
-              <w:spacing w:before="0" w:after="40"/>
-              <w:jc w:val="center"/>
-            </w:pPr>
-            <w:r>
-              <w:rPr>
-                <w:b w:val="0"/>
-                <w:sz w:val="22"/>
-                <w:u w:val="none"/>
-              </w:rPr>
-              <w:t>{{ client_district_country }}</w:t>
-            </w:r>
-          </w:p>
-          <w:p>
-            <w:pPr>
-              <w:spacing w:before="0" w:after="160"/>
-              <w:jc w:val="center"/>
-            </w:pPr>
-            <w:r>
-              <w:rPr>
-                <w:b w:val="0"/>
-                <w:sz w:val="22"/>
-                <w:u w:val="none"/>
-              </w:rPr>
-              <w:t>Contact No: {{ client_phone }}</w:t>
-            </w:r>
-          </w:p>
-        </w:tc>
-        <w:tc>
-          <w:tcPr>
-            <w:tcW w:type="dxa" w:w="729"/>
-          </w:tcPr>
-          <w:p/>
-        </w:tc>
-        <w:tc>
-          <w:tcPr>
-            <w:tcW w:type="dxa" w:w="729"/>
-          </w:tcPr>
-          <w:p/>
-        </w:tc>
-        <w:tc>
-          <w:tcPr>
-            <w:tcW w:type="dxa" w:w="729"/>
-          </w:tcPr>
-          <w:p/>
-        </w:tc>
-        <w:tc>
-          <w:tcPr>
-            <w:tcW w:type="dxa" w:w="729"/>
-          </w:tcPr>
-          <w:p/>
-        </w:tc>
-        <w:tc>
-          <w:tcPr>
-            <w:tcW w:type="dxa" w:w="729"/>
-          </w:tcPr>
-          <w:p/>
-        </w:tc>
-        <w:tc>
-          <w:tcPr>
-            <w:tcW w:type="dxa" w:w="729"/>
-          </w:tcPr>
-          <w:p/>
-        </w:tc>
-        <w:tc>
-          <w:tcPr>
-            <w:tcW w:type="dxa" w:w="729"/>
-          </w:tcPr>
-          <w:p/>
-        </w:tc>
-        <w:tc>
-          <w:tcPr>
-            <w:tcW w:type="dxa" w:w="729"/>
-          </w:tcPr>
-          <w:p/>
-        </w:tc>
-        <w:tc>
-          <w:tcPr>
-            <w:tcW w:type="dxa" w:w="729"/>
-          </w:tcPr>
-          <w:p/>
-        </w:tc>
-        <w:tc>
-          <w:tcPr>
-            <w:tcW w:type="dxa" w:w="729"/>
-          </w:tcPr>
-          <w:p/>
-        </w:tc>
-        <w:tc>
-          <w:tcPr>
-            <w:tcW w:type="dxa" w:w="729"/>
-            <w:tcBorders>
-              <w:top w:val="single" w:sz="4" w:color="B8CCE4" w:space="0"/>
-              <w:left w:val="single" w:sz="4" w:color="B8CCE4" w:space="0"/>
-              <w:bottom w:val="single" w:sz="4" w:color="B8CCE4" w:space="0"/>
-              <w:right w:val="single" w:sz="4" w:color="B8CCE4" w:space="0"/>
-            </w:tcBorders>
-          </w:tcPr>
-          <w:p/>
-        </w:tc>
-      </w:tr>
-      <w:tr>
-        <w:trPr>
-          <w:trHeight w:val="95" w:hRule="exact"/>
-        </w:trPr>
-        <w:tc>
-          <w:tcPr>
-            <w:tcW w:type="dxa" w:w="729"/>
-            <w:tcBorders>
-              <w:top w:val="single" w:sz="4" w:color="B8CCE4" w:space="0"/>
-              <w:left w:val="single" w:sz="4" w:color="B8CCE4" w:space="0"/>
-              <w:bottom w:val="single" w:sz="4" w:color="B8CCE4" w:space="0"/>
-              <w:right w:val="single" w:sz="4" w:color="B8CCE4" w:space="0"/>
-            </w:tcBorders>
-          </w:tcPr>
-          <w:p/>
-        </w:tc>
-        <w:tc>
-          <w:tcPr>
-            <w:tcW w:type="dxa" w:w="729"/>
-            <w:tcBorders>
-              <w:top w:val="single" w:sz="4" w:color="B8CCE4" w:space="0"/>
-              <w:left w:val="single" w:sz="4" w:color="B8CCE4" w:space="0"/>
-              <w:bottom w:val="single" w:sz="4" w:color="B8CCE4" w:space="0"/>
-              <w:right w:val="single" w:sz="4" w:color="B8CCE4" w:space="0"/>
-            </w:tcBorders>
-          </w:tcPr>
-          <w:p/>
-        </w:tc>
-        <w:tc>
-          <w:tcPr>
-            <w:tcW w:type="dxa" w:w="729"/>
-            <w:tcBorders>
-              <w:top w:val="single" w:sz="4" w:color="B8CCE4" w:space="0"/>
-              <w:left w:val="single" w:sz="4" w:color="B8CCE4" w:space="0"/>
-              <w:bottom w:val="single" w:sz="4" w:color="B8CCE4" w:space="0"/>
-              <w:right w:val="single" w:sz="4" w:color="B8CCE4" w:space="0"/>
-            </w:tcBorders>
-          </w:tcPr>
-          <w:p/>
-        </w:tc>
-        <w:tc>
-          <w:tcPr>
-            <w:tcW w:type="dxa" w:w="729"/>
-            <w:tcBorders>
-              <w:top w:val="single" w:sz="4" w:color="B8CCE4" w:space="0"/>
-              <w:left w:val="single" w:sz="4" w:color="B8CCE4" w:space="0"/>
-              <w:bottom w:val="single" w:sz="4" w:color="B8CCE4" w:space="0"/>
-              <w:right w:val="single" w:sz="4" w:color="B8CCE4" w:space="0"/>
-            </w:tcBorders>
-          </w:tcPr>
-          <w:p/>
-        </w:tc>
-        <w:tc>
-          <w:tcPr>
-            <w:tcW w:type="dxa" w:w="729"/>
-            <w:tcBorders>
-              <w:top w:val="single" w:sz="4" w:color="B8CCE4" w:space="0"/>
-              <w:left w:val="single" w:sz="4" w:color="B8CCE4" w:space="0"/>
-              <w:bottom w:val="single" w:sz="4" w:color="B8CCE4" w:space="0"/>
-              <w:right w:val="single" w:sz="4" w:color="B8CCE4" w:space="0"/>
-            </w:tcBorders>
-          </w:tcPr>
-          <w:p/>
-        </w:tc>
-        <w:tc>
-          <w:tcPr>
-            <w:tcW w:type="dxa" w:w="729"/>
-            <w:tcBorders>
-              <w:top w:val="single" w:sz="4" w:color="B8CCE4" w:space="0"/>
-              <w:left w:val="single" w:sz="4" w:color="B8CCE4" w:space="0"/>
-              <w:bottom w:val="single" w:sz="4" w:color="B8CCE4" w:space="0"/>
-              <w:right w:val="single" w:sz="4" w:color="B8CCE4" w:space="0"/>
-            </w:tcBorders>
-          </w:tcPr>
-          <w:p/>
-        </w:tc>
-        <w:tc>
-          <w:tcPr>
-            <w:tcW w:type="dxa" w:w="729"/>
-            <w:tcBorders>
-              <w:top w:val="single" w:sz="4" w:color="B8CCE4" w:space="0"/>
-              <w:left w:val="single" w:sz="4" w:color="B8CCE4" w:space="0"/>
-              <w:bottom w:val="single" w:sz="4" w:color="B8CCE4" w:space="0"/>
-              <w:right w:val="single" w:sz="4" w:color="B8CCE4" w:space="0"/>
-            </w:tcBorders>
-          </w:tcPr>
-          <w:p/>
-        </w:tc>
-        <w:tc>
-          <w:tcPr>
-            <w:tcW w:type="dxa" w:w="729"/>
-            <w:tcBorders>
-              <w:top w:val="single" w:sz="4" w:color="B8CCE4" w:space="0"/>
-              <w:left w:val="single" w:sz="4" w:color="B8CCE4" w:space="0"/>
-              <w:bottom w:val="single" w:sz="4" w:color="B8CCE4" w:space="0"/>
-              <w:right w:val="single" w:sz="4" w:color="B8CCE4" w:space="0"/>
-            </w:tcBorders>
-          </w:tcPr>
-          <w:p/>
-        </w:tc>
-        <w:tc>
-          <w:tcPr>
-            <w:tcW w:type="dxa" w:w="729"/>
-            <w:tcBorders>
-              <w:top w:val="single" w:sz="4" w:color="B8CCE4" w:space="0"/>
-              <w:left w:val="single" w:sz="4" w:color="B8CCE4" w:space="0"/>
-              <w:bottom w:val="single" w:sz="4" w:color="B8CCE4" w:space="0"/>
-              <w:right w:val="single" w:sz="4" w:color="B8CCE4" w:space="0"/>
-            </w:tcBorders>
-          </w:tcPr>
-          <w:p/>
-        </w:tc>
-        <w:tc>
-          <w:tcPr>
-            <w:tcW w:type="dxa" w:w="729"/>
-            <w:tcBorders>
-              <w:top w:val="single" w:sz="4" w:color="B8CCE4" w:space="0"/>
-              <w:left w:val="single" w:sz="4" w:color="B8CCE4" w:space="0"/>
-              <w:bottom w:val="single" w:sz="4" w:color="B8CCE4" w:space="0"/>
-              <w:right w:val="single" w:sz="4" w:color="B8CCE4" w:space="0"/>
-            </w:tcBorders>
-          </w:tcPr>
-          <w:p/>
-        </w:tc>
-        <w:tc>
-          <w:tcPr>
-            <w:tcW w:type="dxa" w:w="729"/>
-            <w:tcBorders>
-              <w:top w:val="single" w:sz="4" w:color="B8CCE4" w:space="0"/>
-              <w:left w:val="single" w:sz="4" w:color="B8CCE4" w:space="0"/>
-              <w:bottom w:val="single" w:sz="4" w:color="B8CCE4" w:space="0"/>
-              <w:right w:val="single" w:sz="4" w:color="B8CCE4" w:space="0"/>
-            </w:tcBorders>
-          </w:tcPr>
-          <w:p/>
-        </w:tc>
-        <w:tc>
-          <w:tcPr>
-            <w:tcW w:type="dxa" w:w="729"/>
-            <w:tcBorders>
-              <w:top w:val="single" w:sz="4" w:color="B8CCE4" w:space="0"/>
-              <w:left w:val="single" w:sz="4" w:color="B8CCE4" w:space="0"/>
-              <w:bottom w:val="single" w:sz="4" w:color="B8CCE4" w:space="0"/>
-              <w:right w:val="single" w:sz="4" w:color="B8CCE4" w:space="0"/>
-            </w:tcBorders>
-          </w:tcPr>
-          <w:p/>
-        </w:tc>
-        <w:tc>
-          <w:tcPr>
-            <w:tcW w:type="dxa" w:w="729"/>
-            <w:tcBorders>
-              <w:top w:val="single" w:sz="4" w:color="B8CCE4" w:space="0"/>
-              <w:left w:val="single" w:sz="4" w:color="B8CCE4" w:space="0"/>
-              <w:bottom w:val="single" w:sz="4" w:color="B8CCE4" w:space="0"/>
-              <w:right w:val="single" w:sz="4" w:color="B8CCE4" w:space="0"/>
-            </w:tcBorders>
-          </w:tcPr>
-          <w:p/>
-        </w:tc>
-        <w:tc>
-          <w:tcPr>
-            <w:tcW w:type="dxa" w:w="729"/>
-            <w:tcBorders>
-              <w:top w:val="single" w:sz="4" w:color="B8CCE4" w:space="0"/>
-              <w:left w:val="single" w:sz="4" w:color="B8CCE4" w:space="0"/>
-              <w:bottom w:val="single" w:sz="4" w:color="B8CCE4" w:space="0"/>
-              <w:right w:val="single" w:sz="4" w:color="B8CCE4" w:space="0"/>
-            </w:tcBorders>
-          </w:tcPr>
-          <w:p/>
-        </w:tc>
-      </w:tr>
-      <w:tr>
-        <w:trPr>
-          <w:trHeight w:val="480" w:hRule="atLeast"/>
-        </w:trPr>
-        <w:tc>
-          <w:tcPr>
-            <w:tcW w:type="dxa" w:w="729"/>
-            <w:tcBorders>
-              <w:top w:val="single" w:sz="4" w:color="B8CCE4" w:space="0"/>
-              <w:left w:val="single" w:sz="4" w:color="B8CCE4" w:space="0"/>
-              <w:bottom w:val="single" w:sz="4" w:color="B8CCE4" w:space="0"/>
-              <w:right w:val="single" w:sz="4" w:color="B8CCE4" w:space="0"/>
-            </w:tcBorders>
-          </w:tcPr>
-          <w:p/>
-        </w:tc>
-        <w:tc>
-          <w:tcPr>
-            <w:tcW w:type="dxa" w:w="1458"/>
-            <w:gridSpan w:val="2"/>
-            <w:tcBorders>
-              <w:top w:val="none" w:sz="0" w:color="FFFFFF" w:space="0"/>
-              <w:left w:val="none" w:sz="0" w:color="FFFFFF" w:space="0"/>
-              <w:bottom w:val="none" w:sz="0" w:color="FFFFFF" w:space="0"/>
-              <w:right w:val="none" w:sz="0" w:color="FFFFFF" w:space="0"/>
-            </w:tcBorders>
-          </w:tcPr>
-          <w:p/>
-          <w:p>
-            <w:pPr>
-              <w:spacing w:before="160" w:after="80"/>
-              <w:jc w:val="center"/>
-            </w:pPr>
-            <w:r>
-              <w:rPr>
-                <w:b/>
-                <w:sz w:val="26"/>
-                <w:u w:val="single"/>
-              </w:rPr>
-              <w:t>Properties to be Valued</w:t>
-            </w:r>
-          </w:p>
-          <w:p>
-            <w:pPr>
-              <w:spacing w:before="0" w:after="80"/>
-              <w:jc w:val="center"/>
-            </w:pPr>
-            <w:r>
-              <w:rPr>
-                <w:b/>
-                <w:sz w:val="22"/>
-                <w:u w:val="none"/>
-              </w:rPr>
-              <w:t>Land &amp; Building Located at</w:t>
-            </w:r>
-          </w:p>
-          <w:p>
-            <w:pPr>
-              <w:spacing w:before="0" w:after="40"/>
-              <w:jc w:val="center"/>
-            </w:pPr>
-            <w:r>
-              <w:rPr>
-                <w:b w:val="0"/>
-                <w:sz w:val="22"/>
-                <w:u w:val="none"/>
-              </w:rPr>
-              <w:t>Plot No:  {{ plot_no }}</w:t>
-            </w:r>
-          </w:p>
-          <w:p>
-            <w:pPr>
-              <w:spacing w:before="0" w:after="40"/>
-              <w:jc w:val="center"/>
-            </w:pPr>
-            <w:r>
-              <w:rPr>
-                <w:b w:val="0"/>
-                <w:sz w:val="22"/>
-                <w:u w:val="none"/>
-              </w:rPr>
-              <w:t>{{ property_location_full }}</w:t>
-            </w:r>
-          </w:p>
-          <w:p>
-            <w:pPr>
-              <w:spacing w:before="0" w:after="160"/>
-              <w:jc w:val="center"/>
-            </w:pPr>
-            <w:r>
-              <w:rPr>
-                <w:b w:val="0"/>
-                <w:sz w:val="22"/>
-                <w:u w:val="none"/>
-              </w:rPr>
-              <w:t>{{ sabik_display }}</w:t>
-            </w:r>
-          </w:p>
-        </w:tc>
-        <w:tc>
-          <w:tcPr>
-            <w:tcW w:type="dxa" w:w="729"/>
-          </w:tcPr>
-          <w:p/>
-        </w:tc>
-        <w:tc>
-          <w:tcPr>
-            <w:tcW w:type="dxa" w:w="729"/>
-          </w:tcPr>
-          <w:p/>
-        </w:tc>
-        <w:tc>
-          <w:tcPr>
-            <w:tcW w:type="dxa" w:w="729"/>
-          </w:tcPr>
-          <w:p/>
-        </w:tc>
-        <w:tc>
-          <w:tcPr>
-            <w:tcW w:type="dxa" w:w="729"/>
-          </w:tcPr>
-          <w:p/>
-        </w:tc>
-        <w:tc>
-          <w:tcPr>
-            <w:tcW w:type="dxa" w:w="729"/>
-          </w:tcPr>
-          <w:p/>
-        </w:tc>
-        <w:tc>
-          <w:tcPr>
-            <w:tcW w:type="dxa" w:w="729"/>
-          </w:tcPr>
-          <w:p/>
-        </w:tc>
-        <w:tc>
-          <w:tcPr>
-            <w:tcW w:type="dxa" w:w="729"/>
-          </w:tcPr>
-          <w:p/>
-        </w:tc>
-        <w:tc>
-          <w:tcPr>
-            <w:tcW w:type="dxa" w:w="729"/>
-          </w:tcPr>
-          <w:p/>
-        </w:tc>
-        <w:tc>
-          <w:tcPr>
-            <w:tcW w:type="dxa" w:w="729"/>
-          </w:tcPr>
-          <w:p/>
-        </w:tc>
-        <w:tc>
-          <w:tcPr>
-            <w:tcW w:type="dxa" w:w="729"/>
-          </w:tcPr>
-          <w:p/>
-        </w:tc>
-        <w:tc>
-          <w:tcPr>
-            <w:tcW w:type="dxa" w:w="729"/>
-            <w:tcBorders>
-              <w:top w:val="single" w:sz="4" w:color="B8CCE4" w:space="0"/>
-              <w:left w:val="single" w:sz="4" w:color="B8CCE4" w:space="0"/>
-              <w:bottom w:val="single" w:sz="4" w:color="B8CCE4" w:space="0"/>
-              <w:right w:val="single" w:sz="4" w:color="B8CCE4" w:space="0"/>
-            </w:tcBorders>
-          </w:tcPr>
-          <w:p/>
-        </w:tc>
-      </w:tr>
-      <w:tr>
-        <w:trPr>
-          <w:trHeight w:val="95" w:hRule="exact"/>
-        </w:trPr>
-        <w:tc>
-          <w:tcPr>
-            <w:tcW w:type="dxa" w:w="729"/>
-            <w:tcBorders>
-              <w:top w:val="single" w:sz="4" w:color="B8CCE4" w:space="0"/>
-              <w:left w:val="single" w:sz="4" w:color="B8CCE4" w:space="0"/>
-              <w:bottom w:val="single" w:sz="4" w:color="B8CCE4" w:space="0"/>
-              <w:right w:val="single" w:sz="4" w:color="B8CCE4" w:space="0"/>
-            </w:tcBorders>
-          </w:tcPr>
-          <w:p/>
-        </w:tc>
-        <w:tc>
-          <w:tcPr>
-            <w:tcW w:type="dxa" w:w="729"/>
-            <w:tcBorders>
-              <w:top w:val="single" w:sz="4" w:color="B8CCE4" w:space="0"/>
-              <w:left w:val="single" w:sz="4" w:color="B8CCE4" w:space="0"/>
-              <w:bottom w:val="single" w:sz="4" w:color="B8CCE4" w:space="0"/>
-              <w:right w:val="single" w:sz="4" w:color="B8CCE4" w:space="0"/>
-            </w:tcBorders>
-          </w:tcPr>
-          <w:p/>
-        </w:tc>
-        <w:tc>
-          <w:tcPr>
-            <w:tcW w:type="dxa" w:w="729"/>
-            <w:tcBorders>
-              <w:top w:val="single" w:sz="4" w:color="B8CCE4" w:space="0"/>
-              <w:left w:val="single" w:sz="4" w:color="B8CCE4" w:space="0"/>
-              <w:bottom w:val="single" w:sz="4" w:color="B8CCE4" w:space="0"/>
-              <w:right w:val="single" w:sz="4" w:color="B8CCE4" w:space="0"/>
-            </w:tcBorders>
-          </w:tcPr>
-          <w:p/>
-        </w:tc>
-        <w:tc>
-          <w:tcPr>
-            <w:tcW w:type="dxa" w:w="729"/>
-            <w:tcBorders>
-              <w:top w:val="single" w:sz="4" w:color="B8CCE4" w:space="0"/>
-              <w:left w:val="single" w:sz="4" w:color="B8CCE4" w:space="0"/>
-              <w:bottom w:val="single" w:sz="4" w:color="B8CCE4" w:space="0"/>
-              <w:right w:val="single" w:sz="4" w:color="B8CCE4" w:space="0"/>
-            </w:tcBorders>
-          </w:tcPr>
-          <w:p/>
-        </w:tc>
-        <w:tc>
-          <w:tcPr>
-            <w:tcW w:type="dxa" w:w="729"/>
-            <w:tcBorders>
-              <w:top w:val="single" w:sz="4" w:color="B8CCE4" w:space="0"/>
-              <w:left w:val="single" w:sz="4" w:color="B8CCE4" w:space="0"/>
-              <w:bottom w:val="single" w:sz="4" w:color="B8CCE4" w:space="0"/>
-              <w:right w:val="single" w:sz="4" w:color="B8CCE4" w:space="0"/>
-            </w:tcBorders>
-          </w:tcPr>
-          <w:p/>
-        </w:tc>
-        <w:tc>
-          <w:tcPr>
-            <w:tcW w:type="dxa" w:w="729"/>
-            <w:tcBorders>
-              <w:top w:val="single" w:sz="4" w:color="B8CCE4" w:space="0"/>
-              <w:left w:val="single" w:sz="4" w:color="B8CCE4" w:space="0"/>
-              <w:bottom w:val="single" w:sz="4" w:color="B8CCE4" w:space="0"/>
-              <w:right w:val="single" w:sz="4" w:color="B8CCE4" w:space="0"/>
-            </w:tcBorders>
-          </w:tcPr>
-          <w:p/>
-        </w:tc>
-        <w:tc>
-          <w:tcPr>
-            <w:tcW w:type="dxa" w:w="729"/>
-            <w:tcBorders>
-              <w:top w:val="single" w:sz="4" w:color="B8CCE4" w:space="0"/>
-              <w:left w:val="single" w:sz="4" w:color="B8CCE4" w:space="0"/>
-              <w:bottom w:val="single" w:sz="4" w:color="B8CCE4" w:space="0"/>
-              <w:right w:val="single" w:sz="4" w:color="B8CCE4" w:space="0"/>
-            </w:tcBorders>
-          </w:tcPr>
-          <w:p/>
-        </w:tc>
-        <w:tc>
-          <w:tcPr>
-            <w:tcW w:type="dxa" w:w="729"/>
-            <w:tcBorders>
-              <w:top w:val="single" w:sz="4" w:color="B8CCE4" w:space="0"/>
-              <w:left w:val="single" w:sz="4" w:color="B8CCE4" w:space="0"/>
-              <w:bottom w:val="single" w:sz="4" w:color="B8CCE4" w:space="0"/>
-              <w:right w:val="single" w:sz="4" w:color="B8CCE4" w:space="0"/>
-            </w:tcBorders>
-          </w:tcPr>
-          <w:p/>
-        </w:tc>
-        <w:tc>
-          <w:tcPr>
-            <w:tcW w:type="dxa" w:w="729"/>
-            <w:tcBorders>
-              <w:top w:val="single" w:sz="4" w:color="B8CCE4" w:space="0"/>
-              <w:left w:val="single" w:sz="4" w:color="B8CCE4" w:space="0"/>
-              <w:bottom w:val="single" w:sz="4" w:color="B8CCE4" w:space="0"/>
-              <w:right w:val="single" w:sz="4" w:color="B8CCE4" w:space="0"/>
-            </w:tcBorders>
-          </w:tcPr>
-          <w:p/>
-        </w:tc>
-        <w:tc>
-          <w:tcPr>
-            <w:tcW w:type="dxa" w:w="729"/>
-            <w:tcBorders>
-              <w:top w:val="single" w:sz="4" w:color="B8CCE4" w:space="0"/>
-              <w:left w:val="single" w:sz="4" w:color="B8CCE4" w:space="0"/>
-              <w:bottom w:val="single" w:sz="4" w:color="B8CCE4" w:space="0"/>
-              <w:right w:val="single" w:sz="4" w:color="B8CCE4" w:space="0"/>
-            </w:tcBorders>
-          </w:tcPr>
-          <w:p/>
-        </w:tc>
-        <w:tc>
-          <w:tcPr>
-            <w:tcW w:type="dxa" w:w="729"/>
-            <w:tcBorders>
-              <w:top w:val="single" w:sz="4" w:color="B8CCE4" w:space="0"/>
-              <w:left w:val="single" w:sz="4" w:color="B8CCE4" w:space="0"/>
-              <w:bottom w:val="single" w:sz="4" w:color="B8CCE4" w:space="0"/>
-              <w:right w:val="single" w:sz="4" w:color="B8CCE4" w:space="0"/>
-            </w:tcBorders>
-          </w:tcPr>
-          <w:p/>
-        </w:tc>
-        <w:tc>
-          <w:tcPr>
-            <w:tcW w:type="dxa" w:w="729"/>
-            <w:tcBorders>
-              <w:top w:val="single" w:sz="4" w:color="B8CCE4" w:space="0"/>
-              <w:left w:val="single" w:sz="4" w:color="B8CCE4" w:space="0"/>
-              <w:bottom w:val="single" w:sz="4" w:color="B8CCE4" w:space="0"/>
-              <w:right w:val="single" w:sz="4" w:color="B8CCE4" w:space="0"/>
-            </w:tcBorders>
-          </w:tcPr>
-          <w:p/>
-        </w:tc>
-        <w:tc>
-          <w:tcPr>
-            <w:tcW w:type="dxa" w:w="729"/>
-            <w:tcBorders>
-              <w:top w:val="single" w:sz="4" w:color="B8CCE4" w:space="0"/>
-              <w:left w:val="single" w:sz="4" w:color="B8CCE4" w:space="0"/>
-              <w:bottom w:val="single" w:sz="4" w:color="B8CCE4" w:space="0"/>
-              <w:right w:val="single" w:sz="4" w:color="B8CCE4" w:space="0"/>
-            </w:tcBorders>
-          </w:tcPr>
-          <w:p/>
-        </w:tc>
-        <w:tc>
-          <w:tcPr>
-            <w:tcW w:type="dxa" w:w="729"/>
-            <w:tcBorders>
-              <w:top w:val="single" w:sz="4" w:color="B8CCE4" w:space="0"/>
-              <w:left w:val="single" w:sz="4" w:color="B8CCE4" w:space="0"/>
-              <w:bottom w:val="single" w:sz="4" w:color="B8CCE4" w:space="0"/>
-              <w:right w:val="single" w:sz="4" w:color="B8CCE4" w:space="0"/>
-            </w:tcBorders>
-          </w:tcPr>
-          <w:p/>
-        </w:tc>
-      </w:tr>
-      <w:tr>
-        <w:trPr>
-          <w:trHeight w:val="460" w:hRule="atLeast"/>
-        </w:trPr>
-        <w:tc>
-          <w:tcPr>
-            <w:tcW w:type="dxa" w:w="729"/>
-            <w:tcBorders>
-              <w:top w:val="single" w:sz="4" w:color="B8CCE4" w:space="0"/>
-              <w:left w:val="single" w:sz="4" w:color="B8CCE4" w:space="0"/>
-              <w:bottom w:val="single" w:sz="4" w:color="B8CCE4" w:space="0"/>
-              <w:right w:val="single" w:sz="4" w:color="B8CCE4" w:space="0"/>
-            </w:tcBorders>
-          </w:tcPr>
-          <w:p/>
-        </w:tc>
-        <w:tc>
-          <w:tcPr>
-            <w:tcW w:type="dxa" w:w="1458"/>
-            <w:gridSpan w:val="2"/>
-            <w:tcBorders>
-              <w:top w:val="none" w:sz="0" w:color="FFFFFF" w:space="0"/>
-              <w:left w:val="none" w:sz="0" w:color="FFFFFF" w:space="0"/>
-              <w:bottom w:val="none" w:sz="0" w:color="FFFFFF" w:space="0"/>
-              <w:right w:val="none" w:sz="0" w:color="FFFFFF" w:space="0"/>
-            </w:tcBorders>
-          </w:tcPr>
-          <w:p/>
-          <w:p>
-            <w:pPr>
-              <w:spacing w:before="160" w:after="80"/>
-              <w:jc w:val="center"/>
-            </w:pPr>
-            <w:r>
-              <w:rPr>
-                <w:b/>
-                <w:sz w:val="26"/>
-                <w:u w:val="single"/>
-              </w:rPr>
-              <w:t>Owner 1</w:t>
-            </w:r>
-          </w:p>
-          <w:p>
-            <w:pPr>
-              <w:spacing w:before="0" w:after="80"/>
-              <w:jc w:val="center"/>
-            </w:pPr>
-            <w:r>
-              <w:rPr>
-                <w:b/>
-                <w:sz w:val="26"/>
-                <w:u w:val="none"/>
-              </w:rPr>
-              <w:t>{{ owner1_name }}</w:t>
-            </w:r>
-          </w:p>
-          <w:p>
-            <w:pPr>
-              <w:spacing w:before="0" w:after="40"/>
-              <w:jc w:val="center"/>
-            </w:pPr>
-            <w:r>
-              <w:rPr>
-                <w:b w:val="0"/>
-                <w:sz w:val="22"/>
-                <w:u w:val="none"/>
-              </w:rPr>
-              <w:t>{{ owner1_vdc_ward }}</w:t>
-            </w:r>
-          </w:p>
-          <w:p>
-            <w:pPr>
-              <w:spacing w:before="0" w:after="40"/>
-              <w:jc w:val="center"/>
-            </w:pPr>
-            <w:r>
-              <w:rPr>
-                <w:b w:val="0"/>
-                <w:sz w:val="22"/>
-                <w:u w:val="none"/>
-              </w:rPr>
-              <w:t>{{ owner1_district_country }}</w:t>
-            </w:r>
-          </w:p>
-          <w:p>
-            <w:pPr>
-              <w:spacing w:before="0" w:after="160"/>
-              <w:jc w:val="center"/>
-            </w:pPr>
-            <w:r>
-              <w:rPr>
-                <w:b w:val="0"/>
-                <w:sz w:val="22"/>
-                <w:u w:val="none"/>
-              </w:rPr>
-              <w:t>Contact No: {{ owner1_phone }}</w:t>
-            </w:r>
-          </w:p>
-        </w:tc>
-        <w:tc>
-          <w:tcPr>
-            <w:tcW w:type="dxa" w:w="729"/>
-          </w:tcPr>
-          <w:p/>
-        </w:tc>
-        <w:tc>
-          <w:tcPr>
-            <w:tcW w:type="dxa" w:w="729"/>
-          </w:tcPr>
-          <w:p/>
-        </w:tc>
-        <w:tc>
-          <w:tcPr>
-            <w:tcW w:type="dxa" w:w="729"/>
-          </w:tcPr>
-          <w:p/>
-        </w:tc>
-        <w:tc>
-          <w:tcPr>
-            <w:tcW w:type="dxa" w:w="729"/>
-          </w:tcPr>
-          <w:p/>
-        </w:tc>
-        <w:tc>
-          <w:tcPr>
-            <w:tcW w:type="dxa" w:w="729"/>
-          </w:tcPr>
-          <w:p/>
-        </w:tc>
-        <w:tc>
-          <w:tcPr>
-            <w:tcW w:type="dxa" w:w="729"/>
-          </w:tcPr>
-          <w:p/>
-        </w:tc>
-        <w:tc>
-          <w:tcPr>
-            <w:tcW w:type="dxa" w:w="729"/>
-          </w:tcPr>
-          <w:p/>
-        </w:tc>
-        <w:tc>
-          <w:tcPr>
-            <w:tcW w:type="dxa" w:w="729"/>
-          </w:tcPr>
-          <w:p/>
-        </w:tc>
-        <w:tc>
-          <w:tcPr>
-            <w:tcW w:type="dxa" w:w="729"/>
-          </w:tcPr>
-          <w:p/>
-        </w:tc>
-        <w:tc>
-          <w:tcPr>
-            <w:tcW w:type="dxa" w:w="729"/>
-          </w:tcPr>
-          <w:p/>
-        </w:tc>
-        <w:tc>
-          <w:tcPr>
-            <w:tcW w:type="dxa" w:w="729"/>
-            <w:tcBorders>
-              <w:top w:val="single" w:sz="4" w:color="B8CCE4" w:space="0"/>
-              <w:left w:val="single" w:sz="4" w:color="B8CCE4" w:space="0"/>
-              <w:bottom w:val="single" w:sz="4" w:color="B8CCE4" w:space="0"/>
-              <w:right w:val="single" w:sz="4" w:color="B8CCE4" w:space="0"/>
-            </w:tcBorders>
-          </w:tcPr>
-          <w:p/>
-        </w:tc>
-      </w:tr>
-      <w:tr>
-        <w:trPr>
-          <w:trHeight w:val="95" w:hRule="exact"/>
-        </w:trPr>
-        <w:tc>
-          <w:tcPr>
-            <w:tcW w:type="dxa" w:w="729"/>
-            <w:tcBorders>
-              <w:top w:val="single" w:sz="4" w:color="B8CCE4" w:space="0"/>
-              <w:left w:val="single" w:sz="4" w:color="B8CCE4" w:space="0"/>
-              <w:bottom w:val="single" w:sz="4" w:color="B8CCE4" w:space="0"/>
-              <w:right w:val="single" w:sz="4" w:color="B8CCE4" w:space="0"/>
-            </w:tcBorders>
-          </w:tcPr>
-          <w:p/>
-        </w:tc>
-        <w:tc>
-          <w:tcPr>
-            <w:tcW w:type="dxa" w:w="729"/>
-            <w:tcBorders>
-              <w:top w:val="single" w:sz="4" w:color="B8CCE4" w:space="0"/>
-              <w:left w:val="single" w:sz="4" w:color="B8CCE4" w:space="0"/>
-              <w:bottom w:val="single" w:sz="4" w:color="B8CCE4" w:space="0"/>
-              <w:right w:val="single" w:sz="4" w:color="B8CCE4" w:space="0"/>
-            </w:tcBorders>
-          </w:tcPr>
-          <w:p/>
-        </w:tc>
-        <w:tc>
-          <w:tcPr>
-            <w:tcW w:type="dxa" w:w="729"/>
-            <w:tcBorders>
-              <w:top w:val="single" w:sz="4" w:color="B8CCE4" w:space="0"/>
-              <w:left w:val="single" w:sz="4" w:color="B8CCE4" w:space="0"/>
-              <w:bottom w:val="single" w:sz="4" w:color="B8CCE4" w:space="0"/>
-              <w:right w:val="single" w:sz="4" w:color="B8CCE4" w:space="0"/>
-            </w:tcBorders>
-          </w:tcPr>
-          <w:p/>
-        </w:tc>
-        <w:tc>
-          <w:tcPr>
-            <w:tcW w:type="dxa" w:w="729"/>
-            <w:tcBorders>
-              <w:top w:val="single" w:sz="4" w:color="B8CCE4" w:space="0"/>
-              <w:left w:val="single" w:sz="4" w:color="B8CCE4" w:space="0"/>
-              <w:bottom w:val="single" w:sz="4" w:color="B8CCE4" w:space="0"/>
-              <w:right w:val="single" w:sz="4" w:color="B8CCE4" w:space="0"/>
-            </w:tcBorders>
-          </w:tcPr>
-          <w:p/>
-        </w:tc>
-        <w:tc>
-          <w:tcPr>
-            <w:tcW w:type="dxa" w:w="729"/>
-            <w:tcBorders>
-              <w:top w:val="single" w:sz="4" w:color="B8CCE4" w:space="0"/>
-              <w:left w:val="single" w:sz="4" w:color="B8CCE4" w:space="0"/>
-              <w:bottom w:val="single" w:sz="4" w:color="B8CCE4" w:space="0"/>
-              <w:right w:val="single" w:sz="4" w:color="B8CCE4" w:space="0"/>
-            </w:tcBorders>
-          </w:tcPr>
-          <w:p/>
-        </w:tc>
-        <w:tc>
-          <w:tcPr>
-            <w:tcW w:type="dxa" w:w="729"/>
-            <w:tcBorders>
-              <w:top w:val="single" w:sz="4" w:color="B8CCE4" w:space="0"/>
-              <w:left w:val="single" w:sz="4" w:color="B8CCE4" w:space="0"/>
-              <w:bottom w:val="single" w:sz="4" w:color="B8CCE4" w:space="0"/>
-              <w:right w:val="single" w:sz="4" w:color="B8CCE4" w:space="0"/>
-            </w:tcBorders>
-          </w:tcPr>
-          <w:p/>
-        </w:tc>
-        <w:tc>
-          <w:tcPr>
-            <w:tcW w:type="dxa" w:w="729"/>
-            <w:tcBorders>
-              <w:top w:val="single" w:sz="4" w:color="B8CCE4" w:space="0"/>
-              <w:left w:val="single" w:sz="4" w:color="B8CCE4" w:space="0"/>
-              <w:bottom w:val="single" w:sz="4" w:color="B8CCE4" w:space="0"/>
-              <w:right w:val="single" w:sz="4" w:color="B8CCE4" w:space="0"/>
-            </w:tcBorders>
-          </w:tcPr>
-          <w:p/>
-        </w:tc>
-        <w:tc>
-          <w:tcPr>
-            <w:tcW w:type="dxa" w:w="729"/>
-            <w:tcBorders>
-              <w:top w:val="single" w:sz="4" w:color="B8CCE4" w:space="0"/>
-              <w:left w:val="single" w:sz="4" w:color="B8CCE4" w:space="0"/>
-              <w:bottom w:val="single" w:sz="4" w:color="B8CCE4" w:space="0"/>
-              <w:right w:val="single" w:sz="4" w:color="B8CCE4" w:space="0"/>
-            </w:tcBorders>
-          </w:tcPr>
-          <w:p/>
-        </w:tc>
-        <w:tc>
-          <w:tcPr>
-            <w:tcW w:type="dxa" w:w="729"/>
-            <w:tcBorders>
-              <w:top w:val="single" w:sz="4" w:color="B8CCE4" w:space="0"/>
-              <w:left w:val="single" w:sz="4" w:color="B8CCE4" w:space="0"/>
-              <w:bottom w:val="single" w:sz="4" w:color="B8CCE4" w:space="0"/>
-              <w:right w:val="single" w:sz="4" w:color="B8CCE4" w:space="0"/>
-            </w:tcBorders>
-          </w:tcPr>
-          <w:p/>
-        </w:tc>
-        <w:tc>
-          <w:tcPr>
-            <w:tcW w:type="dxa" w:w="729"/>
-            <w:tcBorders>
-              <w:top w:val="single" w:sz="4" w:color="B8CCE4" w:space="0"/>
-              <w:left w:val="single" w:sz="4" w:color="B8CCE4" w:space="0"/>
-              <w:bottom w:val="single" w:sz="4" w:color="B8CCE4" w:space="0"/>
-              <w:right w:val="single" w:sz="4" w:color="B8CCE4" w:space="0"/>
-            </w:tcBorders>
-          </w:tcPr>
-          <w:p/>
-        </w:tc>
-        <w:tc>
-          <w:tcPr>
-            <w:tcW w:type="dxa" w:w="729"/>
-            <w:tcBorders>
-              <w:top w:val="single" w:sz="4" w:color="B8CCE4" w:space="0"/>
-              <w:left w:val="single" w:sz="4" w:color="B8CCE4" w:space="0"/>
-              <w:bottom w:val="single" w:sz="4" w:color="B8CCE4" w:space="0"/>
-              <w:right w:val="single" w:sz="4" w:color="B8CCE4" w:space="0"/>
-            </w:tcBorders>
-          </w:tcPr>
-          <w:p/>
-        </w:tc>
-        <w:tc>
-          <w:tcPr>
-            <w:tcW w:type="dxa" w:w="729"/>
-            <w:tcBorders>
-              <w:top w:val="single" w:sz="4" w:color="B8CCE4" w:space="0"/>
-              <w:left w:val="single" w:sz="4" w:color="B8CCE4" w:space="0"/>
-              <w:bottom w:val="single" w:sz="4" w:color="B8CCE4" w:space="0"/>
-              <w:right w:val="single" w:sz="4" w:color="B8CCE4" w:space="0"/>
-            </w:tcBorders>
-          </w:tcPr>
-          <w:p/>
-        </w:tc>
-        <w:tc>
-          <w:tcPr>
-            <w:tcW w:type="dxa" w:w="729"/>
-            <w:tcBorders>
-              <w:top w:val="single" w:sz="4" w:color="B8CCE4" w:space="0"/>
-              <w:left w:val="single" w:sz="4" w:color="B8CCE4" w:space="0"/>
-              <w:bottom w:val="single" w:sz="4" w:color="B8CCE4" w:space="0"/>
-              <w:right w:val="single" w:sz="4" w:color="B8CCE4" w:space="0"/>
-            </w:tcBorders>
-          </w:tcPr>
-          <w:p/>
-        </w:tc>
-        <w:tc>
-          <w:tcPr>
-            <w:tcW w:type="dxa" w:w="729"/>
-            <w:tcBorders>
-              <w:top w:val="single" w:sz="4" w:color="B8CCE4" w:space="0"/>
-              <w:left w:val="single" w:sz="4" w:color="B8CCE4" w:space="0"/>
-              <w:bottom w:val="single" w:sz="4" w:color="B8CCE4" w:space="0"/>
-              <w:right w:val="single" w:sz="4" w:color="B8CCE4" w:space="0"/>
-            </w:tcBorders>
-          </w:tcPr>
-          <w:p/>
-        </w:tc>
-      </w:tr>
-      <w:tr>
-        <w:trPr>
-          <w:trHeight w:val="460" w:hRule="atLeast"/>
-        </w:trPr>
-        <w:tc>
-          <w:tcPr>
-            <w:tcW w:type="dxa" w:w="729"/>
-            <w:tcBorders>
-              <w:top w:val="single" w:sz="4" w:color="B8CCE4" w:space="0"/>
-              <w:left w:val="single" w:sz="4" w:color="B8CCE4" w:space="0"/>
-              <w:bottom w:val="single" w:sz="4" w:color="B8CCE4" w:space="0"/>
-              <w:right w:val="single" w:sz="4" w:color="B8CCE4" w:space="0"/>
-            </w:tcBorders>
-          </w:tcPr>
-          <w:p/>
-        </w:tc>
-        <w:tc>
-          <w:tcPr>
-            <w:tcW w:type="dxa" w:w="1458"/>
-            <w:gridSpan w:val="2"/>
-            <w:tcBorders>
-              <w:top w:val="none" w:sz="0" w:color="FFFFFF" w:space="0"/>
-              <w:left w:val="none" w:sz="0" w:color="FFFFFF" w:space="0"/>
-              <w:bottom w:val="none" w:sz="0" w:color="FFFFFF" w:space="0"/>
-              <w:right w:val="none" w:sz="0" w:color="FFFFFF" w:space="0"/>
-            </w:tcBorders>
-          </w:tcPr>
-          <w:p/>
-          <w:p>
-            <w:pPr>
-              <w:spacing w:before="0" w:after="0"/>
-              <w:jc w:val="center"/>
-            </w:pPr>
-            <w:r>
-              <w:rPr>
-                <w:sz w:val="1"/>
-              </w:rPr>
-              <w:t>{%p if owner2_name and owner2_name != '—' %}</w:t>
-            </w:r>
-          </w:p>
-          <w:p>
-            <w:pPr>
-              <w:spacing w:before="160" w:after="80"/>
-              <w:jc w:val="center"/>
-            </w:pPr>
-            <w:r>
-              <w:rPr>
-                <w:b/>
-                <w:sz w:val="26"/>
-                <w:u w:val="single"/>
-              </w:rPr>
-              <w:t>Owner 2</w:t>
-            </w:r>
-          </w:p>
-          <w:p>
-            <w:pPr>
-              <w:spacing w:before="0" w:after="80"/>
-              <w:jc w:val="center"/>
-            </w:pPr>
-            <w:r>
-              <w:rPr>
-                <w:b/>
-                <w:sz w:val="26"/>
-                <w:u w:val="none"/>
-              </w:rPr>
-              <w:t>{{ owner2_name }}</w:t>
-            </w:r>
-          </w:p>
-          <w:p>
-            <w:pPr>
-              <w:spacing w:before="0" w:after="40"/>
-              <w:jc w:val="center"/>
-            </w:pPr>
-            <w:r>
-              <w:rPr>
-                <w:b w:val="0"/>
-                <w:sz w:val="22"/>
-                <w:u w:val="none"/>
-              </w:rPr>
-              <w:t>{{ owner2_vdc_ward }}</w:t>
-            </w:r>
-          </w:p>
-          <w:p>
-            <w:pPr>
-              <w:spacing w:before="0" w:after="40"/>
-              <w:jc w:val="center"/>
-            </w:pPr>
-            <w:r>
-              <w:rPr>
-                <w:b w:val="0"/>
-                <w:sz w:val="22"/>
-                <w:u w:val="none"/>
-              </w:rPr>
-              <w:t>{{ owner2_district_country }}</w:t>
-            </w:r>
-          </w:p>
-          <w:p>
-            <w:pPr>
-              <w:spacing w:before="0" w:after="160"/>
-              <w:jc w:val="center"/>
-            </w:pPr>
-            <w:r>
-              <w:rPr>
-                <w:b w:val="0"/>
-                <w:sz w:val="22"/>
-                <w:u w:val="none"/>
-              </w:rPr>
-              <w:t>Contact No: {{ owner2_phone }}</w:t>
-            </w:r>
-          </w:p>
-          <w:p>
-            <w:pPr>
-              <w:spacing w:before="0" w:after="0"/>
-              <w:jc w:val="center"/>
-            </w:pPr>
-            <w:r>
-              <w:rPr>
-                <w:sz w:val="1"/>
-              </w:rPr>
-              <w:t>{%p endif %}</w:t>
-            </w:r>
-          </w:p>
-        </w:tc>
-        <w:tc>
-          <w:tcPr>
-            <w:tcW w:type="dxa" w:w="729"/>
-          </w:tcPr>
-          <w:p/>
-        </w:tc>
-        <w:tc>
-          <w:tcPr>
-            <w:tcW w:type="dxa" w:w="729"/>
-          </w:tcPr>
-          <w:p/>
-        </w:tc>
-        <w:tc>
-          <w:tcPr>
-            <w:tcW w:type="dxa" w:w="729"/>
-          </w:tcPr>
-          <w:p/>
-        </w:tc>
-        <w:tc>
-          <w:tcPr>
-            <w:tcW w:type="dxa" w:w="729"/>
-          </w:tcPr>
-          <w:p/>
-        </w:tc>
-        <w:tc>
-          <w:tcPr>
-            <w:tcW w:type="dxa" w:w="729"/>
-          </w:tcPr>
-          <w:p/>
-        </w:tc>
-        <w:tc>
-          <w:tcPr>
-            <w:tcW w:type="dxa" w:w="729"/>
-          </w:tcPr>
-          <w:p/>
-        </w:tc>
-        <w:tc>
-          <w:tcPr>
-            <w:tcW w:type="dxa" w:w="729"/>
-          </w:tcPr>
-          <w:p/>
-        </w:tc>
-        <w:tc>
-          <w:tcPr>
-            <w:tcW w:type="dxa" w:w="729"/>
-          </w:tcPr>
-          <w:p/>
-        </w:tc>
-        <w:tc>
-          <w:tcPr>
-            <w:tcW w:type="dxa" w:w="729"/>
-          </w:tcPr>
-          <w:p/>
-        </w:tc>
-        <w:tc>
-          <w:tcPr>
-            <w:tcW w:type="dxa" w:w="729"/>
-          </w:tcPr>
-          <w:p/>
-        </w:tc>
-        <w:tc>
-          <w:tcPr>
-            <w:tcW w:type="dxa" w:w="729"/>
-            <w:tcBorders>
-              <w:top w:val="single" w:sz="4" w:color="B8CCE4" w:space="0"/>
-              <w:left w:val="single" w:sz="4" w:color="B8CCE4" w:space="0"/>
-              <w:bottom w:val="single" w:sz="4" w:color="B8CCE4" w:space="0"/>
-              <w:right w:val="single" w:sz="4" w:color="B8CCE4" w:space="0"/>
-            </w:tcBorders>
-          </w:tcPr>
-          <w:p/>
-        </w:tc>
-      </w:tr>
-      <w:tr>
-        <w:trPr>
-          <w:trHeight w:val="95" w:hRule="exact"/>
-        </w:trPr>
-        <w:tc>
-          <w:tcPr>
-            <w:tcW w:type="dxa" w:w="729"/>
-            <w:tcBorders>
-              <w:top w:val="single" w:sz="4" w:color="B8CCE4" w:space="0"/>
-              <w:left w:val="single" w:sz="4" w:color="B8CCE4" w:space="0"/>
-              <w:bottom w:val="single" w:sz="4" w:color="B8CCE4" w:space="0"/>
-              <w:right w:val="single" w:sz="4" w:color="B8CCE4" w:space="0"/>
-            </w:tcBorders>
-          </w:tcPr>
-          <w:p/>
-        </w:tc>
-        <w:tc>
-          <w:tcPr>
-            <w:tcW w:type="dxa" w:w="729"/>
-            <w:tcBorders>
-              <w:top w:val="single" w:sz="4" w:color="B8CCE4" w:space="0"/>
-              <w:left w:val="single" w:sz="4" w:color="B8CCE4" w:space="0"/>
-              <w:bottom w:val="single" w:sz="4" w:color="B8CCE4" w:space="0"/>
-              <w:right w:val="single" w:sz="4" w:color="B8CCE4" w:space="0"/>
-            </w:tcBorders>
-          </w:tcPr>
-          <w:p/>
-        </w:tc>
-        <w:tc>
-          <w:tcPr>
-            <w:tcW w:type="dxa" w:w="729"/>
-            <w:tcBorders>
-              <w:top w:val="single" w:sz="4" w:color="B8CCE4" w:space="0"/>
-              <w:left w:val="single" w:sz="4" w:color="B8CCE4" w:space="0"/>
-              <w:bottom w:val="single" w:sz="4" w:color="B8CCE4" w:space="0"/>
-              <w:right w:val="single" w:sz="4" w:color="B8CCE4" w:space="0"/>
-            </w:tcBorders>
-          </w:tcPr>
-          <w:p/>
-        </w:tc>
-        <w:tc>
-          <w:tcPr>
-            <w:tcW w:type="dxa" w:w="729"/>
-            <w:tcBorders>
-              <w:top w:val="single" w:sz="4" w:color="B8CCE4" w:space="0"/>
-              <w:left w:val="single" w:sz="4" w:color="B8CCE4" w:space="0"/>
-              <w:bottom w:val="single" w:sz="4" w:color="B8CCE4" w:space="0"/>
-              <w:right w:val="single" w:sz="4" w:color="B8CCE4" w:space="0"/>
-            </w:tcBorders>
-          </w:tcPr>
-          <w:p/>
-        </w:tc>
-        <w:tc>
-          <w:tcPr>
-            <w:tcW w:type="dxa" w:w="729"/>
-            <w:tcBorders>
-              <w:top w:val="single" w:sz="4" w:color="B8CCE4" w:space="0"/>
-              <w:left w:val="single" w:sz="4" w:color="B8CCE4" w:space="0"/>
-              <w:bottom w:val="single" w:sz="4" w:color="B8CCE4" w:space="0"/>
-              <w:right w:val="single" w:sz="4" w:color="B8CCE4" w:space="0"/>
-            </w:tcBorders>
-          </w:tcPr>
-          <w:p/>
-        </w:tc>
-        <w:tc>
-          <w:tcPr>
-            <w:tcW w:type="dxa" w:w="729"/>
-            <w:tcBorders>
-              <w:top w:val="single" w:sz="4" w:color="B8CCE4" w:space="0"/>
-              <w:left w:val="single" w:sz="4" w:color="B8CCE4" w:space="0"/>
-              <w:bottom w:val="single" w:sz="4" w:color="B8CCE4" w:space="0"/>
-              <w:right w:val="single" w:sz="4" w:color="B8CCE4" w:space="0"/>
-            </w:tcBorders>
-          </w:tcPr>
-          <w:p/>
-        </w:tc>
-        <w:tc>
-          <w:tcPr>
-            <w:tcW w:type="dxa" w:w="729"/>
-            <w:tcBorders>
-              <w:top w:val="single" w:sz="4" w:color="B8CCE4" w:space="0"/>
-              <w:left w:val="single" w:sz="4" w:color="B8CCE4" w:space="0"/>
-              <w:bottom w:val="single" w:sz="4" w:color="B8CCE4" w:space="0"/>
-              <w:right w:val="single" w:sz="4" w:color="B8CCE4" w:space="0"/>
-            </w:tcBorders>
-          </w:tcPr>
-          <w:p/>
-        </w:tc>
-        <w:tc>
-          <w:tcPr>
-            <w:tcW w:type="dxa" w:w="729"/>
-            <w:tcBorders>
-              <w:top w:val="single" w:sz="4" w:color="B8CCE4" w:space="0"/>
-              <w:left w:val="single" w:sz="4" w:color="B8CCE4" w:space="0"/>
-              <w:bottom w:val="single" w:sz="4" w:color="B8CCE4" w:space="0"/>
-              <w:right w:val="single" w:sz="4" w:color="B8CCE4" w:space="0"/>
-            </w:tcBorders>
-          </w:tcPr>
-          <w:p/>
-        </w:tc>
-        <w:tc>
-          <w:tcPr>
-            <w:tcW w:type="dxa" w:w="729"/>
-            <w:tcBorders>
-              <w:top w:val="single" w:sz="4" w:color="B8CCE4" w:space="0"/>
-              <w:left w:val="single" w:sz="4" w:color="B8CCE4" w:space="0"/>
-              <w:bottom w:val="single" w:sz="4" w:color="B8CCE4" w:space="0"/>
-              <w:right w:val="single" w:sz="4" w:color="B8CCE4" w:space="0"/>
-            </w:tcBorders>
-          </w:tcPr>
-          <w:p/>
-        </w:tc>
-        <w:tc>
-          <w:tcPr>
-            <w:tcW w:type="dxa" w:w="729"/>
-            <w:tcBorders>
-              <w:top w:val="single" w:sz="4" w:color="B8CCE4" w:space="0"/>
-              <w:left w:val="single" w:sz="4" w:color="B8CCE4" w:space="0"/>
-              <w:bottom w:val="single" w:sz="4" w:color="B8CCE4" w:space="0"/>
-              <w:right w:val="single" w:sz="4" w:color="B8CCE4" w:space="0"/>
-            </w:tcBorders>
-          </w:tcPr>
-          <w:p/>
-        </w:tc>
-        <w:tc>
-          <w:tcPr>
-            <w:tcW w:type="dxa" w:w="729"/>
-            <w:tcBorders>
-              <w:top w:val="single" w:sz="4" w:color="B8CCE4" w:space="0"/>
-              <w:left w:val="single" w:sz="4" w:color="B8CCE4" w:space="0"/>
-              <w:bottom w:val="single" w:sz="4" w:color="B8CCE4" w:space="0"/>
-              <w:right w:val="single" w:sz="4" w:color="B8CCE4" w:space="0"/>
-            </w:tcBorders>
-          </w:tcPr>
-          <w:p/>
-        </w:tc>
-        <w:tc>
-          <w:tcPr>
-            <w:tcW w:type="dxa" w:w="729"/>
-            <w:tcBorders>
-              <w:top w:val="single" w:sz="4" w:color="B8CCE4" w:space="0"/>
-              <w:left w:val="single" w:sz="4" w:color="B8CCE4" w:space="0"/>
-              <w:bottom w:val="single" w:sz="4" w:color="B8CCE4" w:space="0"/>
-              <w:right w:val="single" w:sz="4" w:color="B8CCE4" w:space="0"/>
-            </w:tcBorders>
-          </w:tcPr>
-          <w:p/>
-        </w:tc>
-        <w:tc>
-          <w:tcPr>
-            <w:tcW w:type="dxa" w:w="729"/>
-            <w:tcBorders>
-              <w:top w:val="single" w:sz="4" w:color="B8CCE4" w:space="0"/>
-              <w:left w:val="single" w:sz="4" w:color="B8CCE4" w:space="0"/>
-              <w:bottom w:val="single" w:sz="4" w:color="B8CCE4" w:space="0"/>
-              <w:right w:val="single" w:sz="4" w:color="B8CCE4" w:space="0"/>
-            </w:tcBorders>
-          </w:tcPr>
-          <w:p/>
-        </w:tc>
-        <w:tc>
-          <w:tcPr>
-            <w:tcW w:type="dxa" w:w="729"/>
-            <w:tcBorders>
-              <w:top w:val="single" w:sz="4" w:color="B8CCE4" w:space="0"/>
-              <w:left w:val="single" w:sz="4" w:color="B8CCE4" w:space="0"/>
-              <w:bottom w:val="single" w:sz="4" w:color="B8CCE4" w:space="0"/>
-              <w:right w:val="single" w:sz="4" w:color="B8CCE4" w:space="0"/>
-            </w:tcBorders>
-          </w:tcPr>
-          <w:p/>
-        </w:tc>
-      </w:tr>
-      <w:tr>
-        <w:trPr>
-          <w:trHeight w:val="360" w:hRule="atLeast"/>
-        </w:trPr>
-        <w:tc>
-          <w:tcPr>
-            <w:tcW w:type="dxa" w:w="729"/>
-            <w:tcBorders>
-              <w:top w:val="single" w:sz="4" w:color="B8CCE4" w:space="0"/>
-              <w:left w:val="single" w:sz="4" w:color="B8CCE4" w:space="0"/>
-              <w:bottom w:val="single" w:sz="4" w:color="B8CCE4" w:space="0"/>
-              <w:right w:val="single" w:sz="4" w:color="B8CCE4" w:space="0"/>
-            </w:tcBorders>
-          </w:tcPr>
-          <w:p/>
-        </w:tc>
-        <w:tc>
-          <w:tcPr>
-            <w:tcW w:type="dxa" w:w="1458"/>
-            <w:gridSpan w:val="2"/>
-            <w:tcBorders>
-              <w:top w:val="none" w:sz="0" w:color="FFFFFF" w:space="0"/>
-              <w:left w:val="none" w:sz="0" w:color="FFFFFF" w:space="0"/>
-              <w:bottom w:val="none" w:sz="0" w:color="FFFFFF" w:space="0"/>
-              <w:right w:val="none" w:sz="0" w:color="FFFFFF" w:space="0"/>
-            </w:tcBorders>
-          </w:tcPr>
-          <w:p/>
-          <w:p>
-            <w:pPr>
-              <w:spacing w:before="160" w:after="160"/>
-              <w:jc w:val="center"/>
-            </w:pPr>
-            <w:r>
-              <w:rPr>
-                <w:b/>
-                <w:sz w:val="26"/>
-                <w:u w:val="single"/>
-              </w:rPr>
-              <w:t>Submitted to</w:t>
-            </w:r>
-          </w:p>
-          <w:p>
-            <w:pPr>
-              <w:spacing w:before="0" w:after="80"/>
-              <w:jc w:val="center"/>
-            </w:pPr>
-            <w:r>
-              <w:rPr>
-                <w:b/>
-                <w:sz w:val="26"/>
-                <w:u w:val="single"/>
-              </w:rPr>
-              <w:t>{{ bank_name }}</w:t>
-            </w:r>
-          </w:p>
-          <w:p>
-            <w:pPr>
-              <w:spacing w:before="0" w:after="160"/>
-              <w:jc w:val="center"/>
-            </w:pPr>
-            <w:r>
-              <w:rPr>
-                <w:b w:val="0"/>
-                <w:sz w:val="22"/>
-                <w:u w:val="none"/>
-              </w:rPr>
-              <w:t>{{ bank_branch }}</w:t>
-            </w:r>
-          </w:p>
-        </w:tc>
-        <w:tc>
-          <w:tcPr>
-            <w:tcW w:type="dxa" w:w="729"/>
-          </w:tcPr>
-          <w:p/>
-        </w:tc>
-        <w:tc>
-          <w:tcPr>
-            <w:tcW w:type="dxa" w:w="729"/>
-          </w:tcPr>
-          <w:p/>
-        </w:tc>
-        <w:tc>
-          <w:tcPr>
-            <w:tcW w:type="dxa" w:w="729"/>
-          </w:tcPr>
-          <w:p/>
-        </w:tc>
-        <w:tc>
-          <w:tcPr>
-            <w:tcW w:type="dxa" w:w="729"/>
-          </w:tcPr>
-          <w:p/>
-        </w:tc>
-        <w:tc>
-          <w:tcPr>
-            <w:tcW w:type="dxa" w:w="729"/>
-          </w:tcPr>
-          <w:p/>
-        </w:tc>
-        <w:tc>
-          <w:tcPr>
-            <w:tcW w:type="dxa" w:w="729"/>
-          </w:tcPr>
-          <w:p/>
-        </w:tc>
-        <w:tc>
-          <w:tcPr>
-            <w:tcW w:type="dxa" w:w="729"/>
-          </w:tcPr>
-          <w:p/>
-        </w:tc>
-        <w:tc>
-          <w:tcPr>
-            <w:tcW w:type="dxa" w:w="729"/>
-          </w:tcPr>
-          <w:p/>
-        </w:tc>
-        <w:tc>
-          <w:tcPr>
-            <w:tcW w:type="dxa" w:w="729"/>
-          </w:tcPr>
-          <w:p/>
-        </w:tc>
-        <w:tc>
-          <w:tcPr>
-            <w:tcW w:type="dxa" w:w="729"/>
-          </w:tcPr>
-          <w:p/>
-        </w:tc>
-        <w:tc>
-          <w:tcPr>
-            <w:tcW w:type="dxa" w:w="729"/>
-            <w:tcBorders>
-              <w:top w:val="single" w:sz="4" w:color="B8CCE4" w:space="0"/>
-              <w:left w:val="single" w:sz="4" w:color="B8CCE4" w:space="0"/>
-              <w:bottom w:val="single" w:sz="4" w:color="B8CCE4" w:space="0"/>
-              <w:right w:val="single" w:sz="4" w:color="B8CCE4" w:space="0"/>
-            </w:tcBorders>
-          </w:tcPr>
-          <w:p/>
-        </w:tc>
-      </w:tr>
-      <w:tr>
-        <w:trPr>
-          <w:trHeight w:val="95" w:hRule="exact"/>
-        </w:trPr>
-        <w:tc>
-          <w:tcPr>
-            <w:tcW w:type="dxa" w:w="729"/>
-            <w:tcBorders>
-              <w:top w:val="single" w:sz="4" w:color="B8CCE4" w:space="0"/>
-              <w:left w:val="single" w:sz="4" w:color="B8CCE4" w:space="0"/>
-              <w:bottom w:val="single" w:sz="4" w:color="B8CCE4" w:space="0"/>
-              <w:right w:val="single" w:sz="4" w:color="B8CCE4" w:space="0"/>
-            </w:tcBorders>
-          </w:tcPr>
-          <w:p/>
-        </w:tc>
-        <w:tc>
-          <w:tcPr>
-            <w:tcW w:type="dxa" w:w="729"/>
-            <w:tcBorders>
-              <w:top w:val="single" w:sz="4" w:color="B8CCE4" w:space="0"/>
-              <w:left w:val="single" w:sz="4" w:color="B8CCE4" w:space="0"/>
-              <w:bottom w:val="single" w:sz="4" w:color="B8CCE4" w:space="0"/>
-              <w:right w:val="single" w:sz="4" w:color="B8CCE4" w:space="0"/>
-            </w:tcBorders>
-          </w:tcPr>
-          <w:p/>
-        </w:tc>
-        <w:tc>
-          <w:tcPr>
-            <w:tcW w:type="dxa" w:w="729"/>
-            <w:tcBorders>
-              <w:top w:val="single" w:sz="4" w:color="B8CCE4" w:space="0"/>
-              <w:left w:val="single" w:sz="4" w:color="B8CCE4" w:space="0"/>
-              <w:bottom w:val="single" w:sz="4" w:color="B8CCE4" w:space="0"/>
-              <w:right w:val="single" w:sz="4" w:color="B8CCE4" w:space="0"/>
-            </w:tcBorders>
-          </w:tcPr>
-          <w:p/>
-        </w:tc>
-        <w:tc>
-          <w:tcPr>
-            <w:tcW w:type="dxa" w:w="729"/>
-            <w:tcBorders>
-              <w:top w:val="single" w:sz="4" w:color="B8CCE4" w:space="0"/>
-              <w:left w:val="single" w:sz="4" w:color="B8CCE4" w:space="0"/>
-              <w:bottom w:val="single" w:sz="4" w:color="B8CCE4" w:space="0"/>
-              <w:right w:val="single" w:sz="4" w:color="B8CCE4" w:space="0"/>
-            </w:tcBorders>
-          </w:tcPr>
-          <w:p/>
-        </w:tc>
-        <w:tc>
-          <w:tcPr>
-            <w:tcW w:type="dxa" w:w="729"/>
-            <w:tcBorders>
-              <w:top w:val="single" w:sz="4" w:color="B8CCE4" w:space="0"/>
-              <w:left w:val="single" w:sz="4" w:color="B8CCE4" w:space="0"/>
-              <w:bottom w:val="single" w:sz="4" w:color="B8CCE4" w:space="0"/>
-              <w:right w:val="single" w:sz="4" w:color="B8CCE4" w:space="0"/>
-            </w:tcBorders>
-          </w:tcPr>
-          <w:p/>
-        </w:tc>
-        <w:tc>
-          <w:tcPr>
-            <w:tcW w:type="dxa" w:w="729"/>
-            <w:tcBorders>
-              <w:top w:val="single" w:sz="4" w:color="B8CCE4" w:space="0"/>
-              <w:left w:val="single" w:sz="4" w:color="B8CCE4" w:space="0"/>
-              <w:bottom w:val="single" w:sz="4" w:color="B8CCE4" w:space="0"/>
-              <w:right w:val="single" w:sz="4" w:color="B8CCE4" w:space="0"/>
-            </w:tcBorders>
-          </w:tcPr>
-          <w:p/>
-        </w:tc>
-        <w:tc>
-          <w:tcPr>
-            <w:tcW w:type="dxa" w:w="729"/>
-            <w:tcBorders>
-              <w:top w:val="single" w:sz="4" w:color="B8CCE4" w:space="0"/>
-              <w:left w:val="single" w:sz="4" w:color="B8CCE4" w:space="0"/>
-              <w:bottom w:val="single" w:sz="4" w:color="B8CCE4" w:space="0"/>
-              <w:right w:val="single" w:sz="4" w:color="B8CCE4" w:space="0"/>
-            </w:tcBorders>
-          </w:tcPr>
-          <w:p/>
-        </w:tc>
-        <w:tc>
-          <w:tcPr>
-            <w:tcW w:type="dxa" w:w="729"/>
-            <w:tcBorders>
-              <w:top w:val="single" w:sz="4" w:color="B8CCE4" w:space="0"/>
-              <w:left w:val="single" w:sz="4" w:color="B8CCE4" w:space="0"/>
-              <w:bottom w:val="single" w:sz="4" w:color="B8CCE4" w:space="0"/>
-              <w:right w:val="single" w:sz="4" w:color="B8CCE4" w:space="0"/>
-            </w:tcBorders>
-          </w:tcPr>
-          <w:p/>
-        </w:tc>
-        <w:tc>
-          <w:tcPr>
-            <w:tcW w:type="dxa" w:w="729"/>
-            <w:tcBorders>
-              <w:top w:val="single" w:sz="4" w:color="B8CCE4" w:space="0"/>
-              <w:left w:val="single" w:sz="4" w:color="B8CCE4" w:space="0"/>
-              <w:bottom w:val="single" w:sz="4" w:color="B8CCE4" w:space="0"/>
-              <w:right w:val="single" w:sz="4" w:color="B8CCE4" w:space="0"/>
-            </w:tcBorders>
-          </w:tcPr>
-          <w:p/>
-        </w:tc>
-        <w:tc>
-          <w:tcPr>
-            <w:tcW w:type="dxa" w:w="729"/>
-            <w:tcBorders>
-              <w:top w:val="single" w:sz="4" w:color="B8CCE4" w:space="0"/>
-              <w:left w:val="single" w:sz="4" w:color="B8CCE4" w:space="0"/>
-              <w:bottom w:val="single" w:sz="4" w:color="B8CCE4" w:space="0"/>
-              <w:right w:val="single" w:sz="4" w:color="B8CCE4" w:space="0"/>
-            </w:tcBorders>
-          </w:tcPr>
-          <w:p/>
-        </w:tc>
-        <w:tc>
-          <w:tcPr>
-            <w:tcW w:type="dxa" w:w="729"/>
-            <w:tcBorders>
-              <w:top w:val="single" w:sz="4" w:color="B8CCE4" w:space="0"/>
-              <w:left w:val="single" w:sz="4" w:color="B8CCE4" w:space="0"/>
-              <w:bottom w:val="single" w:sz="4" w:color="B8CCE4" w:space="0"/>
-              <w:right w:val="single" w:sz="4" w:color="B8CCE4" w:space="0"/>
-            </w:tcBorders>
-          </w:tcPr>
-          <w:p/>
-        </w:tc>
-        <w:tc>
-          <w:tcPr>
-            <w:tcW w:type="dxa" w:w="729"/>
-            <w:tcBorders>
-              <w:top w:val="single" w:sz="4" w:color="B8CCE4" w:space="0"/>
-              <w:left w:val="single" w:sz="4" w:color="B8CCE4" w:space="0"/>
-              <w:bottom w:val="single" w:sz="4" w:color="B8CCE4" w:space="0"/>
-              <w:right w:val="single" w:sz="4" w:color="B8CCE4" w:space="0"/>
-            </w:tcBorders>
-          </w:tcPr>
-          <w:p/>
-        </w:tc>
-        <w:tc>
-          <w:tcPr>
-            <w:tcW w:type="dxa" w:w="729"/>
-            <w:tcBorders>
-              <w:top w:val="single" w:sz="4" w:color="B8CCE4" w:space="0"/>
-              <w:left w:val="single" w:sz="4" w:color="B8CCE4" w:space="0"/>
-              <w:bottom w:val="single" w:sz="4" w:color="B8CCE4" w:space="0"/>
-              <w:right w:val="single" w:sz="4" w:color="B8CCE4" w:space="0"/>
-            </w:tcBorders>
-          </w:tcPr>
-          <w:p/>
-        </w:tc>
-        <w:tc>
-          <w:tcPr>
-            <w:tcW w:type="dxa" w:w="729"/>
-            <w:tcBorders>
-              <w:top w:val="single" w:sz="4" w:color="B8CCE4" w:space="0"/>
-              <w:left w:val="single" w:sz="4" w:color="B8CCE4" w:space="0"/>
-              <w:bottom w:val="single" w:sz="4" w:color="B8CCE4" w:space="0"/>
-              <w:right w:val="single" w:sz="4" w:color="B8CCE4" w:space="0"/>
-            </w:tcBorders>
-          </w:tcPr>
-          <w:p/>
-        </w:tc>
-      </w:tr>
-      <w:tr>
-        <w:trPr>
-          <w:trHeight w:val="180" w:hRule="atLeast"/>
-        </w:trPr>
-        <w:tc>
-          <w:tcPr>
-            <w:tcW w:type="dxa" w:w="729"/>
-            <w:tcBorders>
-              <w:top w:val="single" w:sz="4" w:color="B8CCE4" w:space="0"/>
-              <w:left w:val="single" w:sz="4" w:color="B8CCE4" w:space="0"/>
-              <w:bottom w:val="single" w:sz="4" w:color="B8CCE4" w:space="0"/>
-              <w:right w:val="single" w:sz="4" w:color="B8CCE4" w:space="0"/>
-            </w:tcBorders>
-          </w:tcPr>
-          <w:p/>
-        </w:tc>
-        <w:tc>
-          <w:tcPr>
-            <w:tcW w:type="dxa" w:w="1458"/>
-            <w:gridSpan w:val="2"/>
-            <w:tcBorders>
-              <w:top w:val="none" w:sz="0" w:color="FFFFFF" w:space="0"/>
-              <w:left w:val="none" w:sz="0" w:color="FFFFFF" w:space="0"/>
-              <w:bottom w:val="none" w:sz="0" w:color="FFFFFF" w:space="0"/>
-              <w:right w:val="none" w:sz="0" w:color="FFFFFF" w:space="0"/>
-            </w:tcBorders>
-          </w:tcPr>
-          <w:p/>
-          <w:p>
-            <w:pPr>
-              <w:spacing w:before="160" w:after="160"/>
-              <w:jc w:val="center"/>
-            </w:pPr>
-            <w:r>
-              <w:rPr>
-                <w:b/>
-                <w:sz w:val="24"/>
-                <w:u w:val="none"/>
-              </w:rPr>
-              <w:t>Fair Market Value of the Land &amp; Building: NRs. {{ fair_market_value }}</w:t>
-            </w:r>
-          </w:p>
-        </w:tc>
-        <w:tc>
-          <w:tcPr>
-            <w:tcW w:type="dxa" w:w="729"/>
-          </w:tcPr>
-          <w:p/>
-        </w:tc>
-        <w:tc>
-          <w:tcPr>
-            <w:tcW w:type="dxa" w:w="729"/>
-          </w:tcPr>
-          <w:p/>
-        </w:tc>
-        <w:tc>
-          <w:tcPr>
-            <w:tcW w:type="dxa" w:w="729"/>
-          </w:tcPr>
-          <w:p/>
-        </w:tc>
-        <w:tc>
-          <w:tcPr>
-            <w:tcW w:type="dxa" w:w="729"/>
-          </w:tcPr>
-          <w:p/>
-        </w:tc>
-        <w:tc>
-          <w:tcPr>
-            <w:tcW w:type="dxa" w:w="729"/>
-          </w:tcPr>
-          <w:p/>
-        </w:tc>
-        <w:tc>
-          <w:tcPr>
-            <w:tcW w:type="dxa" w:w="729"/>
-          </w:tcPr>
-          <w:p/>
-        </w:tc>
-        <w:tc>
-          <w:tcPr>
-            <w:tcW w:type="dxa" w:w="729"/>
-          </w:tcPr>
-          <w:p/>
-        </w:tc>
-        <w:tc>
-          <w:tcPr>
-            <w:tcW w:type="dxa" w:w="729"/>
-          </w:tcPr>
-          <w:p/>
-        </w:tc>
-        <w:tc>
-          <w:tcPr>
-            <w:tcW w:type="dxa" w:w="729"/>
-          </w:tcPr>
-          <w:p/>
-        </w:tc>
-        <w:tc>
-          <w:tcPr>
-            <w:tcW w:type="dxa" w:w="729"/>
-          </w:tcPr>
-          <w:p/>
-        </w:tc>
-        <w:tc>
-          <w:tcPr>
-            <w:tcW w:type="dxa" w:w="729"/>
-            <w:tcBorders>
-              <w:top w:val="single" w:sz="4" w:color="B8CCE4" w:space="0"/>
-              <w:left w:val="single" w:sz="4" w:color="B8CCE4" w:space="0"/>
-              <w:bottom w:val="single" w:sz="4" w:color="B8CCE4" w:space="0"/>
-              <w:right w:val="single" w:sz="4" w:color="B8CCE4" w:space="0"/>
-            </w:tcBorders>
-          </w:tcPr>
-          <w:p/>
-        </w:tc>
-      </w:tr>
-      <w:tr>
-        <w:trPr>
-          <w:trHeight w:val="95" w:hRule="exact"/>
-        </w:trPr>
-        <w:tc>
-          <w:tcPr>
-            <w:tcW w:type="dxa" w:w="729"/>
-            <w:tcBorders>
-              <w:top w:val="single" w:sz="4" w:color="B8CCE4" w:space="0"/>
-              <w:left w:val="single" w:sz="4" w:color="B8CCE4" w:space="0"/>
-              <w:bottom w:val="single" w:sz="4" w:color="B8CCE4" w:space="0"/>
-              <w:right w:val="single" w:sz="4" w:color="B8CCE4" w:space="0"/>
-            </w:tcBorders>
-          </w:tcPr>
-          <w:p/>
-        </w:tc>
-        <w:tc>
-          <w:tcPr>
-            <w:tcW w:type="dxa" w:w="729"/>
-            <w:tcBorders>
-              <w:top w:val="single" w:sz="4" w:color="B8CCE4" w:space="0"/>
-              <w:left w:val="single" w:sz="4" w:color="B8CCE4" w:space="0"/>
-              <w:bottom w:val="single" w:sz="4" w:color="B8CCE4" w:space="0"/>
-              <w:right w:val="single" w:sz="4" w:color="B8CCE4" w:space="0"/>
-            </w:tcBorders>
-          </w:tcPr>
-          <w:p/>
-        </w:tc>
-        <w:tc>
-          <w:tcPr>
-            <w:tcW w:type="dxa" w:w="729"/>
-            <w:tcBorders>
-              <w:top w:val="single" w:sz="4" w:color="B8CCE4" w:space="0"/>
-              <w:left w:val="single" w:sz="4" w:color="B8CCE4" w:space="0"/>
-              <w:bottom w:val="single" w:sz="4" w:color="B8CCE4" w:space="0"/>
-              <w:right w:val="single" w:sz="4" w:color="B8CCE4" w:space="0"/>
-            </w:tcBorders>
-          </w:tcPr>
-          <w:p/>
-        </w:tc>
-        <w:tc>
-          <w:tcPr>
-            <w:tcW w:type="dxa" w:w="729"/>
-            <w:tcBorders>
-              <w:top w:val="single" w:sz="4" w:color="B8CCE4" w:space="0"/>
-              <w:left w:val="single" w:sz="4" w:color="B8CCE4" w:space="0"/>
-              <w:bottom w:val="single" w:sz="4" w:color="B8CCE4" w:space="0"/>
-              <w:right w:val="single" w:sz="4" w:color="B8CCE4" w:space="0"/>
-            </w:tcBorders>
-          </w:tcPr>
-          <w:p/>
-        </w:tc>
-        <w:tc>
-          <w:tcPr>
-            <w:tcW w:type="dxa" w:w="729"/>
-            <w:tcBorders>
-              <w:top w:val="single" w:sz="4" w:color="B8CCE4" w:space="0"/>
-              <w:left w:val="single" w:sz="4" w:color="B8CCE4" w:space="0"/>
-              <w:bottom w:val="single" w:sz="4" w:color="B8CCE4" w:space="0"/>
-              <w:right w:val="single" w:sz="4" w:color="B8CCE4" w:space="0"/>
-            </w:tcBorders>
-          </w:tcPr>
-          <w:p/>
-        </w:tc>
-        <w:tc>
-          <w:tcPr>
-            <w:tcW w:type="dxa" w:w="729"/>
-            <w:tcBorders>
-              <w:top w:val="single" w:sz="4" w:color="B8CCE4" w:space="0"/>
-              <w:left w:val="single" w:sz="4" w:color="B8CCE4" w:space="0"/>
-              <w:bottom w:val="single" w:sz="4" w:color="B8CCE4" w:space="0"/>
-              <w:right w:val="single" w:sz="4" w:color="B8CCE4" w:space="0"/>
-            </w:tcBorders>
-          </w:tcPr>
-          <w:p/>
-        </w:tc>
-        <w:tc>
-          <w:tcPr>
-            <w:tcW w:type="dxa" w:w="729"/>
-            <w:tcBorders>
-              <w:top w:val="single" w:sz="4" w:color="B8CCE4" w:space="0"/>
-              <w:left w:val="single" w:sz="4" w:color="B8CCE4" w:space="0"/>
-              <w:bottom w:val="single" w:sz="4" w:color="B8CCE4" w:space="0"/>
-              <w:right w:val="single" w:sz="4" w:color="B8CCE4" w:space="0"/>
-            </w:tcBorders>
-          </w:tcPr>
-          <w:p/>
-        </w:tc>
-        <w:tc>
-          <w:tcPr>
-            <w:tcW w:type="dxa" w:w="729"/>
-            <w:tcBorders>
-              <w:top w:val="single" w:sz="4" w:color="B8CCE4" w:space="0"/>
-              <w:left w:val="single" w:sz="4" w:color="B8CCE4" w:space="0"/>
-              <w:bottom w:val="single" w:sz="4" w:color="B8CCE4" w:space="0"/>
-              <w:right w:val="single" w:sz="4" w:color="B8CCE4" w:space="0"/>
-            </w:tcBorders>
-          </w:tcPr>
-          <w:p/>
-        </w:tc>
-        <w:tc>
-          <w:tcPr>
-            <w:tcW w:type="dxa" w:w="729"/>
-            <w:tcBorders>
-              <w:top w:val="single" w:sz="4" w:color="B8CCE4" w:space="0"/>
-              <w:left w:val="single" w:sz="4" w:color="B8CCE4" w:space="0"/>
-              <w:bottom w:val="single" w:sz="4" w:color="B8CCE4" w:space="0"/>
-              <w:right w:val="single" w:sz="4" w:color="B8CCE4" w:space="0"/>
-            </w:tcBorders>
-          </w:tcPr>
-          <w:p/>
-        </w:tc>
-        <w:tc>
-          <w:tcPr>
-            <w:tcW w:type="dxa" w:w="729"/>
-            <w:tcBorders>
-              <w:top w:val="single" w:sz="4" w:color="B8CCE4" w:space="0"/>
-              <w:left w:val="single" w:sz="4" w:color="B8CCE4" w:space="0"/>
-              <w:bottom w:val="single" w:sz="4" w:color="B8CCE4" w:space="0"/>
-              <w:right w:val="single" w:sz="4" w:color="B8CCE4" w:space="0"/>
-            </w:tcBorders>
-          </w:tcPr>
-          <w:p/>
-        </w:tc>
-        <w:tc>
-          <w:tcPr>
-            <w:tcW w:type="dxa" w:w="729"/>
-            <w:tcBorders>
-              <w:top w:val="single" w:sz="4" w:color="B8CCE4" w:space="0"/>
-              <w:left w:val="single" w:sz="4" w:color="B8CCE4" w:space="0"/>
-              <w:bottom w:val="single" w:sz="4" w:color="B8CCE4" w:space="0"/>
-              <w:right w:val="single" w:sz="4" w:color="B8CCE4" w:space="0"/>
-            </w:tcBorders>
-          </w:tcPr>
-          <w:p/>
-        </w:tc>
-        <w:tc>
-          <w:tcPr>
-            <w:tcW w:type="dxa" w:w="729"/>
-            <w:tcBorders>
-              <w:top w:val="single" w:sz="4" w:color="B8CCE4" w:space="0"/>
-              <w:left w:val="single" w:sz="4" w:color="B8CCE4" w:space="0"/>
-              <w:bottom w:val="single" w:sz="4" w:color="B8CCE4" w:space="0"/>
-              <w:right w:val="single" w:sz="4" w:color="B8CCE4" w:space="0"/>
-            </w:tcBorders>
-          </w:tcPr>
-          <w:p/>
-        </w:tc>
-        <w:tc>
-          <w:tcPr>
-            <w:tcW w:type="dxa" w:w="729"/>
-            <w:tcBorders>
-              <w:top w:val="single" w:sz="4" w:color="B8CCE4" w:space="0"/>
-              <w:left w:val="single" w:sz="4" w:color="B8CCE4" w:space="0"/>
-              <w:bottom w:val="single" w:sz="4" w:color="B8CCE4" w:space="0"/>
-              <w:right w:val="single" w:sz="4" w:color="B8CCE4" w:space="0"/>
-            </w:tcBorders>
-          </w:tcPr>
-          <w:p/>
-        </w:tc>
-        <w:tc>
-          <w:tcPr>
-            <w:tcW w:type="dxa" w:w="729"/>
-            <w:tcBorders>
-              <w:top w:val="single" w:sz="4" w:color="B8CCE4" w:space="0"/>
-              <w:left w:val="single" w:sz="4" w:color="B8CCE4" w:space="0"/>
-              <w:bottom w:val="single" w:sz="4" w:color="B8CCE4" w:space="0"/>
-              <w:right w:val="single" w:sz="4" w:color="B8CCE4" w:space="0"/>
-            </w:tcBorders>
-          </w:tcPr>
-          <w:p/>
-        </w:tc>
-      </w:tr>
-      <w:tr>
-        <w:trPr>
-          <w:trHeight w:val="160" w:hRule="atLeast"/>
-        </w:trPr>
-        <w:tc>
-          <w:tcPr>
-            <w:tcW w:type="dxa" w:w="729"/>
-            <w:tcBorders>
-              <w:top w:val="single" w:sz="4" w:color="B8CCE4" w:space="0"/>
-              <w:left w:val="single" w:sz="4" w:color="B8CCE4" w:space="0"/>
-              <w:bottom w:val="single" w:sz="4" w:color="B8CCE4" w:space="0"/>
-              <w:right w:val="single" w:sz="4" w:color="B8CCE4" w:space="0"/>
-            </w:tcBorders>
-          </w:tcPr>
-          <w:p/>
-        </w:tc>
-        <w:tc>
-          <w:tcPr>
-            <w:tcW w:type="dxa" w:w="1458"/>
-            <w:gridSpan w:val="2"/>
-            <w:tcBorders>
-              <w:top w:val="none" w:sz="0" w:color="FFFFFF" w:space="0"/>
-              <w:left w:val="none" w:sz="0" w:color="FFFFFF" w:space="0"/>
-              <w:bottom w:val="none" w:sz="0" w:color="FFFFFF" w:space="0"/>
-              <w:right w:val="none" w:sz="0" w:color="FFFFFF" w:space="0"/>
-            </w:tcBorders>
-          </w:tcPr>
-          <w:p/>
-          <w:p>
-            <w:pPr>
-              <w:spacing w:before="160" w:after="160"/>
-              <w:jc w:val="center"/>
-            </w:pPr>
-            <w:r>
-              <w:rPr>
-                <w:b/>
-                <w:sz w:val="26"/>
-                <w:u w:val="single"/>
-              </w:rPr>
-              <w:t>Prepared by</w:t>
-            </w:r>
-          </w:p>
-        </w:tc>
-        <w:tc>
-          <w:tcPr>
-            <w:tcW w:type="dxa" w:w="729"/>
-          </w:tcPr>
-          <w:p/>
-        </w:tc>
-        <w:tc>
-          <w:tcPr>
-            <w:tcW w:type="dxa" w:w="729"/>
-          </w:tcPr>
-          <w:p/>
-        </w:tc>
-        <w:tc>
-          <w:tcPr>
-            <w:tcW w:type="dxa" w:w="729"/>
-          </w:tcPr>
-          <w:p/>
-        </w:tc>
-        <w:tc>
-          <w:tcPr>
-            <w:tcW w:type="dxa" w:w="729"/>
-          </w:tcPr>
-          <w:p/>
-        </w:tc>
-        <w:tc>
-          <w:tcPr>
-            <w:tcW w:type="dxa" w:w="729"/>
-          </w:tcPr>
-          <w:p/>
-        </w:tc>
-        <w:tc>
-          <w:tcPr>
-            <w:tcW w:type="dxa" w:w="729"/>
-          </w:tcPr>
-          <w:p/>
-        </w:tc>
-        <w:tc>
-          <w:tcPr>
-            <w:tcW w:type="dxa" w:w="729"/>
-          </w:tcPr>
-          <w:p/>
-        </w:tc>
-        <w:tc>
-          <w:tcPr>
-            <w:tcW w:type="dxa" w:w="729"/>
-          </w:tcPr>
-          <w:p/>
-        </w:tc>
-        <w:tc>
-          <w:tcPr>
-            <w:tcW w:type="dxa" w:w="729"/>
-          </w:tcPr>
-          <w:p/>
-        </w:tc>
-        <w:tc>
-          <w:tcPr>
-            <w:tcW w:type="dxa" w:w="729"/>
-          </w:tcPr>
-          <w:p/>
-        </w:tc>
-        <w:tc>
-          <w:tcPr>
-            <w:tcW w:type="dxa" w:w="729"/>
-            <w:tcBorders>
-              <w:top w:val="single" w:sz="4" w:color="B8CCE4" w:space="0"/>
-              <w:left w:val="single" w:sz="4" w:color="B8CCE4" w:space="0"/>
-              <w:bottom w:val="single" w:sz="4" w:color="B8CCE4" w:space="0"/>
-              <w:right w:val="single" w:sz="4" w:color="B8CCE4" w:space="0"/>
-            </w:tcBorders>
-          </w:tcPr>
-          <w:p/>
-        </w:tc>
-      </w:tr>
-      <w:tr>
-        <w:trPr>
-          <w:trHeight w:val="1500" w:hRule="atLeast"/>
-        </w:trPr>
-        <w:tc>
-          <w:tcPr>
-            <w:tcW w:type="dxa" w:w="729"/>
-            <w:tcBorders>
-              <w:top w:val="single" w:sz="4" w:color="B8CCE4" w:space="0"/>
-              <w:left w:val="single" w:sz="4" w:color="B8CCE4" w:space="0"/>
-              <w:bottom w:val="single" w:sz="4" w:color="B8CCE4" w:space="0"/>
-              <w:right w:val="single" w:sz="4" w:color="B8CCE4" w:space="0"/>
-            </w:tcBorders>
-          </w:tcPr>
-          <w:p/>
-        </w:tc>
-        <w:tc>
-          <w:tcPr>
-            <w:tcW w:type="dxa" w:w="1458"/>
-            <w:gridSpan w:val="2"/>
-            <w:tcBorders>
-              <w:top w:val="none" w:sz="0" w:color="FFFFFF" w:space="0"/>
-              <w:left w:val="none" w:sz="0" w:color="FFFFFF" w:space="0"/>
-              <w:bottom w:val="none" w:sz="0" w:color="FFFFFF" w:space="0"/>
-              <w:right w:val="none" w:sz="0" w:color="FFFFFF" w:space="0"/>
-            </w:tcBorders>
-          </w:tcPr>
-          <w:p/>
-          <w:p>
-            <w:pPr>
-              <w:spacing w:before="0" w:after="0"/>
-              <w:jc w:val="center"/>
-            </w:pPr>
-            <w:r>
-              <w:rPr>
-                <w:b w:val="0"/>
-                <w:sz w:val="22"/>
-                <w:u w:val="none"/>
-              </w:rPr>
-            </w:r>
-          </w:p>
-        </w:tc>
-        <w:tc>
-          <w:tcPr>
-            <w:tcW w:type="dxa" w:w="729"/>
-          </w:tcPr>
-          <w:p/>
-        </w:tc>
-        <w:tc>
-          <w:tcPr>
-            <w:tcW w:type="dxa" w:w="729"/>
-          </w:tcPr>
-          <w:p/>
-        </w:tc>
-        <w:tc>
-          <w:tcPr>
-            <w:tcW w:type="dxa" w:w="729"/>
-          </w:tcPr>
-          <w:p/>
-        </w:tc>
-        <w:tc>
-          <w:tcPr>
-            <w:tcW w:type="dxa" w:w="729"/>
-          </w:tcPr>
-          <w:p/>
-        </w:tc>
-        <w:tc>
-          <w:tcPr>
-            <w:tcW w:type="dxa" w:w="729"/>
-          </w:tcPr>
-          <w:p/>
-        </w:tc>
-        <w:tc>
-          <w:tcPr>
-            <w:tcW w:type="dxa" w:w="729"/>
-          </w:tcPr>
-          <w:p/>
-        </w:tc>
-        <w:tc>
-          <w:tcPr>
-            <w:tcW w:type="dxa" w:w="729"/>
-          </w:tcPr>
-          <w:p/>
-        </w:tc>
-        <w:tc>
-          <w:tcPr>
-            <w:tcW w:type="dxa" w:w="729"/>
-          </w:tcPr>
-          <w:p/>
-        </w:tc>
-        <w:tc>
-          <w:tcPr>
-            <w:tcW w:type="dxa" w:w="729"/>
-          </w:tcPr>
-          <w:p/>
-        </w:tc>
-        <w:tc>
-          <w:tcPr>
-            <w:tcW w:type="dxa" w:w="729"/>
-          </w:tcPr>
-          <w:p/>
-        </w:tc>
-        <w:tc>
-          <w:tcPr>
-            <w:tcW w:type="dxa" w:w="729"/>
-            <w:tcBorders>
-              <w:top w:val="single" w:sz="4" w:color="B8CCE4" w:space="0"/>
-              <w:left w:val="single" w:sz="4" w:color="B8CCE4" w:space="0"/>
-              <w:bottom w:val="single" w:sz="4" w:color="B8CCE4" w:space="0"/>
-              <w:right w:val="single" w:sz="4" w:color="B8CCE4" w:space="0"/>
-            </w:tcBorders>
-          </w:tcPr>
-          <w:p/>
-        </w:tc>
-      </w:tr>
-      <w:tr>
-        <w:trPr>
-          <w:trHeight w:val="95" w:hRule="exact"/>
-        </w:trPr>
-        <w:tc>
-          <w:tcPr>
-            <w:tcW w:type="dxa" w:w="729"/>
-            <w:tcBorders>
-              <w:top w:val="single" w:sz="4" w:color="B8CCE4" w:space="0"/>
-              <w:left w:val="single" w:sz="4" w:color="B8CCE4" w:space="0"/>
-              <w:bottom w:val="single" w:sz="4" w:color="B8CCE4" w:space="0"/>
-              <w:right w:val="single" w:sz="4" w:color="B8CCE4" w:space="0"/>
-            </w:tcBorders>
-          </w:tcPr>
-          <w:p/>
-        </w:tc>
-        <w:tc>
-          <w:tcPr>
-            <w:tcW w:type="dxa" w:w="729"/>
-            <w:tcBorders>
-              <w:top w:val="single" w:sz="4" w:color="B8CCE4" w:space="0"/>
-              <w:left w:val="single" w:sz="4" w:color="B8CCE4" w:space="0"/>
-              <w:bottom w:val="single" w:sz="4" w:color="B8CCE4" w:space="0"/>
-              <w:right w:val="single" w:sz="4" w:color="B8CCE4" w:space="0"/>
-            </w:tcBorders>
-          </w:tcPr>
-          <w:p/>
-        </w:tc>
-        <w:tc>
-          <w:tcPr>
-            <w:tcW w:type="dxa" w:w="729"/>
-            <w:tcBorders>
-              <w:top w:val="single" w:sz="4" w:color="B8CCE4" w:space="0"/>
-              <w:left w:val="single" w:sz="4" w:color="B8CCE4" w:space="0"/>
-              <w:bottom w:val="single" w:sz="4" w:color="B8CCE4" w:space="0"/>
-              <w:right w:val="single" w:sz="4" w:color="B8CCE4" w:space="0"/>
-            </w:tcBorders>
-          </w:tcPr>
-          <w:p/>
-        </w:tc>
-        <w:tc>
-          <w:tcPr>
-            <w:tcW w:type="dxa" w:w="729"/>
-            <w:tcBorders>
-              <w:top w:val="single" w:sz="4" w:color="B8CCE4" w:space="0"/>
-              <w:left w:val="single" w:sz="4" w:color="B8CCE4" w:space="0"/>
-              <w:bottom w:val="single" w:sz="4" w:color="B8CCE4" w:space="0"/>
-              <w:right w:val="single" w:sz="4" w:color="B8CCE4" w:space="0"/>
-            </w:tcBorders>
-          </w:tcPr>
-          <w:p/>
-        </w:tc>
-        <w:tc>
-          <w:tcPr>
-            <w:tcW w:type="dxa" w:w="729"/>
-            <w:tcBorders>
-              <w:top w:val="single" w:sz="4" w:color="B8CCE4" w:space="0"/>
-              <w:left w:val="single" w:sz="4" w:color="B8CCE4" w:space="0"/>
-              <w:bottom w:val="single" w:sz="4" w:color="B8CCE4" w:space="0"/>
-              <w:right w:val="single" w:sz="4" w:color="B8CCE4" w:space="0"/>
-            </w:tcBorders>
-          </w:tcPr>
-          <w:p/>
-        </w:tc>
-        <w:tc>
-          <w:tcPr>
-            <w:tcW w:type="dxa" w:w="729"/>
-            <w:tcBorders>
-              <w:top w:val="single" w:sz="4" w:color="B8CCE4" w:space="0"/>
-              <w:left w:val="single" w:sz="4" w:color="B8CCE4" w:space="0"/>
-              <w:bottom w:val="single" w:sz="4" w:color="B8CCE4" w:space="0"/>
-              <w:right w:val="single" w:sz="4" w:color="B8CCE4" w:space="0"/>
-            </w:tcBorders>
-          </w:tcPr>
-          <w:p/>
-        </w:tc>
-        <w:tc>
-          <w:tcPr>
-            <w:tcW w:type="dxa" w:w="729"/>
-            <w:tcBorders>
-              <w:top w:val="single" w:sz="4" w:color="B8CCE4" w:space="0"/>
-              <w:left w:val="single" w:sz="4" w:color="B8CCE4" w:space="0"/>
-              <w:bottom w:val="single" w:sz="4" w:color="B8CCE4" w:space="0"/>
-              <w:right w:val="single" w:sz="4" w:color="B8CCE4" w:space="0"/>
-            </w:tcBorders>
-          </w:tcPr>
-          <w:p/>
-        </w:tc>
-        <w:tc>
-          <w:tcPr>
-            <w:tcW w:type="dxa" w:w="729"/>
-            <w:tcBorders>
-              <w:top w:val="single" w:sz="4" w:color="B8CCE4" w:space="0"/>
-              <w:left w:val="single" w:sz="4" w:color="B8CCE4" w:space="0"/>
-              <w:bottom w:val="single" w:sz="4" w:color="B8CCE4" w:space="0"/>
-              <w:right w:val="single" w:sz="4" w:color="B8CCE4" w:space="0"/>
-            </w:tcBorders>
-          </w:tcPr>
-          <w:p/>
-        </w:tc>
-        <w:tc>
-          <w:tcPr>
-            <w:tcW w:type="dxa" w:w="729"/>
-            <w:tcBorders>
-              <w:top w:val="single" w:sz="4" w:color="B8CCE4" w:space="0"/>
-              <w:left w:val="single" w:sz="4" w:color="B8CCE4" w:space="0"/>
-              <w:bottom w:val="single" w:sz="4" w:color="B8CCE4" w:space="0"/>
-              <w:right w:val="single" w:sz="4" w:color="B8CCE4" w:space="0"/>
-            </w:tcBorders>
-          </w:tcPr>
-          <w:p/>
-        </w:tc>
-        <w:tc>
-          <w:tcPr>
-            <w:tcW w:type="dxa" w:w="729"/>
-            <w:tcBorders>
-              <w:top w:val="single" w:sz="4" w:color="B8CCE4" w:space="0"/>
-              <w:left w:val="single" w:sz="4" w:color="B8CCE4" w:space="0"/>
-              <w:bottom w:val="single" w:sz="4" w:color="B8CCE4" w:space="0"/>
-              <w:right w:val="single" w:sz="4" w:color="B8CCE4" w:space="0"/>
-            </w:tcBorders>
-          </w:tcPr>
-          <w:p/>
-        </w:tc>
-        <w:tc>
-          <w:tcPr>
-            <w:tcW w:type="dxa" w:w="729"/>
-            <w:tcBorders>
-              <w:top w:val="single" w:sz="4" w:color="B8CCE4" w:space="0"/>
-              <w:left w:val="single" w:sz="4" w:color="B8CCE4" w:space="0"/>
-              <w:bottom w:val="single" w:sz="4" w:color="B8CCE4" w:space="0"/>
-              <w:right w:val="single" w:sz="4" w:color="B8CCE4" w:space="0"/>
-            </w:tcBorders>
-          </w:tcPr>
-          <w:p/>
-        </w:tc>
-        <w:tc>
-          <w:tcPr>
-            <w:tcW w:type="dxa" w:w="729"/>
-            <w:tcBorders>
-              <w:top w:val="single" w:sz="4" w:color="B8CCE4" w:space="0"/>
-              <w:left w:val="single" w:sz="4" w:color="B8CCE4" w:space="0"/>
-              <w:bottom w:val="single" w:sz="4" w:color="B8CCE4" w:space="0"/>
-              <w:right w:val="single" w:sz="4" w:color="B8CCE4" w:space="0"/>
-            </w:tcBorders>
-          </w:tcPr>
-          <w:p/>
-        </w:tc>
-        <w:tc>
-          <w:tcPr>
-            <w:tcW w:type="dxa" w:w="729"/>
-            <w:tcBorders>
-              <w:top w:val="single" w:sz="4" w:color="B8CCE4" w:space="0"/>
-              <w:left w:val="single" w:sz="4" w:color="B8CCE4" w:space="0"/>
-              <w:bottom w:val="single" w:sz="4" w:color="B8CCE4" w:space="0"/>
-              <w:right w:val="single" w:sz="4" w:color="B8CCE4" w:space="0"/>
-            </w:tcBorders>
-          </w:tcPr>
-          <w:p/>
-        </w:tc>
-        <w:tc>
-          <w:tcPr>
-            <w:tcW w:type="dxa" w:w="729"/>
-            <w:tcBorders>
-              <w:top w:val="single" w:sz="4" w:color="B8CCE4" w:space="0"/>
-              <w:left w:val="single" w:sz="4" w:color="B8CCE4" w:space="0"/>
-              <w:bottom w:val="single" w:sz="4" w:color="B8CCE4" w:space="0"/>
-              <w:right w:val="single" w:sz="4" w:color="B8CCE4" w:space="0"/>
-            </w:tcBorders>
-          </w:tcPr>
-          <w:p/>
-        </w:tc>
-      </w:tr>
-      <w:tr>
-        <w:trPr>
-          <w:trHeight w:val="560" w:hRule="atLeast"/>
-        </w:trPr>
-        <w:tc>
-          <w:tcPr>
-            <w:tcW w:type="dxa" w:w="729"/>
-            <w:tcBorders>
-              <w:top w:val="single" w:sz="4" w:color="B8CCE4" w:space="0"/>
-              <w:left w:val="single" w:sz="4" w:color="B8CCE4" w:space="0"/>
-              <w:bottom w:val="single" w:sz="4" w:color="B8CCE4" w:space="0"/>
-              <w:right w:val="single" w:sz="4" w:color="B8CCE4" w:space="0"/>
-            </w:tcBorders>
-          </w:tcPr>
-          <w:p/>
-        </w:tc>
-        <w:tc>
-          <w:tcPr>
-            <w:tcW w:type="dxa" w:w="1458"/>
-            <w:gridSpan w:val="2"/>
-            <w:tcBorders>
-              <w:top w:val="none" w:sz="0" w:color="FFFFFF" w:space="0"/>
-              <w:left w:val="none" w:sz="0" w:color="FFFFFF" w:space="0"/>
-              <w:bottom w:val="none" w:sz="0" w:color="FFFFFF" w:space="0"/>
-              <w:right w:val="none" w:sz="0" w:color="FFFFFF" w:space="0"/>
-            </w:tcBorders>
-          </w:tcPr>
-          <w:p/>
-          <w:p>
-            <w:pPr>
-              <w:spacing w:before="160" w:after="40"/>
-              <w:jc w:val="center"/>
-            </w:pPr>
-            <w:r>
-              <w:rPr>
-                <w:b w:val="0"/>
-                <w:sz w:val="22"/>
-                <w:u w:val="none"/>
-              </w:rPr>
-              <w:t>{{ firm_name }}</w:t>
-            </w:r>
-          </w:p>
-          <w:p>
-            <w:pPr>
-              <w:spacing w:before="0" w:after="40"/>
-              <w:jc w:val="center"/>
-            </w:pPr>
-            <w:r>
-              <w:rPr>
-                <w:b w:val="0"/>
-                <w:sz w:val="22"/>
-                <w:u w:val="none"/>
-              </w:rPr>
-              <w:t>{{ firm_street }}</w:t>
-            </w:r>
-          </w:p>
-          <w:p>
-            <w:pPr>
-              <w:spacing w:before="0" w:after="40"/>
-              <w:jc w:val="center"/>
-            </w:pPr>
-            <w:r>
-              <w:rPr>
-                <w:b w:val="0"/>
-                <w:sz w:val="22"/>
-                <w:u w:val="none"/>
-              </w:rPr>
-              <w:t>{{ firm_city_country }}</w:t>
-            </w:r>
-          </w:p>
-          <w:p>
-            <w:pPr>
-              <w:spacing w:before="0" w:after="40"/>
-              <w:jc w:val="center"/>
-            </w:pPr>
-            <w:r>
-              <w:rPr>
-                <w:b w:val="0"/>
-                <w:sz w:val="22"/>
-                <w:u w:val="none"/>
-              </w:rPr>
-              <w:t>Tel: {{ firm_phone }}</w:t>
-            </w:r>
-          </w:p>
-          <w:p>
-            <w:pPr>
-              <w:spacing w:before="0" w:after="160"/>
-              <w:jc w:val="center"/>
-            </w:pPr>
-            <w:r>
-              <w:rPr>
-                <w:b w:val="0"/>
-                <w:sz w:val="22"/>
-                <w:u w:val="none"/>
-              </w:rPr>
-              <w:t>Email: {{ firm_email }}</w:t>
-            </w:r>
-          </w:p>
-        </w:tc>
-        <w:tc>
-          <w:tcPr>
-            <w:tcW w:type="dxa" w:w="729"/>
-          </w:tcPr>
-          <w:p/>
-        </w:tc>
-        <w:tc>
-          <w:tcPr>
-            <w:tcW w:type="dxa" w:w="729"/>
-          </w:tcPr>
-          <w:p/>
-        </w:tc>
-        <w:tc>
-          <w:tcPr>
-            <w:tcW w:type="dxa" w:w="729"/>
-          </w:tcPr>
-          <w:p/>
-        </w:tc>
-        <w:tc>
-          <w:tcPr>
-            <w:tcW w:type="dxa" w:w="729"/>
-          </w:tcPr>
-          <w:p/>
-        </w:tc>
-        <w:tc>
-          <w:tcPr>
-            <w:tcW w:type="dxa" w:w="729"/>
-          </w:tcPr>
-          <w:p/>
-        </w:tc>
-        <w:tc>
-          <w:tcPr>
-            <w:tcW w:type="dxa" w:w="729"/>
-          </w:tcPr>
-          <w:p/>
-        </w:tc>
-        <w:tc>
-          <w:tcPr>
-            <w:tcW w:type="dxa" w:w="729"/>
-          </w:tcPr>
-          <w:p/>
-        </w:tc>
-        <w:tc>
-          <w:tcPr>
-            <w:tcW w:type="dxa" w:w="729"/>
-          </w:tcPr>
-          <w:p/>
-        </w:tc>
-        <w:tc>
-          <w:tcPr>
-            <w:tcW w:type="dxa" w:w="729"/>
-          </w:tcPr>
-          <w:p/>
-        </w:tc>
-        <w:tc>
-          <w:tcPr>
-            <w:tcW w:type="dxa" w:w="729"/>
-          </w:tcPr>
-          <w:p/>
-        </w:tc>
-        <w:tc>
-          <w:tcPr>
-            <w:tcW w:type="dxa" w:w="729"/>
-            <w:tcBorders>
-              <w:top w:val="single" w:sz="4" w:color="B8CCE4" w:space="0"/>
-              <w:left w:val="single" w:sz="4" w:color="B8CCE4" w:space="0"/>
-              <w:bottom w:val="single" w:sz="4" w:color="B8CCE4" w:space="0"/>
-              <w:right w:val="single" w:sz="4" w:color="B8CCE4" w:space="0"/>
-            </w:tcBorders>
-          </w:tcPr>
-          <w:p/>
-        </w:tc>
-      </w:tr>
-      <w:tr>
-        <w:trPr>
-          <w:trHeight w:val="95" w:hRule="exact"/>
-        </w:trPr>
-        <w:tc>
-          <w:tcPr>
-            <w:tcW w:type="dxa" w:w="729"/>
-            <w:tcBorders>
-              <w:top w:val="single" w:sz="4" w:color="B8CCE4" w:space="0"/>
-              <w:left w:val="single" w:sz="4" w:color="B8CCE4" w:space="0"/>
-              <w:bottom w:val="single" w:sz="4" w:color="B8CCE4" w:space="0"/>
-              <w:right w:val="single" w:sz="4" w:color="B8CCE4" w:space="0"/>
-            </w:tcBorders>
-          </w:tcPr>
-          <w:p/>
-        </w:tc>
-        <w:tc>
-          <w:tcPr>
-            <w:tcW w:type="dxa" w:w="729"/>
-            <w:tcBorders>
-              <w:top w:val="single" w:sz="4" w:color="B8CCE4" w:space="0"/>
-              <w:left w:val="single" w:sz="4" w:color="B8CCE4" w:space="0"/>
-              <w:bottom w:val="single" w:sz="4" w:color="B8CCE4" w:space="0"/>
-              <w:right w:val="single" w:sz="4" w:color="B8CCE4" w:space="0"/>
-            </w:tcBorders>
-          </w:tcPr>
-          <w:p/>
-        </w:tc>
-        <w:tc>
-          <w:tcPr>
-            <w:tcW w:type="dxa" w:w="729"/>
-            <w:tcBorders>
-              <w:top w:val="single" w:sz="4" w:color="B8CCE4" w:space="0"/>
-              <w:left w:val="single" w:sz="4" w:color="B8CCE4" w:space="0"/>
-              <w:bottom w:val="single" w:sz="4" w:color="B8CCE4" w:space="0"/>
-              <w:right w:val="single" w:sz="4" w:color="B8CCE4" w:space="0"/>
-            </w:tcBorders>
-          </w:tcPr>
-          <w:p/>
-        </w:tc>
-        <w:tc>
-          <w:tcPr>
-            <w:tcW w:type="dxa" w:w="729"/>
-            <w:tcBorders>
-              <w:top w:val="single" w:sz="4" w:color="B8CCE4" w:space="0"/>
-              <w:left w:val="single" w:sz="4" w:color="B8CCE4" w:space="0"/>
-              <w:bottom w:val="single" w:sz="4" w:color="B8CCE4" w:space="0"/>
-              <w:right w:val="single" w:sz="4" w:color="B8CCE4" w:space="0"/>
-            </w:tcBorders>
-          </w:tcPr>
-          <w:p/>
-        </w:tc>
-        <w:tc>
-          <w:tcPr>
-            <w:tcW w:type="dxa" w:w="729"/>
-            <w:tcBorders>
-              <w:top w:val="single" w:sz="4" w:color="B8CCE4" w:space="0"/>
-              <w:left w:val="single" w:sz="4" w:color="B8CCE4" w:space="0"/>
-              <w:bottom w:val="single" w:sz="4" w:color="B8CCE4" w:space="0"/>
-              <w:right w:val="single" w:sz="4" w:color="B8CCE4" w:space="0"/>
-            </w:tcBorders>
-          </w:tcPr>
-          <w:p/>
-        </w:tc>
-        <w:tc>
-          <w:tcPr>
-            <w:tcW w:type="dxa" w:w="729"/>
-            <w:tcBorders>
-              <w:top w:val="single" w:sz="4" w:color="B8CCE4" w:space="0"/>
-              <w:left w:val="single" w:sz="4" w:color="B8CCE4" w:space="0"/>
-              <w:bottom w:val="single" w:sz="4" w:color="B8CCE4" w:space="0"/>
-              <w:right w:val="single" w:sz="4" w:color="B8CCE4" w:space="0"/>
-            </w:tcBorders>
-          </w:tcPr>
-          <w:p/>
-        </w:tc>
-        <w:tc>
-          <w:tcPr>
-            <w:tcW w:type="dxa" w:w="729"/>
-            <w:tcBorders>
-              <w:top w:val="single" w:sz="4" w:color="B8CCE4" w:space="0"/>
-              <w:left w:val="single" w:sz="4" w:color="B8CCE4" w:space="0"/>
-              <w:bottom w:val="single" w:sz="4" w:color="B8CCE4" w:space="0"/>
-              <w:right w:val="single" w:sz="4" w:color="B8CCE4" w:space="0"/>
-            </w:tcBorders>
-          </w:tcPr>
-          <w:p/>
-        </w:tc>
-        <w:tc>
-          <w:tcPr>
-            <w:tcW w:type="dxa" w:w="729"/>
-            <w:tcBorders>
-              <w:top w:val="single" w:sz="4" w:color="B8CCE4" w:space="0"/>
-              <w:left w:val="single" w:sz="4" w:color="B8CCE4" w:space="0"/>
-              <w:bottom w:val="single" w:sz="4" w:color="B8CCE4" w:space="0"/>
-              <w:right w:val="single" w:sz="4" w:color="B8CCE4" w:space="0"/>
-            </w:tcBorders>
-          </w:tcPr>
-          <w:p/>
-        </w:tc>
-        <w:tc>
-          <w:tcPr>
-            <w:tcW w:type="dxa" w:w="729"/>
-            <w:tcBorders>
-              <w:top w:val="single" w:sz="4" w:color="B8CCE4" w:space="0"/>
-              <w:left w:val="single" w:sz="4" w:color="B8CCE4" w:space="0"/>
-              <w:bottom w:val="single" w:sz="4" w:color="B8CCE4" w:space="0"/>
-              <w:right w:val="single" w:sz="4" w:color="B8CCE4" w:space="0"/>
-            </w:tcBorders>
-          </w:tcPr>
-          <w:p/>
-        </w:tc>
-        <w:tc>
-          <w:tcPr>
-            <w:tcW w:type="dxa" w:w="729"/>
-            <w:tcBorders>
-              <w:top w:val="single" w:sz="4" w:color="B8CCE4" w:space="0"/>
-              <w:left w:val="single" w:sz="4" w:color="B8CCE4" w:space="0"/>
-              <w:bottom w:val="single" w:sz="4" w:color="B8CCE4" w:space="0"/>
-              <w:right w:val="single" w:sz="4" w:color="B8CCE4" w:space="0"/>
-            </w:tcBorders>
-          </w:tcPr>
-          <w:p/>
-        </w:tc>
-        <w:tc>
-          <w:tcPr>
-            <w:tcW w:type="dxa" w:w="729"/>
-            <w:tcBorders>
-              <w:top w:val="single" w:sz="4" w:color="B8CCE4" w:space="0"/>
-              <w:left w:val="single" w:sz="4" w:color="B8CCE4" w:space="0"/>
-              <w:bottom w:val="single" w:sz="4" w:color="B8CCE4" w:space="0"/>
-              <w:right w:val="single" w:sz="4" w:color="B8CCE4" w:space="0"/>
-            </w:tcBorders>
-          </w:tcPr>
-          <w:p/>
-        </w:tc>
-        <w:tc>
-          <w:tcPr>
-            <w:tcW w:type="dxa" w:w="729"/>
-            <w:tcBorders>
-              <w:top w:val="single" w:sz="4" w:color="B8CCE4" w:space="0"/>
-              <w:left w:val="single" w:sz="4" w:color="B8CCE4" w:space="0"/>
-              <w:bottom w:val="single" w:sz="4" w:color="B8CCE4" w:space="0"/>
-              <w:right w:val="single" w:sz="4" w:color="B8CCE4" w:space="0"/>
-            </w:tcBorders>
-          </w:tcPr>
-          <w:p/>
-        </w:tc>
-        <w:tc>
-          <w:tcPr>
-            <w:tcW w:type="dxa" w:w="729"/>
-            <w:tcBorders>
-              <w:top w:val="single" w:sz="4" w:color="B8CCE4" w:space="0"/>
-              <w:left w:val="single" w:sz="4" w:color="B8CCE4" w:space="0"/>
-              <w:bottom w:val="single" w:sz="4" w:color="B8CCE4" w:space="0"/>
-              <w:right w:val="single" w:sz="4" w:color="B8CCE4" w:space="0"/>
-            </w:tcBorders>
-          </w:tcPr>
-          <w:p/>
-        </w:tc>
-        <w:tc>
-          <w:tcPr>
-            <w:tcW w:type="dxa" w:w="729"/>
-            <w:tcBorders>
-              <w:top w:val="single" w:sz="4" w:color="B8CCE4" w:space="0"/>
-              <w:left w:val="single" w:sz="4" w:color="B8CCE4" w:space="0"/>
-              <w:bottom w:val="single" w:sz="4" w:color="B8CCE4" w:space="0"/>
-              <w:right w:val="single" w:sz="4" w:color="B8CCE4" w:space="0"/>
-            </w:tcBorders>
-          </w:tcPr>
-          <w:p/>
-        </w:tc>
-      </w:tr>
-      <w:tr>
-        <w:trPr>
-          <w:trHeight w:val="95" w:hRule="exact"/>
-        </w:trPr>
-        <w:tc>
-          <w:tcPr>
-            <w:tcW w:type="dxa" w:w="729"/>
-            <w:tcBorders>
-              <w:top w:val="single" w:sz="4" w:color="B8CCE4" w:space="0"/>
-              <w:left w:val="single" w:sz="4" w:color="B8CCE4" w:space="0"/>
-              <w:bottom w:val="single" w:sz="4" w:color="B8CCE4" w:space="0"/>
-              <w:right w:val="single" w:sz="4" w:color="B8CCE4" w:space="0"/>
-            </w:tcBorders>
-          </w:tcPr>
-          <w:p/>
-        </w:tc>
-        <w:tc>
-          <w:tcPr>
-            <w:tcW w:type="dxa" w:w="729"/>
-            <w:tcBorders>
-              <w:top w:val="single" w:sz="4" w:color="B8CCE4" w:space="0"/>
-              <w:left w:val="single" w:sz="4" w:color="B8CCE4" w:space="0"/>
-              <w:bottom w:val="single" w:sz="4" w:color="B8CCE4" w:space="0"/>
-              <w:right w:val="single" w:sz="4" w:color="B8CCE4" w:space="0"/>
-            </w:tcBorders>
-          </w:tcPr>
-          <w:p/>
-        </w:tc>
-        <w:tc>
-          <w:tcPr>
-            <w:tcW w:type="dxa" w:w="729"/>
-            <w:tcBorders>
-              <w:top w:val="single" w:sz="4" w:color="B8CCE4" w:space="0"/>
-              <w:left w:val="single" w:sz="4" w:color="B8CCE4" w:space="0"/>
-              <w:bottom w:val="single" w:sz="4" w:color="B8CCE4" w:space="0"/>
-              <w:right w:val="single" w:sz="4" w:color="B8CCE4" w:space="0"/>
-            </w:tcBorders>
-          </w:tcPr>
-          <w:p/>
-        </w:tc>
-        <w:tc>
-          <w:tcPr>
-            <w:tcW w:type="dxa" w:w="729"/>
-            <w:tcBorders>
-              <w:top w:val="single" w:sz="4" w:color="B8CCE4" w:space="0"/>
-              <w:left w:val="single" w:sz="4" w:color="B8CCE4" w:space="0"/>
-              <w:bottom w:val="single" w:sz="4" w:color="B8CCE4" w:space="0"/>
-              <w:right w:val="single" w:sz="4" w:color="B8CCE4" w:space="0"/>
-            </w:tcBorders>
-          </w:tcPr>
-          <w:p/>
-        </w:tc>
-        <w:tc>
-          <w:tcPr>
-            <w:tcW w:type="dxa" w:w="729"/>
-            <w:tcBorders>
-              <w:top w:val="single" w:sz="4" w:color="B8CCE4" w:space="0"/>
-              <w:left w:val="single" w:sz="4" w:color="B8CCE4" w:space="0"/>
-              <w:bottom w:val="single" w:sz="4" w:color="B8CCE4" w:space="0"/>
-              <w:right w:val="single" w:sz="4" w:color="B8CCE4" w:space="0"/>
-            </w:tcBorders>
-          </w:tcPr>
-          <w:p/>
-        </w:tc>
-        <w:tc>
-          <w:tcPr>
-            <w:tcW w:type="dxa" w:w="729"/>
-            <w:tcBorders>
-              <w:top w:val="single" w:sz="4" w:color="B8CCE4" w:space="0"/>
-              <w:left w:val="single" w:sz="4" w:color="B8CCE4" w:space="0"/>
-              <w:bottom w:val="single" w:sz="4" w:color="B8CCE4" w:space="0"/>
-              <w:right w:val="single" w:sz="4" w:color="B8CCE4" w:space="0"/>
-            </w:tcBorders>
-          </w:tcPr>
-          <w:p/>
-        </w:tc>
-        <w:tc>
-          <w:tcPr>
-            <w:tcW w:type="dxa" w:w="729"/>
-            <w:tcBorders>
-              <w:top w:val="single" w:sz="4" w:color="B8CCE4" w:space="0"/>
-              <w:left w:val="single" w:sz="4" w:color="B8CCE4" w:space="0"/>
-              <w:bottom w:val="single" w:sz="4" w:color="B8CCE4" w:space="0"/>
-              <w:right w:val="single" w:sz="4" w:color="B8CCE4" w:space="0"/>
-            </w:tcBorders>
-          </w:tcPr>
-          <w:p/>
-        </w:tc>
-        <w:tc>
-          <w:tcPr>
-            <w:tcW w:type="dxa" w:w="729"/>
-            <w:tcBorders>
-              <w:top w:val="single" w:sz="4" w:color="B8CCE4" w:space="0"/>
-              <w:left w:val="single" w:sz="4" w:color="B8CCE4" w:space="0"/>
-              <w:bottom w:val="single" w:sz="4" w:color="B8CCE4" w:space="0"/>
-              <w:right w:val="single" w:sz="4" w:color="B8CCE4" w:space="0"/>
-            </w:tcBorders>
-          </w:tcPr>
-          <w:p/>
-        </w:tc>
-        <w:tc>
-          <w:tcPr>
-            <w:tcW w:type="dxa" w:w="729"/>
-            <w:tcBorders>
-              <w:top w:val="single" w:sz="4" w:color="B8CCE4" w:space="0"/>
-              <w:left w:val="single" w:sz="4" w:color="B8CCE4" w:space="0"/>
-              <w:bottom w:val="single" w:sz="4" w:color="B8CCE4" w:space="0"/>
-              <w:right w:val="single" w:sz="4" w:color="B8CCE4" w:space="0"/>
-            </w:tcBorders>
-          </w:tcPr>
-          <w:p/>
-        </w:tc>
-        <w:tc>
-          <w:tcPr>
-            <w:tcW w:type="dxa" w:w="729"/>
-            <w:tcBorders>
-              <w:top w:val="single" w:sz="4" w:color="B8CCE4" w:space="0"/>
-              <w:left w:val="single" w:sz="4" w:color="B8CCE4" w:space="0"/>
-              <w:bottom w:val="single" w:sz="4" w:color="B8CCE4" w:space="0"/>
-              <w:right w:val="single" w:sz="4" w:color="B8CCE4" w:space="0"/>
-            </w:tcBorders>
-          </w:tcPr>
-          <w:p/>
-        </w:tc>
-        <w:tc>
-          <w:tcPr>
-            <w:tcW w:type="dxa" w:w="729"/>
-            <w:tcBorders>
-              <w:top w:val="single" w:sz="4" w:color="B8CCE4" w:space="0"/>
-              <w:left w:val="single" w:sz="4" w:color="B8CCE4" w:space="0"/>
-              <w:bottom w:val="single" w:sz="4" w:color="B8CCE4" w:space="0"/>
-              <w:right w:val="single" w:sz="4" w:color="B8CCE4" w:space="0"/>
-            </w:tcBorders>
-          </w:tcPr>
-          <w:p/>
-        </w:tc>
-        <w:tc>
-          <w:tcPr>
-            <w:tcW w:type="dxa" w:w="729"/>
-            <w:tcBorders>
-              <w:top w:val="single" w:sz="4" w:color="B8CCE4" w:space="0"/>
-              <w:left w:val="single" w:sz="4" w:color="B8CCE4" w:space="0"/>
-              <w:bottom w:val="single" w:sz="4" w:color="B8CCE4" w:space="0"/>
-              <w:right w:val="single" w:sz="4" w:color="B8CCE4" w:space="0"/>
-            </w:tcBorders>
-          </w:tcPr>
-          <w:p/>
-        </w:tc>
-        <w:tc>
-          <w:tcPr>
-            <w:tcW w:type="dxa" w:w="729"/>
-            <w:tcBorders>
-              <w:top w:val="single" w:sz="4" w:color="B8CCE4" w:space="0"/>
-              <w:left w:val="single" w:sz="4" w:color="B8CCE4" w:space="0"/>
-              <w:bottom w:val="single" w:sz="4" w:color="B8CCE4" w:space="0"/>
-              <w:right w:val="single" w:sz="4" w:color="B8CCE4" w:space="0"/>
-            </w:tcBorders>
-          </w:tcPr>
-          <w:p/>
-        </w:tc>
-        <w:tc>
-          <w:tcPr>
-            <w:tcW w:type="dxa" w:w="729"/>
-            <w:tcBorders>
-              <w:top w:val="single" w:sz="4" w:color="B8CCE4" w:space="0"/>
-              <w:left w:val="single" w:sz="4" w:color="B8CCE4" w:space="0"/>
-              <w:bottom w:val="single" w:sz="4" w:color="B8CCE4" w:space="0"/>
-              <w:right w:val="single" w:sz="4" w:color="B8CCE4" w:space="0"/>
-            </w:tcBorders>
-          </w:tcPr>
-          <w:p/>
-        </w:tc>
-      </w:tr>
-    </w:tbl>
+    <w:p>
+      <w:pPr>
+        <w:jc w:val="center"/>
+      </w:pPr>
+      <w:r>
+        <w:rPr>
+          <w:b/>
+          <w:sz w:val="28"/>
+        </w:rPr>
+        <w:t>{{ firm_name }}</w:t>
+      </w:r>
+    </w:p>
+    <w:p>
+      <w:pPr>
+        <w:jc w:val="center"/>
+      </w:pPr>
+      <w:r>
+        <w:rPr>
+          <w:color w:val="505050"/>
+          <w:sz w:val="18"/>
+        </w:rPr>
+        <w:t>{{ firm_address }}</w:t>
+      </w:r>
+    </w:p>
+    <w:p>
+      <w:pPr>
+        <w:jc w:val="center"/>
+      </w:pPr>
+      <w:r>
+        <w:rPr>
+          <w:color w:val="505050"/>
+          <w:sz w:val="18"/>
+        </w:rPr>
+        <w:t>Tel: {{ firm_phone }}   |   Email: {{ firm_email }}</w:t>
+      </w:r>
+    </w:p>
+    <w:p>
+      <w:pPr>
+        <w:pBdr>
+          <w:bottom w:val="single" w:sz="6" w:color="1F3A2E"/>
+        </w:pBdr>
+        <w:spacing w:after="80"/>
+      </w:pPr>
+    </w:p>
+    <w:p>
+      <w:pPr>
+        <w:spacing w:before="400" w:after="0"/>
+      </w:pPr>
+    </w:p>
+    <w:p>
+      <w:pPr>
+        <w:spacing w:before="200" w:after="0"/>
+        <w:jc w:val="center"/>
+      </w:pPr>
+      <w:r>
+        <w:rPr>
+          <w:b/>
+          <w:i w:val="0"/>
+          <w:sz w:val="36"/>
+        </w:rPr>
+        <w:t>Property Valuation Report</w:t>
+      </w:r>
+    </w:p>
+    <w:p>
+      <w:pPr>
+        <w:spacing w:before="0" w:after="280"/>
+        <w:jc w:val="center"/>
+      </w:pPr>
+      <w:r>
+        <w:rPr>
+          <w:b w:val="0"/>
+          <w:i w:val="0"/>
+          <w:sz w:val="24"/>
+        </w:rPr>
+        <w:t>({{ property_mortgaged }})</w:t>
+      </w:r>
+    </w:p>
+    <w:p>
+      <w:pPr>
+        <w:pBdr>
+          <w:bottom w:val="single" w:sz="6" w:color="1F3A2E"/>
+        </w:pBdr>
+        <w:spacing w:after="80"/>
+      </w:pPr>
+    </w:p>
+    <w:p>
+      <w:pPr>
+        <w:spacing w:before="160" w:after="0"/>
+      </w:pPr>
+      <w:r>
+        <w:rPr>
+          <w:b/>
+          <w:i w:val="0"/>
+          <w:sz w:val="22"/>
+        </w:rPr>
+        <w:t>Client</w:t>
+      </w:r>
+    </w:p>
+    <w:p>
+      <w:pPr>
+        <w:spacing w:before="0" w:after="20"/>
+      </w:pPr>
+      <w:r>
+        <w:rPr>
+          <w:b w:val="0"/>
+          <w:i w:val="0"/>
+          <w:sz w:val="20"/>
+        </w:rPr>
+        <w:t>{{ client_full_name }}</w:t>
+      </w:r>
+    </w:p>
+    <w:p>
+      <w:pPr>
+        <w:spacing w:before="0" w:after="20"/>
+      </w:pPr>
+      <w:r>
+        <w:rPr>
+          <w:b w:val="0"/>
+          <w:i w:val="0"/>
+          <w:sz w:val="20"/>
+        </w:rPr>
+        <w:t>{{ client_address_line }}</w:t>
+      </w:r>
+    </w:p>
+    <w:p>
+      <w:pPr>
+        <w:spacing w:before="0" w:after="20"/>
+      </w:pPr>
+      <w:r>
+        <w:rPr>
+          <w:b w:val="0"/>
+          <w:i w:val="0"/>
+          <w:sz w:val="20"/>
+        </w:rPr>
+        <w:t>{{ client_district_country }}</w:t>
+      </w:r>
+    </w:p>
+    <w:p>
+      <w:pPr>
+        <w:spacing w:before="0" w:after="20"/>
+      </w:pPr>
+      <w:r>
+        <w:rPr>
+          <w:b w:val="0"/>
+          <w:i w:val="0"/>
+          <w:sz w:val="20"/>
+        </w:rPr>
+        <w:t>Contact No: {{ client_phone }}</w:t>
+      </w:r>
+    </w:p>
+    <w:p>
+      <w:pPr>
+        <w:spacing w:before="200" w:after="0"/>
+      </w:pPr>
+    </w:p>
+    <w:p>
+      <w:pPr>
+        <w:spacing w:before="0" w:after="0"/>
+      </w:pPr>
+      <w:r>
+        <w:rPr>
+          <w:b/>
+          <w:i w:val="0"/>
+          <w:sz w:val="22"/>
+        </w:rPr>
+        <w:t>Properties to be Valued</w:t>
+      </w:r>
+    </w:p>
+    <w:p>
+      <w:pPr>
+        <w:spacing w:before="0" w:after="40"/>
+      </w:pPr>
+      <w:r>
+        <w:rPr>
+          <w:b/>
+          <w:i w:val="0"/>
+          <w:sz w:val="20"/>
+        </w:rPr>
+        <w:t xml:space="preserve">Plot No.: </w:t>
+      </w:r>
+      <w:r>
+        <w:rPr>
+          <w:b w:val="0"/>
+          <w:i w:val="0"/>
+          <w:sz w:val="20"/>
+        </w:rPr>
+        <w:t>{{ plot_no }}</w:t>
+      </w:r>
+    </w:p>
+    <w:p>
+      <w:pPr>
+        <w:spacing w:before="0" w:after="20"/>
+      </w:pPr>
+      <w:r>
+        <w:rPr>
+          <w:b w:val="0"/>
+          <w:i w:val="0"/>
+          <w:sz w:val="20"/>
+        </w:rPr>
+        <w:t>{{ property_location_full }}</w:t>
+      </w:r>
+    </w:p>
+    <w:p>
+      <w:pPr>
+        <w:spacing w:before="0" w:after="0"/>
+      </w:pPr>
+      <w:r>
+        <w:rPr>
+          <w:b w:val="0"/>
+          <w:i/>
+          <w:sz w:val="20"/>
+        </w:rPr>
+        <w:t>{{ sabik }}</w:t>
+      </w:r>
+    </w:p>
+    <w:p>
+      <w:pPr>
+        <w:spacing w:before="160" w:after="0"/>
+      </w:pPr>
+    </w:p>
+    <w:p>
+      <w:pPr>
+        <w:spacing w:before="0" w:after="0"/>
+      </w:pPr>
+      <w:r>
+        <w:rPr>
+          <w:b w:val="0"/>
+          <w:i w:val="0"/>
+          <w:sz w:val="20"/>
+        </w:rPr>
+        <w:t>{{ owners_block }}</w:t>
+      </w:r>
+    </w:p>
+    <w:p>
+      <w:pPr>
+        <w:spacing w:before="200" w:after="0"/>
+      </w:pPr>
+    </w:p>
+    <w:p>
+      <w:pPr>
+        <w:pBdr>
+          <w:bottom w:val="single" w:sz="6" w:color="1F3A2E"/>
+        </w:pBdr>
+        <w:spacing w:after="80"/>
+      </w:pPr>
+    </w:p>
+    <w:p>
+      <w:pPr>
+        <w:spacing w:before="160" w:after="0"/>
+      </w:pPr>
+      <w:r>
+        <w:rPr>
+          <w:b/>
+          <w:i w:val="0"/>
+          <w:sz w:val="22"/>
+        </w:rPr>
+        <w:t>Submitted to</w:t>
+      </w:r>
+    </w:p>
+    <w:p>
+      <w:pPr>
+        <w:spacing w:before="0" w:after="20"/>
+      </w:pPr>
+      <w:r>
+        <w:rPr>
+          <w:b/>
+          <w:i w:val="0"/>
+          <w:sz w:val="20"/>
+        </w:rPr>
+        <w:t>{{ bank_name }}</w:t>
+      </w:r>
+    </w:p>
+    <w:p>
+      <w:pPr>
+        <w:spacing w:before="0" w:after="20"/>
+      </w:pPr>
+      <w:r>
+        <w:rPr>
+          <w:b w:val="0"/>
+          <w:i w:val="0"/>
+          <w:sz w:val="20"/>
+        </w:rPr>
+        <w:t>{{ bank_branch }}</w:t>
+      </w:r>
+    </w:p>
+    <w:p>
+      <w:pPr>
+        <w:spacing w:before="200" w:after="0"/>
+      </w:pPr>
+    </w:p>
+    <w:p>
+      <w:pPr>
+        <w:spacing w:before="0" w:after="40"/>
+      </w:pPr>
+      <w:r>
+        <w:rPr>
+          <w:b w:val="0"/>
+          <w:i w:val="0"/>
+          <w:sz w:val="22"/>
+        </w:rPr>
+        <w:t xml:space="preserve">Fair Market Value of the Land &amp; Building: NRs. </w:t>
+      </w:r>
+      <w:r>
+        <w:rPr>
+          <w:b/>
+          <w:i w:val="0"/>
+          <w:sz w:val="22"/>
+        </w:rPr>
+        <w:t>{{ fair_market_value }}</w:t>
+      </w:r>
+    </w:p>
+    <w:p>
+      <w:pPr>
+        <w:spacing w:before="280" w:after="0"/>
+      </w:pPr>
+    </w:p>
+    <w:p>
+      <w:pPr>
+        <w:pBdr>
+          <w:bottom w:val="single" w:sz="6" w:color="1F3A2E"/>
+        </w:pBdr>
+        <w:spacing w:after="80"/>
+      </w:pPr>
+    </w:p>
+    <w:p>
+      <w:pPr>
+        <w:spacing w:before="160" w:after="0"/>
+      </w:pPr>
+      <w:r>
+        <w:rPr>
+          <w:b/>
+          <w:i w:val="0"/>
+          <w:sz w:val="22"/>
+        </w:rPr>
+        <w:t>Prepared by</w:t>
+      </w:r>
+    </w:p>
+    <w:p>
+      <w:pPr>
+        <w:spacing w:before="0" w:after="20"/>
+      </w:pPr>
+      <w:r>
+        <w:rPr>
+          <w:b w:val="0"/>
+          <w:i w:val="0"/>
+          <w:sz w:val="20"/>
+        </w:rPr>
+        <w:t>{{ firm_name }}</w:t>
+      </w:r>
+    </w:p>
+    <w:p>
+      <w:pPr>
+        <w:spacing w:before="0" w:after="20"/>
+      </w:pPr>
+      <w:r>
+        <w:rPr>
+          <w:b w:val="0"/>
+          <w:i w:val="0"/>
+          <w:sz w:val="20"/>
+        </w:rPr>
+        <w:t>{{ firm_address }}</w:t>
+      </w:r>
+    </w:p>
+    <w:p>
+      <w:pPr>
+        <w:spacing w:before="0" w:after="20"/>
+      </w:pPr>
+      <w:r>
+        <w:rPr>
+          <w:b w:val="0"/>
+          <w:i w:val="0"/>
+          <w:sz w:val="20"/>
+        </w:rPr>
+        <w:t>Tel: {{ firm_phone }}</w:t>
+      </w:r>
+    </w:p>
+    <w:p>
+      <w:pPr>
+        <w:spacing w:before="0" w:after="20"/>
+      </w:pPr>
+      <w:r>
+        <w:rPr>
+          <w:b w:val="0"/>
+          <w:i w:val="0"/>
+          <w:sz w:val="20"/>
+        </w:rPr>
+        <w:t>Email: {{ firm_email }}</w:t>
+      </w:r>
+    </w:p>
+    <w:p>
+      <w:pPr>
+        <w:spacing w:before="280" w:after="0"/>
+      </w:pPr>
+    </w:p>
+    <w:p>
+      <w:pPr>
+        <w:spacing w:before="0" w:after="0"/>
+        <w:jc w:val="center"/>
+      </w:pPr>
+      <w:r>
+        <w:rPr>
+          <w:b w:val="0"/>
+          <w:i w:val="0"/>
+          <w:sz w:val="20"/>
+        </w:rPr>
+        <w:t>{{ cert_date }}</w:t>
+      </w:r>
+    </w:p>
     <w:sectPr>
-      <w:pgSz w:w="11906" w:h="16838"/>
-      <w:pgMar w:top="567" w:right="850" w:bottom="567" w:left="850" w:header="720" w:footer="720" w:gutter="0"/>
+      <w:pgSz w:w="12240" w:h="15840"/>
+      <w:pgMar w:top="1440" w:right="1728" w:bottom="1440" w:left="1728" w:header="720" w:footer="720" w:gutter="0"/>
       <w:cols w:space="720"/>
       <w:docGrid w:linePitch="360"/>
     </w:sectPr>

</xml_diff>